<commit_message>
Agrega Docs (arquitectura) y Algoritmos_pruebas en desarrollo
</commit_message>
<xml_diff>
--- a/EstructuraMicroservicios_EPS.docx
+++ b/EstructuraMicroservicios_EPS.docx
@@ -26,7 +26,17 @@
           <w:b/>
           <w:bCs/>
         </w:rPr>
-        <w:t>Arquitectura de Microservicios para una EPS</w:t>
+        <w:t>Estructura</w:t>
+      </w:r>
+      <w:bookmarkStart w:id="0" w:name="_GoBack"/>
+      <w:bookmarkEnd w:id="0"/>
+      <w:r>
+        <w:rPr>
+          <w:rFonts w:ascii="Times New Roman" w:eastAsia="Times New Roman" w:hAnsi="Times New Roman" w:cs="Times New Roman"/>
+          <w:b/>
+          <w:bCs/>
+        </w:rPr>
+        <w:t xml:space="preserve"> de Microservicios para una EPS</w:t>
       </w:r>
     </w:p>
     <w:p>
@@ -431,7 +441,7 @@
         <w:rPr>
           <w:rFonts w:ascii="Times New Roman" w:hAnsi="Times New Roman" w:cs="Times New Roman"/>
         </w:rPr>
-        <w:t xml:space="preserve">Las EPS gestionan grandes volúmenes de información (afiliados, cotizaciones, autorizaciones, facturación y pagos). Los sistemas monolíticos limitan la escalabilidad y el mantenimiento. La arquitectura de </w:t>
+        <w:t xml:space="preserve">El presente documento describe la estructura de carpetas del proyecto de </w:t>
       </w:r>
       <w:proofErr w:type="spellStart"/>
       <w:r>
@@ -445,7 +455,7 @@
         <w:rPr>
           <w:rFonts w:ascii="Times New Roman" w:hAnsi="Times New Roman" w:cs="Times New Roman"/>
         </w:rPr>
-        <w:t xml:space="preserve"> divide el sistema en servicios pequeños e independientes, cada uno responsable de un dominio funcional del negocio.</w:t>
+        <w:t xml:space="preserve"> para una EPS. Cada microservicio corresponde a un dominio funcional del negocio y se encuentra organizado dentro de la carpeta eps-microservicios/. En esta fase del proyecto solo se define el esqueleto (carpetas), sin implementación de código.</w:t>
       </w:r>
     </w:p>
     <w:p>
@@ -623,7 +633,7 @@
           <w:b/>
         </w:rPr>
         <w:lastRenderedPageBreak/>
-        <w:t>2. Objetivo</w:t>
+        <w:t>2. Estructura de Carpetas</w:t>
       </w:r>
     </w:p>
     <w:p>
@@ -637,7 +647,992 @@
         <w:rPr>
           <w:rFonts w:ascii="Times New Roman" w:hAnsi="Times New Roman" w:cs="Times New Roman"/>
         </w:rPr>
-        <w:t xml:space="preserve">Diseñar una arquitectura de </w:t>
+        <w:t>evaluacionGit/</w:t>
+      </w:r>
+    </w:p>
+    <w:p>
+      <w:pPr>
+        <w:ind w:firstLine="708"/>
+        <w:rPr>
+          <w:rFonts w:ascii="Times New Roman" w:hAnsi="Times New Roman" w:cs="Times New Roman"/>
+        </w:rPr>
+      </w:pPr>
+      <w:r>
+        <w:rPr>
+          <w:rFonts w:ascii="Times New Roman" w:hAnsi="Times New Roman" w:cs="Times New Roman"/>
+        </w:rPr>
+        <w:t>├── eps-microservicios/</w:t>
+      </w:r>
+    </w:p>
+    <w:p>
+      <w:pPr>
+        <w:ind w:firstLine="708"/>
+        <w:rPr>
+          <w:rFonts w:ascii="Times New Roman" w:hAnsi="Times New Roman" w:cs="Times New Roman"/>
+        </w:rPr>
+      </w:pPr>
+      <w:r>
+        <w:rPr>
+          <w:rFonts w:ascii="Times New Roman" w:hAnsi="Times New Roman" w:cs="Times New Roman"/>
+        </w:rPr>
+        <w:t>│   ├── ms-</w:t>
+      </w:r>
+      <w:proofErr w:type="spellStart"/>
+      <w:r>
+        <w:rPr>
+          <w:rFonts w:ascii="Times New Roman" w:hAnsi="Times New Roman" w:cs="Times New Roman"/>
+        </w:rPr>
+        <w:t>afiliacion</w:t>
+      </w:r>
+      <w:proofErr w:type="spellEnd"/>
+      <w:r>
+        <w:rPr>
+          <w:rFonts w:ascii="Times New Roman" w:hAnsi="Times New Roman" w:cs="Times New Roman"/>
+        </w:rPr>
+        <w:t>/</w:t>
+      </w:r>
+    </w:p>
+    <w:p>
+      <w:pPr>
+        <w:ind w:firstLine="708"/>
+        <w:rPr>
+          <w:rFonts w:ascii="Times New Roman" w:hAnsi="Times New Roman" w:cs="Times New Roman"/>
+        </w:rPr>
+      </w:pPr>
+      <w:r>
+        <w:rPr>
+          <w:rFonts w:ascii="Times New Roman" w:hAnsi="Times New Roman" w:cs="Times New Roman"/>
+        </w:rPr>
+        <w:t>│   ├── ms-autorizaciones/</w:t>
+      </w:r>
+    </w:p>
+    <w:p>
+      <w:pPr>
+        <w:ind w:firstLine="708"/>
+        <w:rPr>
+          <w:rFonts w:ascii="Times New Roman" w:hAnsi="Times New Roman" w:cs="Times New Roman"/>
+        </w:rPr>
+      </w:pPr>
+      <w:r>
+        <w:rPr>
+          <w:rFonts w:ascii="Times New Roman" w:hAnsi="Times New Roman" w:cs="Times New Roman"/>
+        </w:rPr>
+        <w:t>│   ├── ms-</w:t>
+      </w:r>
+      <w:proofErr w:type="spellStart"/>
+      <w:r>
+        <w:rPr>
+          <w:rFonts w:ascii="Times New Roman" w:hAnsi="Times New Roman" w:cs="Times New Roman"/>
+        </w:rPr>
+        <w:t>facturacion</w:t>
+      </w:r>
+      <w:proofErr w:type="spellEnd"/>
+      <w:r>
+        <w:rPr>
+          <w:rFonts w:ascii="Times New Roman" w:hAnsi="Times New Roman" w:cs="Times New Roman"/>
+        </w:rPr>
+        <w:t>/</w:t>
+      </w:r>
+    </w:p>
+    <w:p>
+      <w:pPr>
+        <w:ind w:firstLine="708"/>
+        <w:rPr>
+          <w:rFonts w:ascii="Times New Roman" w:hAnsi="Times New Roman" w:cs="Times New Roman"/>
+        </w:rPr>
+      </w:pPr>
+      <w:r>
+        <w:rPr>
+          <w:rFonts w:ascii="Times New Roman" w:hAnsi="Times New Roman" w:cs="Times New Roman"/>
+        </w:rPr>
+        <w:t>│   ├── ms-pagos/</w:t>
+      </w:r>
+    </w:p>
+    <w:p>
+      <w:pPr>
+        <w:ind w:firstLine="708"/>
+        <w:rPr>
+          <w:rFonts w:ascii="Times New Roman" w:hAnsi="Times New Roman" w:cs="Times New Roman"/>
+        </w:rPr>
+      </w:pPr>
+      <w:r>
+        <w:rPr>
+          <w:rFonts w:ascii="Times New Roman" w:hAnsi="Times New Roman" w:cs="Times New Roman"/>
+        </w:rPr>
+        <w:t>│   └── ms-</w:t>
+      </w:r>
+      <w:proofErr w:type="spellStart"/>
+      <w:r>
+        <w:rPr>
+          <w:rFonts w:ascii="Times New Roman" w:hAnsi="Times New Roman" w:cs="Times New Roman"/>
+        </w:rPr>
+        <w:t>pqrs</w:t>
+      </w:r>
+      <w:proofErr w:type="spellEnd"/>
+      <w:r>
+        <w:rPr>
+          <w:rFonts w:ascii="Times New Roman" w:hAnsi="Times New Roman" w:cs="Times New Roman"/>
+        </w:rPr>
+        <w:t>/</w:t>
+      </w:r>
+    </w:p>
+    <w:p>
+      <w:pPr>
+        <w:ind w:firstLine="708"/>
+        <w:rPr>
+          <w:rFonts w:ascii="Times New Roman" w:hAnsi="Times New Roman" w:cs="Times New Roman"/>
+        </w:rPr>
+      </w:pPr>
+      <w:r>
+        <w:rPr>
+          <w:rFonts w:ascii="Times New Roman" w:hAnsi="Times New Roman" w:cs="Times New Roman"/>
+        </w:rPr>
+        <w:t>├── EstructuraMicroservicios_EPS.docx</w:t>
+      </w:r>
+    </w:p>
+    <w:p>
+      <w:pPr>
+        <w:ind w:firstLine="708"/>
+        <w:rPr>
+          <w:rFonts w:ascii="Times New Roman" w:hAnsi="Times New Roman" w:cs="Times New Roman"/>
+        </w:rPr>
+      </w:pPr>
+      <w:r>
+        <w:rPr>
+          <w:rFonts w:ascii="Times New Roman" w:hAnsi="Times New Roman" w:cs="Times New Roman"/>
+        </w:rPr>
+        <w:t>└── README.md</w:t>
+      </w:r>
+    </w:p>
+    <w:p>
+      <w:pPr>
+        <w:ind w:firstLine="708"/>
+        <w:rPr>
+          <w:rFonts w:ascii="Times New Roman" w:hAnsi="Times New Roman" w:cs="Times New Roman"/>
+        </w:rPr>
+      </w:pPr>
+    </w:p>
+    <w:p>
+      <w:pPr>
+        <w:ind w:firstLine="708"/>
+        <w:rPr>
+          <w:rFonts w:ascii="Times New Roman" w:hAnsi="Times New Roman" w:cs="Times New Roman"/>
+        </w:rPr>
+      </w:pPr>
+    </w:p>
+    <w:p>
+      <w:pPr>
+        <w:ind w:firstLine="708"/>
+        <w:rPr>
+          <w:rFonts w:ascii="Times New Roman" w:hAnsi="Times New Roman" w:cs="Times New Roman"/>
+        </w:rPr>
+      </w:pPr>
+    </w:p>
+    <w:p>
+      <w:pPr>
+        <w:ind w:firstLine="708"/>
+        <w:rPr>
+          <w:rFonts w:ascii="Times New Roman" w:hAnsi="Times New Roman" w:cs="Times New Roman"/>
+        </w:rPr>
+      </w:pPr>
+    </w:p>
+    <w:p>
+      <w:pPr>
+        <w:ind w:firstLine="708"/>
+        <w:rPr>
+          <w:rFonts w:ascii="Times New Roman" w:hAnsi="Times New Roman" w:cs="Times New Roman"/>
+        </w:rPr>
+      </w:pPr>
+    </w:p>
+    <w:p>
+      <w:pPr>
+        <w:ind w:firstLine="708"/>
+        <w:rPr>
+          <w:rFonts w:ascii="Times New Roman" w:hAnsi="Times New Roman" w:cs="Times New Roman"/>
+        </w:rPr>
+      </w:pPr>
+    </w:p>
+    <w:p>
+      <w:pPr>
+        <w:ind w:firstLine="708"/>
+        <w:rPr>
+          <w:rFonts w:ascii="Times New Roman" w:hAnsi="Times New Roman" w:cs="Times New Roman"/>
+        </w:rPr>
+      </w:pPr>
+    </w:p>
+    <w:p>
+      <w:pPr>
+        <w:ind w:firstLine="708"/>
+        <w:rPr>
+          <w:rFonts w:ascii="Times New Roman" w:hAnsi="Times New Roman" w:cs="Times New Roman"/>
+        </w:rPr>
+      </w:pPr>
+    </w:p>
+    <w:p>
+      <w:pPr>
+        <w:ind w:firstLine="708"/>
+        <w:rPr>
+          <w:rFonts w:ascii="Times New Roman" w:hAnsi="Times New Roman" w:cs="Times New Roman"/>
+        </w:rPr>
+      </w:pPr>
+    </w:p>
+    <w:p>
+      <w:pPr>
+        <w:rPr>
+          <w:rFonts w:ascii="Times New Roman" w:hAnsi="Times New Roman" w:cs="Times New Roman"/>
+        </w:rPr>
+      </w:pPr>
+    </w:p>
+    <w:p>
+      <w:pPr>
+        <w:rPr>
+          <w:rFonts w:ascii="Times New Roman" w:hAnsi="Times New Roman" w:cs="Times New Roman"/>
+        </w:rPr>
+      </w:pPr>
+    </w:p>
+    <w:p>
+      <w:pPr>
+        <w:ind w:firstLine="708"/>
+        <w:rPr>
+          <w:rFonts w:ascii="Times New Roman" w:hAnsi="Times New Roman" w:cs="Times New Roman"/>
+        </w:rPr>
+      </w:pPr>
+    </w:p>
+    <w:p>
+      <w:pPr>
+        <w:ind w:firstLine="708"/>
+        <w:rPr>
+          <w:rFonts w:ascii="Times New Roman" w:hAnsi="Times New Roman" w:cs="Times New Roman"/>
+        </w:rPr>
+      </w:pPr>
+    </w:p>
+    <w:p>
+      <w:pPr>
+        <w:pStyle w:val="Prrafodelista"/>
+        <w:numPr>
+          <w:ilvl w:val="0"/>
+          <w:numId w:val="25"/>
+        </w:numPr>
+        <w:jc w:val="center"/>
+        <w:rPr>
+          <w:rFonts w:ascii="Times New Roman" w:hAnsi="Times New Roman" w:cs="Times New Roman"/>
+          <w:b/>
+        </w:rPr>
+      </w:pPr>
+      <w:r>
+        <w:rPr>
+          <w:rFonts w:ascii="Times New Roman" w:hAnsi="Times New Roman" w:cs="Times New Roman"/>
+          <w:b/>
+        </w:rPr>
+        <w:lastRenderedPageBreak/>
+        <w:t>Descripción de cada microservicio</w:t>
+      </w:r>
+    </w:p>
+    <w:p>
+      <w:pPr>
+        <w:rPr>
+          <w:rFonts w:ascii="Times New Roman" w:hAnsi="Times New Roman" w:cs="Times New Roman"/>
+          <w:b/>
+        </w:rPr>
+      </w:pPr>
+    </w:p>
+    <w:tbl>
+      <w:tblPr>
+        <w:tblW w:w="9060" w:type="dxa"/>
+        <w:tblCellMar>
+          <w:left w:w="70" w:type="dxa"/>
+          <w:right w:w="70" w:type="dxa"/>
+        </w:tblCellMar>
+        <w:tblLook w:val="04A0" w:firstRow="1" w:lastRow="0" w:firstColumn="1" w:lastColumn="0" w:noHBand="0" w:noVBand="1"/>
+      </w:tblPr>
+      <w:tblGrid>
+        <w:gridCol w:w="2540"/>
+        <w:gridCol w:w="6520"/>
+      </w:tblGrid>
+      <w:tr>
+        <w:trPr>
+          <w:trHeight w:val="330"/>
+        </w:trPr>
+        <w:tc>
+          <w:tcPr>
+            <w:tcW w:w="2540" w:type="dxa"/>
+            <w:tcBorders>
+              <w:top w:val="single" w:sz="4" w:space="0" w:color="auto"/>
+              <w:left w:val="single" w:sz="4" w:space="0" w:color="auto"/>
+              <w:bottom w:val="single" w:sz="4" w:space="0" w:color="auto"/>
+              <w:right w:val="single" w:sz="4" w:space="0" w:color="auto"/>
+            </w:tcBorders>
+            <w:shd w:val="clear" w:color="auto" w:fill="auto"/>
+            <w:vAlign w:val="center"/>
+            <w:hideMark/>
+          </w:tcPr>
+          <w:p>
+            <w:pPr>
+              <w:spacing w:before="0" w:after="0" w:line="240" w:lineRule="auto"/>
+              <w:jc w:val="center"/>
+              <w:rPr>
+                <w:rFonts w:ascii="Segoe UI" w:eastAsia="Times New Roman" w:hAnsi="Segoe UI" w:cs="Segoe UI"/>
+                <w:b/>
+                <w:bCs/>
+                <w:color w:val="000000"/>
+                <w:sz w:val="22"/>
+                <w:szCs w:val="22"/>
+                <w:lang w:eastAsia="es-CO"/>
+              </w:rPr>
+            </w:pPr>
+            <w:r>
+              <w:rPr>
+                <w:rFonts w:ascii="Segoe UI" w:eastAsia="Times New Roman" w:hAnsi="Segoe UI" w:cs="Segoe UI"/>
+                <w:b/>
+                <w:bCs/>
+                <w:color w:val="000000"/>
+                <w:sz w:val="22"/>
+                <w:szCs w:val="22"/>
+                <w:lang w:eastAsia="es-CO"/>
+              </w:rPr>
+              <w:t>Microservicio</w:t>
+            </w:r>
+          </w:p>
+        </w:tc>
+        <w:tc>
+          <w:tcPr>
+            <w:tcW w:w="6520" w:type="dxa"/>
+            <w:tcBorders>
+              <w:top w:val="single" w:sz="4" w:space="0" w:color="auto"/>
+              <w:left w:val="nil"/>
+              <w:bottom w:val="single" w:sz="4" w:space="0" w:color="auto"/>
+              <w:right w:val="single" w:sz="4" w:space="0" w:color="auto"/>
+            </w:tcBorders>
+            <w:shd w:val="clear" w:color="auto" w:fill="auto"/>
+            <w:vAlign w:val="center"/>
+            <w:hideMark/>
+          </w:tcPr>
+          <w:p>
+            <w:pPr>
+              <w:spacing w:before="0" w:after="0" w:line="240" w:lineRule="auto"/>
+              <w:jc w:val="center"/>
+              <w:rPr>
+                <w:rFonts w:ascii="Segoe UI" w:eastAsia="Times New Roman" w:hAnsi="Segoe UI" w:cs="Segoe UI"/>
+                <w:b/>
+                <w:bCs/>
+                <w:color w:val="000000"/>
+                <w:sz w:val="22"/>
+                <w:szCs w:val="22"/>
+                <w:lang w:eastAsia="es-CO"/>
+              </w:rPr>
+            </w:pPr>
+            <w:r>
+              <w:rPr>
+                <w:rFonts w:ascii="Segoe UI" w:eastAsia="Times New Roman" w:hAnsi="Segoe UI" w:cs="Segoe UI"/>
+                <w:b/>
+                <w:bCs/>
+                <w:color w:val="000000"/>
+                <w:sz w:val="22"/>
+                <w:szCs w:val="22"/>
+                <w:lang w:eastAsia="es-CO"/>
+              </w:rPr>
+              <w:t>Descripción</w:t>
+            </w:r>
+          </w:p>
+        </w:tc>
+      </w:tr>
+      <w:tr>
+        <w:trPr>
+          <w:trHeight w:val="990"/>
+        </w:trPr>
+        <w:tc>
+          <w:tcPr>
+            <w:tcW w:w="2540" w:type="dxa"/>
+            <w:tcBorders>
+              <w:top w:val="nil"/>
+              <w:left w:val="single" w:sz="4" w:space="0" w:color="auto"/>
+              <w:bottom w:val="single" w:sz="4" w:space="0" w:color="auto"/>
+              <w:right w:val="single" w:sz="4" w:space="0" w:color="auto"/>
+            </w:tcBorders>
+            <w:shd w:val="clear" w:color="auto" w:fill="auto"/>
+            <w:vAlign w:val="center"/>
+            <w:hideMark/>
+          </w:tcPr>
+          <w:p>
+            <w:pPr>
+              <w:spacing w:before="0" w:after="0" w:line="240" w:lineRule="auto"/>
+              <w:jc w:val="left"/>
+              <w:rPr>
+                <w:rFonts w:ascii="Segoe UI" w:eastAsia="Times New Roman" w:hAnsi="Segoe UI" w:cs="Segoe UI"/>
+                <w:b/>
+                <w:bCs/>
+                <w:color w:val="000000"/>
+                <w:sz w:val="22"/>
+                <w:szCs w:val="22"/>
+                <w:lang w:eastAsia="es-CO"/>
+              </w:rPr>
+            </w:pPr>
+            <w:r>
+              <w:rPr>
+                <w:rFonts w:ascii="Segoe UI" w:eastAsia="Times New Roman" w:hAnsi="Segoe UI" w:cs="Segoe UI"/>
+                <w:b/>
+                <w:bCs/>
+                <w:color w:val="000000"/>
+                <w:sz w:val="22"/>
+                <w:szCs w:val="22"/>
+                <w:lang w:eastAsia="es-CO"/>
+              </w:rPr>
+              <w:t>ms-</w:t>
+            </w:r>
+            <w:proofErr w:type="spellStart"/>
+            <w:r>
+              <w:rPr>
+                <w:rFonts w:ascii="Segoe UI" w:eastAsia="Times New Roman" w:hAnsi="Segoe UI" w:cs="Segoe UI"/>
+                <w:b/>
+                <w:bCs/>
+                <w:color w:val="000000"/>
+                <w:sz w:val="22"/>
+                <w:szCs w:val="22"/>
+                <w:lang w:eastAsia="es-CO"/>
+              </w:rPr>
+              <w:t>afiliacion</w:t>
+            </w:r>
+            <w:proofErr w:type="spellEnd"/>
+          </w:p>
+        </w:tc>
+        <w:tc>
+          <w:tcPr>
+            <w:tcW w:w="6520" w:type="dxa"/>
+            <w:tcBorders>
+              <w:top w:val="nil"/>
+              <w:left w:val="nil"/>
+              <w:bottom w:val="single" w:sz="4" w:space="0" w:color="auto"/>
+              <w:right w:val="single" w:sz="4" w:space="0" w:color="auto"/>
+            </w:tcBorders>
+            <w:shd w:val="clear" w:color="auto" w:fill="auto"/>
+            <w:vAlign w:val="center"/>
+            <w:hideMark/>
+          </w:tcPr>
+          <w:p>
+            <w:pPr>
+              <w:spacing w:before="0" w:after="0" w:line="240" w:lineRule="auto"/>
+              <w:jc w:val="left"/>
+              <w:rPr>
+                <w:rFonts w:ascii="Segoe UI" w:eastAsia="Times New Roman" w:hAnsi="Segoe UI" w:cs="Segoe UI"/>
+                <w:color w:val="000000"/>
+                <w:sz w:val="22"/>
+                <w:szCs w:val="22"/>
+                <w:lang w:eastAsia="es-CO"/>
+              </w:rPr>
+            </w:pPr>
+            <w:r>
+              <w:rPr>
+                <w:rFonts w:ascii="Segoe UI" w:eastAsia="Times New Roman" w:hAnsi="Segoe UI" w:cs="Segoe UI"/>
+                <w:color w:val="000000"/>
+                <w:sz w:val="22"/>
+                <w:szCs w:val="22"/>
+                <w:lang w:eastAsia="es-CO"/>
+              </w:rPr>
+              <w:t>Gestiona el registro, novedades y datos personales de los afiliados a la EPS.</w:t>
+            </w:r>
+          </w:p>
+        </w:tc>
+      </w:tr>
+      <w:tr>
+        <w:trPr>
+          <w:trHeight w:val="990"/>
+        </w:trPr>
+        <w:tc>
+          <w:tcPr>
+            <w:tcW w:w="2540" w:type="dxa"/>
+            <w:tcBorders>
+              <w:top w:val="nil"/>
+              <w:left w:val="single" w:sz="4" w:space="0" w:color="auto"/>
+              <w:bottom w:val="single" w:sz="4" w:space="0" w:color="auto"/>
+              <w:right w:val="single" w:sz="4" w:space="0" w:color="auto"/>
+            </w:tcBorders>
+            <w:shd w:val="clear" w:color="auto" w:fill="auto"/>
+            <w:vAlign w:val="center"/>
+            <w:hideMark/>
+          </w:tcPr>
+          <w:p>
+            <w:pPr>
+              <w:spacing w:before="0" w:after="0" w:line="240" w:lineRule="auto"/>
+              <w:jc w:val="left"/>
+              <w:rPr>
+                <w:rFonts w:ascii="Segoe UI" w:eastAsia="Times New Roman" w:hAnsi="Segoe UI" w:cs="Segoe UI"/>
+                <w:b/>
+                <w:bCs/>
+                <w:color w:val="000000"/>
+                <w:sz w:val="22"/>
+                <w:szCs w:val="22"/>
+                <w:lang w:eastAsia="es-CO"/>
+              </w:rPr>
+            </w:pPr>
+            <w:r>
+              <w:rPr>
+                <w:rFonts w:ascii="Segoe UI" w:eastAsia="Times New Roman" w:hAnsi="Segoe UI" w:cs="Segoe UI"/>
+                <w:b/>
+                <w:bCs/>
+                <w:color w:val="000000"/>
+                <w:sz w:val="22"/>
+                <w:szCs w:val="22"/>
+                <w:lang w:eastAsia="es-CO"/>
+              </w:rPr>
+              <w:t>ms-autorizaciones</w:t>
+            </w:r>
+          </w:p>
+        </w:tc>
+        <w:tc>
+          <w:tcPr>
+            <w:tcW w:w="6520" w:type="dxa"/>
+            <w:tcBorders>
+              <w:top w:val="nil"/>
+              <w:left w:val="nil"/>
+              <w:bottom w:val="single" w:sz="4" w:space="0" w:color="auto"/>
+              <w:right w:val="single" w:sz="4" w:space="0" w:color="auto"/>
+            </w:tcBorders>
+            <w:shd w:val="clear" w:color="auto" w:fill="auto"/>
+            <w:vAlign w:val="center"/>
+            <w:hideMark/>
+          </w:tcPr>
+          <w:p>
+            <w:pPr>
+              <w:spacing w:before="0" w:after="0" w:line="240" w:lineRule="auto"/>
+              <w:jc w:val="left"/>
+              <w:rPr>
+                <w:rFonts w:ascii="Segoe UI" w:eastAsia="Times New Roman" w:hAnsi="Segoe UI" w:cs="Segoe UI"/>
+                <w:color w:val="000000"/>
+                <w:sz w:val="22"/>
+                <w:szCs w:val="22"/>
+                <w:lang w:eastAsia="es-CO"/>
+              </w:rPr>
+            </w:pPr>
+            <w:r>
+              <w:rPr>
+                <w:rFonts w:ascii="Segoe UI" w:eastAsia="Times New Roman" w:hAnsi="Segoe UI" w:cs="Segoe UI"/>
+                <w:color w:val="000000"/>
+                <w:sz w:val="22"/>
+                <w:szCs w:val="22"/>
+                <w:lang w:eastAsia="es-CO"/>
+              </w:rPr>
+              <w:t>Administra las solicitudes y emisión de autorizaciones de servicios médicos.</w:t>
+            </w:r>
+          </w:p>
+        </w:tc>
+      </w:tr>
+      <w:tr>
+        <w:trPr>
+          <w:trHeight w:val="660"/>
+        </w:trPr>
+        <w:tc>
+          <w:tcPr>
+            <w:tcW w:w="2540" w:type="dxa"/>
+            <w:tcBorders>
+              <w:top w:val="nil"/>
+              <w:left w:val="single" w:sz="4" w:space="0" w:color="auto"/>
+              <w:bottom w:val="single" w:sz="4" w:space="0" w:color="auto"/>
+              <w:right w:val="single" w:sz="4" w:space="0" w:color="auto"/>
+            </w:tcBorders>
+            <w:shd w:val="clear" w:color="auto" w:fill="auto"/>
+            <w:vAlign w:val="center"/>
+            <w:hideMark/>
+          </w:tcPr>
+          <w:p>
+            <w:pPr>
+              <w:spacing w:before="0" w:after="0" w:line="240" w:lineRule="auto"/>
+              <w:jc w:val="left"/>
+              <w:rPr>
+                <w:rFonts w:ascii="Segoe UI" w:eastAsia="Times New Roman" w:hAnsi="Segoe UI" w:cs="Segoe UI"/>
+                <w:b/>
+                <w:bCs/>
+                <w:color w:val="000000"/>
+                <w:sz w:val="22"/>
+                <w:szCs w:val="22"/>
+                <w:lang w:eastAsia="es-CO"/>
+              </w:rPr>
+            </w:pPr>
+            <w:r>
+              <w:rPr>
+                <w:rFonts w:ascii="Segoe UI" w:eastAsia="Times New Roman" w:hAnsi="Segoe UI" w:cs="Segoe UI"/>
+                <w:b/>
+                <w:bCs/>
+                <w:color w:val="000000"/>
+                <w:sz w:val="22"/>
+                <w:szCs w:val="22"/>
+                <w:lang w:eastAsia="es-CO"/>
+              </w:rPr>
+              <w:t>ms-</w:t>
+            </w:r>
+            <w:proofErr w:type="spellStart"/>
+            <w:r>
+              <w:rPr>
+                <w:rFonts w:ascii="Segoe UI" w:eastAsia="Times New Roman" w:hAnsi="Segoe UI" w:cs="Segoe UI"/>
+                <w:b/>
+                <w:bCs/>
+                <w:color w:val="000000"/>
+                <w:sz w:val="22"/>
+                <w:szCs w:val="22"/>
+                <w:lang w:eastAsia="es-CO"/>
+              </w:rPr>
+              <w:t>facturacion</w:t>
+            </w:r>
+            <w:proofErr w:type="spellEnd"/>
+          </w:p>
+        </w:tc>
+        <w:tc>
+          <w:tcPr>
+            <w:tcW w:w="6520" w:type="dxa"/>
+            <w:tcBorders>
+              <w:top w:val="nil"/>
+              <w:left w:val="nil"/>
+              <w:bottom w:val="single" w:sz="4" w:space="0" w:color="auto"/>
+              <w:right w:val="single" w:sz="4" w:space="0" w:color="auto"/>
+            </w:tcBorders>
+            <w:shd w:val="clear" w:color="auto" w:fill="auto"/>
+            <w:vAlign w:val="center"/>
+            <w:hideMark/>
+          </w:tcPr>
+          <w:p>
+            <w:pPr>
+              <w:spacing w:before="0" w:after="0" w:line="240" w:lineRule="auto"/>
+              <w:jc w:val="left"/>
+              <w:rPr>
+                <w:rFonts w:ascii="Segoe UI" w:eastAsia="Times New Roman" w:hAnsi="Segoe UI" w:cs="Segoe UI"/>
+                <w:color w:val="000000"/>
+                <w:sz w:val="22"/>
+                <w:szCs w:val="22"/>
+                <w:lang w:eastAsia="es-CO"/>
+              </w:rPr>
+            </w:pPr>
+            <w:r>
+              <w:rPr>
+                <w:rFonts w:ascii="Segoe UI" w:eastAsia="Times New Roman" w:hAnsi="Segoe UI" w:cs="Segoe UI"/>
+                <w:color w:val="000000"/>
+                <w:sz w:val="22"/>
+                <w:szCs w:val="22"/>
+                <w:lang w:eastAsia="es-CO"/>
+              </w:rPr>
+              <w:t>Radica, valida y gestiona las facturas enviadas por los prestadores.</w:t>
+            </w:r>
+          </w:p>
+        </w:tc>
+      </w:tr>
+      <w:tr>
+        <w:trPr>
+          <w:trHeight w:val="990"/>
+        </w:trPr>
+        <w:tc>
+          <w:tcPr>
+            <w:tcW w:w="2540" w:type="dxa"/>
+            <w:tcBorders>
+              <w:top w:val="nil"/>
+              <w:left w:val="single" w:sz="4" w:space="0" w:color="auto"/>
+              <w:bottom w:val="single" w:sz="4" w:space="0" w:color="auto"/>
+              <w:right w:val="single" w:sz="4" w:space="0" w:color="auto"/>
+            </w:tcBorders>
+            <w:shd w:val="clear" w:color="auto" w:fill="auto"/>
+            <w:vAlign w:val="center"/>
+            <w:hideMark/>
+          </w:tcPr>
+          <w:p>
+            <w:pPr>
+              <w:spacing w:before="0" w:after="0" w:line="240" w:lineRule="auto"/>
+              <w:jc w:val="left"/>
+              <w:rPr>
+                <w:rFonts w:ascii="Segoe UI" w:eastAsia="Times New Roman" w:hAnsi="Segoe UI" w:cs="Segoe UI"/>
+                <w:b/>
+                <w:bCs/>
+                <w:color w:val="000000"/>
+                <w:sz w:val="22"/>
+                <w:szCs w:val="22"/>
+                <w:lang w:eastAsia="es-CO"/>
+              </w:rPr>
+            </w:pPr>
+            <w:r>
+              <w:rPr>
+                <w:rFonts w:ascii="Segoe UI" w:eastAsia="Times New Roman" w:hAnsi="Segoe UI" w:cs="Segoe UI"/>
+                <w:b/>
+                <w:bCs/>
+                <w:color w:val="000000"/>
+                <w:sz w:val="22"/>
+                <w:szCs w:val="22"/>
+                <w:lang w:eastAsia="es-CO"/>
+              </w:rPr>
+              <w:t>ms-pagos</w:t>
+            </w:r>
+          </w:p>
+        </w:tc>
+        <w:tc>
+          <w:tcPr>
+            <w:tcW w:w="6520" w:type="dxa"/>
+            <w:tcBorders>
+              <w:top w:val="nil"/>
+              <w:left w:val="nil"/>
+              <w:bottom w:val="single" w:sz="4" w:space="0" w:color="auto"/>
+              <w:right w:val="single" w:sz="4" w:space="0" w:color="auto"/>
+            </w:tcBorders>
+            <w:shd w:val="clear" w:color="auto" w:fill="auto"/>
+            <w:vAlign w:val="center"/>
+            <w:hideMark/>
+          </w:tcPr>
+          <w:p>
+            <w:pPr>
+              <w:spacing w:before="0" w:after="0" w:line="240" w:lineRule="auto"/>
+              <w:jc w:val="left"/>
+              <w:rPr>
+                <w:rFonts w:ascii="Segoe UI" w:eastAsia="Times New Roman" w:hAnsi="Segoe UI" w:cs="Segoe UI"/>
+                <w:color w:val="000000"/>
+                <w:sz w:val="22"/>
+                <w:szCs w:val="22"/>
+                <w:lang w:eastAsia="es-CO"/>
+              </w:rPr>
+            </w:pPr>
+            <w:r>
+              <w:rPr>
+                <w:rFonts w:ascii="Segoe UI" w:eastAsia="Times New Roman" w:hAnsi="Segoe UI" w:cs="Segoe UI"/>
+                <w:color w:val="000000"/>
+                <w:sz w:val="22"/>
+                <w:szCs w:val="22"/>
+                <w:lang w:eastAsia="es-CO"/>
+              </w:rPr>
+              <w:t>Ejecuta la dispersión de pagos a prestadores y conciliaciones financieras.</w:t>
+            </w:r>
+          </w:p>
+        </w:tc>
+      </w:tr>
+      <w:tr>
+        <w:trPr>
+          <w:trHeight w:val="660"/>
+        </w:trPr>
+        <w:tc>
+          <w:tcPr>
+            <w:tcW w:w="2540" w:type="dxa"/>
+            <w:tcBorders>
+              <w:top w:val="nil"/>
+              <w:left w:val="single" w:sz="4" w:space="0" w:color="auto"/>
+              <w:bottom w:val="single" w:sz="4" w:space="0" w:color="auto"/>
+              <w:right w:val="single" w:sz="4" w:space="0" w:color="auto"/>
+            </w:tcBorders>
+            <w:shd w:val="clear" w:color="auto" w:fill="auto"/>
+            <w:vAlign w:val="center"/>
+            <w:hideMark/>
+          </w:tcPr>
+          <w:p>
+            <w:pPr>
+              <w:spacing w:before="0" w:after="0" w:line="240" w:lineRule="auto"/>
+              <w:jc w:val="left"/>
+              <w:rPr>
+                <w:rFonts w:ascii="Segoe UI" w:eastAsia="Times New Roman" w:hAnsi="Segoe UI" w:cs="Segoe UI"/>
+                <w:b/>
+                <w:bCs/>
+                <w:color w:val="000000"/>
+                <w:sz w:val="22"/>
+                <w:szCs w:val="22"/>
+                <w:lang w:eastAsia="es-CO"/>
+              </w:rPr>
+            </w:pPr>
+            <w:r>
+              <w:rPr>
+                <w:rFonts w:ascii="Segoe UI" w:eastAsia="Times New Roman" w:hAnsi="Segoe UI" w:cs="Segoe UI"/>
+                <w:b/>
+                <w:bCs/>
+                <w:color w:val="000000"/>
+                <w:sz w:val="22"/>
+                <w:szCs w:val="22"/>
+                <w:lang w:eastAsia="es-CO"/>
+              </w:rPr>
+              <w:t>ms-</w:t>
+            </w:r>
+            <w:proofErr w:type="spellStart"/>
+            <w:r>
+              <w:rPr>
+                <w:rFonts w:ascii="Segoe UI" w:eastAsia="Times New Roman" w:hAnsi="Segoe UI" w:cs="Segoe UI"/>
+                <w:b/>
+                <w:bCs/>
+                <w:color w:val="000000"/>
+                <w:sz w:val="22"/>
+                <w:szCs w:val="22"/>
+                <w:lang w:eastAsia="es-CO"/>
+              </w:rPr>
+              <w:t>pqrs</w:t>
+            </w:r>
+            <w:proofErr w:type="spellEnd"/>
+          </w:p>
+        </w:tc>
+        <w:tc>
+          <w:tcPr>
+            <w:tcW w:w="6520" w:type="dxa"/>
+            <w:tcBorders>
+              <w:top w:val="nil"/>
+              <w:left w:val="nil"/>
+              <w:bottom w:val="single" w:sz="4" w:space="0" w:color="auto"/>
+              <w:right w:val="single" w:sz="4" w:space="0" w:color="auto"/>
+            </w:tcBorders>
+            <w:shd w:val="clear" w:color="auto" w:fill="auto"/>
+            <w:vAlign w:val="center"/>
+            <w:hideMark/>
+          </w:tcPr>
+          <w:p>
+            <w:pPr>
+              <w:spacing w:before="0" w:after="0" w:line="240" w:lineRule="auto"/>
+              <w:jc w:val="left"/>
+              <w:rPr>
+                <w:rFonts w:ascii="Segoe UI" w:eastAsia="Times New Roman" w:hAnsi="Segoe UI" w:cs="Segoe UI"/>
+                <w:color w:val="000000"/>
+                <w:sz w:val="22"/>
+                <w:szCs w:val="22"/>
+                <w:lang w:eastAsia="es-CO"/>
+              </w:rPr>
+            </w:pPr>
+            <w:r>
+              <w:rPr>
+                <w:rFonts w:ascii="Segoe UI" w:eastAsia="Times New Roman" w:hAnsi="Segoe UI" w:cs="Segoe UI"/>
+                <w:color w:val="000000"/>
+                <w:sz w:val="22"/>
+                <w:szCs w:val="22"/>
+                <w:lang w:eastAsia="es-CO"/>
+              </w:rPr>
+              <w:t>Atiende peticiones, quejas, reclamos y sugerencias de los afiliados.</w:t>
+            </w:r>
+          </w:p>
+        </w:tc>
+      </w:tr>
+    </w:tbl>
+    <w:p>
+      <w:pPr>
+        <w:pStyle w:val="Prrafodelista"/>
+        <w:rPr>
+          <w:rFonts w:ascii="Times New Roman" w:hAnsi="Times New Roman" w:cs="Times New Roman"/>
+          <w:b/>
+        </w:rPr>
+      </w:pPr>
+    </w:p>
+    <w:p>
+      <w:pPr>
+        <w:rPr>
+          <w:rFonts w:ascii="Times New Roman" w:hAnsi="Times New Roman" w:cs="Times New Roman"/>
+          <w:b/>
+        </w:rPr>
+      </w:pPr>
+    </w:p>
+    <w:p>
+      <w:pPr>
+        <w:rPr>
+          <w:rFonts w:ascii="Times New Roman" w:hAnsi="Times New Roman" w:cs="Times New Roman"/>
+          <w:b/>
+        </w:rPr>
+      </w:pPr>
+    </w:p>
+    <w:p>
+      <w:pPr>
+        <w:rPr>
+          <w:rFonts w:ascii="Times New Roman" w:hAnsi="Times New Roman" w:cs="Times New Roman"/>
+          <w:b/>
+        </w:rPr>
+      </w:pPr>
+    </w:p>
+    <w:p>
+      <w:pPr>
+        <w:rPr>
+          <w:rFonts w:ascii="Times New Roman" w:hAnsi="Times New Roman" w:cs="Times New Roman"/>
+          <w:b/>
+        </w:rPr>
+      </w:pPr>
+    </w:p>
+    <w:p>
+      <w:pPr>
+        <w:jc w:val="left"/>
+        <w:rPr>
+          <w:rFonts w:ascii="Times New Roman" w:hAnsi="Times New Roman" w:cs="Times New Roman"/>
+          <w:b/>
+        </w:rPr>
+      </w:pPr>
+    </w:p>
+    <w:p>
+      <w:pPr>
+        <w:jc w:val="left"/>
+        <w:rPr>
+          <w:rFonts w:ascii="Times New Roman" w:hAnsi="Times New Roman" w:cs="Times New Roman"/>
+          <w:b/>
+        </w:rPr>
+      </w:pPr>
+    </w:p>
+    <w:p>
+      <w:pPr>
+        <w:jc w:val="left"/>
+        <w:rPr>
+          <w:rFonts w:ascii="Times New Roman" w:hAnsi="Times New Roman" w:cs="Times New Roman"/>
+          <w:b/>
+        </w:rPr>
+      </w:pPr>
+    </w:p>
+    <w:p>
+      <w:pPr>
+        <w:jc w:val="left"/>
+        <w:rPr>
+          <w:rFonts w:ascii="Times New Roman" w:hAnsi="Times New Roman" w:cs="Times New Roman"/>
+          <w:b/>
+        </w:rPr>
+      </w:pPr>
+    </w:p>
+    <w:p>
+      <w:pPr>
+        <w:jc w:val="left"/>
+        <w:rPr>
+          <w:rFonts w:ascii="Times New Roman" w:hAnsi="Times New Roman" w:cs="Times New Roman"/>
+          <w:b/>
+        </w:rPr>
+      </w:pPr>
+    </w:p>
+    <w:p>
+      <w:pPr>
+        <w:jc w:val="left"/>
+        <w:rPr>
+          <w:rFonts w:ascii="Times New Roman" w:hAnsi="Times New Roman" w:cs="Times New Roman"/>
+          <w:b/>
+        </w:rPr>
+      </w:pPr>
+    </w:p>
+    <w:p>
+      <w:pPr>
+        <w:jc w:val="left"/>
+        <w:rPr>
+          <w:rFonts w:ascii="Times New Roman" w:hAnsi="Times New Roman" w:cs="Times New Roman"/>
+          <w:b/>
+        </w:rPr>
+      </w:pPr>
+    </w:p>
+    <w:p>
+      <w:pPr>
+        <w:pStyle w:val="Prrafodelista"/>
+        <w:numPr>
+          <w:ilvl w:val="0"/>
+          <w:numId w:val="25"/>
+        </w:numPr>
+        <w:jc w:val="center"/>
+        <w:rPr>
+          <w:rFonts w:ascii="Times New Roman" w:hAnsi="Times New Roman" w:cs="Times New Roman"/>
+          <w:b/>
+        </w:rPr>
+      </w:pPr>
+      <w:r>
+        <w:rPr>
+          <w:rFonts w:ascii="Times New Roman" w:hAnsi="Times New Roman" w:cs="Times New Roman"/>
+          <w:b/>
+        </w:rPr>
+        <w:lastRenderedPageBreak/>
+        <w:t>Conclusión</w:t>
+      </w:r>
+    </w:p>
+    <w:p>
+      <w:pPr>
+        <w:ind w:firstLine="708"/>
+        <w:jc w:val="left"/>
+        <w:rPr>
+          <w:rFonts w:ascii="Times New Roman" w:hAnsi="Times New Roman" w:cs="Times New Roman"/>
+        </w:rPr>
+      </w:pPr>
+      <w:r>
+        <w:rPr>
+          <w:rFonts w:ascii="Times New Roman" w:hAnsi="Times New Roman" w:cs="Times New Roman"/>
+        </w:rPr>
+        <w:t xml:space="preserve">La estructura definida permite organizar el proyecto por dominios funcionales, facilitando el desarrollo, despliegue y mantenimiento independiente de cada microservicio, conforme a las buenas prácticas de arquitecturas basadas en </w:t>
       </w:r>
       <w:proofErr w:type="spellStart"/>
       <w:r>
@@ -651,2160 +1646,8 @@
         <w:rPr>
           <w:rFonts w:ascii="Times New Roman" w:hAnsi="Times New Roman" w:cs="Times New Roman"/>
         </w:rPr>
-        <w:t xml:space="preserve"> para una EPS que garantice escalabilidad, alta disponibilidad, seguridad y desacoplamiento, apoyada en API Gateway, balanceadores de carga, bases de datos por servicio y mensajería asíncrona.</w:t>
-      </w:r>
-    </w:p>
-    <w:p>
-      <w:pPr>
-        <w:ind w:firstLine="708"/>
-        <w:rPr>
-          <w:rFonts w:ascii="Times New Roman" w:hAnsi="Times New Roman" w:cs="Times New Roman"/>
-        </w:rPr>
-      </w:pPr>
-    </w:p>
-    <w:p>
-      <w:pPr>
-        <w:ind w:firstLine="708"/>
-        <w:rPr>
-          <w:rFonts w:ascii="Times New Roman" w:hAnsi="Times New Roman" w:cs="Times New Roman"/>
-        </w:rPr>
-      </w:pPr>
-    </w:p>
-    <w:p>
-      <w:pPr>
-        <w:ind w:firstLine="708"/>
-        <w:rPr>
-          <w:rFonts w:ascii="Times New Roman" w:hAnsi="Times New Roman" w:cs="Times New Roman"/>
-        </w:rPr>
-      </w:pPr>
-    </w:p>
-    <w:p>
-      <w:pPr>
-        <w:ind w:firstLine="708"/>
-        <w:rPr>
-          <w:rFonts w:ascii="Times New Roman" w:hAnsi="Times New Roman" w:cs="Times New Roman"/>
-        </w:rPr>
-      </w:pPr>
-    </w:p>
-    <w:p>
-      <w:pPr>
-        <w:ind w:firstLine="708"/>
-        <w:rPr>
-          <w:rFonts w:ascii="Times New Roman" w:hAnsi="Times New Roman" w:cs="Times New Roman"/>
-        </w:rPr>
-      </w:pPr>
-    </w:p>
-    <w:p>
-      <w:pPr>
-        <w:ind w:firstLine="708"/>
-        <w:rPr>
-          <w:rFonts w:ascii="Times New Roman" w:hAnsi="Times New Roman" w:cs="Times New Roman"/>
-        </w:rPr>
-      </w:pPr>
-    </w:p>
-    <w:p>
-      <w:pPr>
-        <w:ind w:firstLine="708"/>
-        <w:rPr>
-          <w:rFonts w:ascii="Times New Roman" w:hAnsi="Times New Roman" w:cs="Times New Roman"/>
-        </w:rPr>
-      </w:pPr>
-    </w:p>
-    <w:p>
-      <w:pPr>
-        <w:ind w:firstLine="708"/>
-        <w:rPr>
-          <w:rFonts w:ascii="Times New Roman" w:hAnsi="Times New Roman" w:cs="Times New Roman"/>
-        </w:rPr>
-      </w:pPr>
-    </w:p>
-    <w:p>
-      <w:pPr>
-        <w:ind w:firstLine="708"/>
-        <w:rPr>
-          <w:rFonts w:ascii="Times New Roman" w:hAnsi="Times New Roman" w:cs="Times New Roman"/>
-        </w:rPr>
-      </w:pPr>
-    </w:p>
-    <w:p>
-      <w:pPr>
-        <w:ind w:firstLine="708"/>
-        <w:rPr>
-          <w:rFonts w:ascii="Times New Roman" w:hAnsi="Times New Roman" w:cs="Times New Roman"/>
-        </w:rPr>
-      </w:pPr>
-    </w:p>
-    <w:p>
-      <w:pPr>
-        <w:ind w:firstLine="708"/>
-        <w:rPr>
-          <w:rFonts w:ascii="Times New Roman" w:hAnsi="Times New Roman" w:cs="Times New Roman"/>
-        </w:rPr>
-      </w:pPr>
-    </w:p>
-    <w:p>
-      <w:pPr>
-        <w:ind w:firstLine="708"/>
-        <w:rPr>
-          <w:rFonts w:ascii="Times New Roman" w:hAnsi="Times New Roman" w:cs="Times New Roman"/>
-        </w:rPr>
-      </w:pPr>
-    </w:p>
-    <w:p>
-      <w:pPr>
-        <w:ind w:firstLine="708"/>
-        <w:rPr>
-          <w:rFonts w:ascii="Times New Roman" w:hAnsi="Times New Roman" w:cs="Times New Roman"/>
-        </w:rPr>
-      </w:pPr>
-    </w:p>
-    <w:p>
-      <w:pPr>
-        <w:ind w:firstLine="708"/>
-        <w:rPr>
-          <w:rFonts w:ascii="Times New Roman" w:hAnsi="Times New Roman" w:cs="Times New Roman"/>
-        </w:rPr>
-      </w:pPr>
-    </w:p>
-    <w:p>
-      <w:pPr>
-        <w:ind w:firstLine="708"/>
-        <w:rPr>
-          <w:rFonts w:ascii="Times New Roman" w:hAnsi="Times New Roman" w:cs="Times New Roman"/>
-        </w:rPr>
-      </w:pPr>
-    </w:p>
-    <w:p>
-      <w:pPr>
-        <w:ind w:firstLine="708"/>
-        <w:rPr>
-          <w:rFonts w:ascii="Times New Roman" w:hAnsi="Times New Roman" w:cs="Times New Roman"/>
-        </w:rPr>
-      </w:pPr>
-    </w:p>
-    <w:p>
-      <w:pPr>
-        <w:ind w:firstLine="708"/>
-        <w:rPr>
-          <w:rFonts w:ascii="Times New Roman" w:hAnsi="Times New Roman" w:cs="Times New Roman"/>
-        </w:rPr>
-      </w:pPr>
-    </w:p>
-    <w:p>
-      <w:pPr>
-        <w:ind w:firstLine="708"/>
-        <w:rPr>
-          <w:rFonts w:ascii="Times New Roman" w:hAnsi="Times New Roman" w:cs="Times New Roman"/>
-        </w:rPr>
-      </w:pPr>
-    </w:p>
-    <w:p>
-      <w:pPr>
-        <w:ind w:firstLine="708"/>
-        <w:rPr>
-          <w:rFonts w:ascii="Times New Roman" w:hAnsi="Times New Roman" w:cs="Times New Roman"/>
-        </w:rPr>
-      </w:pPr>
-    </w:p>
-    <w:p>
-      <w:pPr>
-        <w:ind w:firstLine="708"/>
-        <w:rPr>
-          <w:rFonts w:ascii="Times New Roman" w:hAnsi="Times New Roman" w:cs="Times New Roman"/>
-        </w:rPr>
-      </w:pPr>
-    </w:p>
-    <w:p>
-      <w:pPr>
-        <w:ind w:firstLine="708"/>
-        <w:jc w:val="center"/>
-        <w:rPr>
-          <w:rFonts w:ascii="Times New Roman" w:hAnsi="Times New Roman" w:cs="Times New Roman"/>
-          <w:b/>
-        </w:rPr>
-      </w:pPr>
-      <w:r>
-        <w:rPr>
-          <w:rFonts w:ascii="Times New Roman" w:hAnsi="Times New Roman" w:cs="Times New Roman"/>
-          <w:b/>
-        </w:rPr>
-        <w:lastRenderedPageBreak/>
-        <w:t>3. Descripción de la arquitectura</w:t>
-      </w:r>
-    </w:p>
-    <w:p>
-      <w:pPr>
-        <w:rPr>
-          <w:rFonts w:ascii="Times New Roman" w:hAnsi="Times New Roman" w:cs="Times New Roman"/>
-        </w:rPr>
-      </w:pPr>
-      <w:r>
-        <w:rPr>
-          <w:rFonts w:ascii="Times New Roman" w:hAnsi="Times New Roman" w:cs="Times New Roman"/>
-        </w:rPr>
-        <w:t>La arquitec</w:t>
-      </w:r>
-      <w:r>
-        <w:rPr>
-          <w:rFonts w:ascii="Times New Roman" w:hAnsi="Times New Roman" w:cs="Times New Roman"/>
-        </w:rPr>
-        <w:t>tura se organiza en seis capas:</w:t>
-      </w:r>
-    </w:p>
-    <w:p>
-      <w:pPr>
-        <w:pStyle w:val="Prrafodelista"/>
-        <w:numPr>
-          <w:ilvl w:val="0"/>
-          <w:numId w:val="4"/>
-        </w:numPr>
-        <w:rPr>
-          <w:rFonts w:ascii="Times New Roman" w:hAnsi="Times New Roman" w:cs="Times New Roman"/>
-        </w:rPr>
-      </w:pPr>
-      <w:r>
-        <w:rPr>
-          <w:rFonts w:ascii="Times New Roman" w:hAnsi="Times New Roman" w:cs="Times New Roman"/>
-          <w:b/>
-        </w:rPr>
-        <w:t>Clientes:</w:t>
-      </w:r>
-      <w:r>
-        <w:rPr>
-          <w:rFonts w:ascii="Times New Roman" w:hAnsi="Times New Roman" w:cs="Times New Roman"/>
-        </w:rPr>
-        <w:t xml:space="preserve"> </w:t>
-      </w:r>
-    </w:p>
-    <w:p>
-      <w:pPr>
-        <w:pStyle w:val="Prrafodelista"/>
-        <w:numPr>
-          <w:ilvl w:val="0"/>
-          <w:numId w:val="5"/>
-        </w:numPr>
-        <w:rPr>
-          <w:rFonts w:ascii="Times New Roman" w:hAnsi="Times New Roman" w:cs="Times New Roman"/>
-        </w:rPr>
-      </w:pPr>
-      <w:r>
-        <w:rPr>
-          <w:rFonts w:ascii="Times New Roman" w:hAnsi="Times New Roman" w:cs="Times New Roman"/>
-        </w:rPr>
-        <w:t>app móvil,</w:t>
-      </w:r>
-    </w:p>
-    <w:p>
-      <w:pPr>
-        <w:pStyle w:val="Prrafodelista"/>
-        <w:numPr>
-          <w:ilvl w:val="0"/>
-          <w:numId w:val="5"/>
-        </w:numPr>
-        <w:rPr>
-          <w:rFonts w:ascii="Times New Roman" w:hAnsi="Times New Roman" w:cs="Times New Roman"/>
-        </w:rPr>
-      </w:pPr>
-      <w:r>
-        <w:rPr>
-          <w:rFonts w:ascii="Times New Roman" w:hAnsi="Times New Roman" w:cs="Times New Roman"/>
-        </w:rPr>
-        <w:t xml:space="preserve">portal web </w:t>
-      </w:r>
-    </w:p>
-    <w:p>
-      <w:pPr>
-        <w:pStyle w:val="Prrafodelista"/>
-        <w:numPr>
-          <w:ilvl w:val="0"/>
-          <w:numId w:val="5"/>
-        </w:numPr>
-        <w:rPr>
-          <w:rFonts w:ascii="Times New Roman" w:hAnsi="Times New Roman" w:cs="Times New Roman"/>
-        </w:rPr>
-      </w:pPr>
-      <w:r>
-        <w:rPr>
-          <w:rFonts w:ascii="Times New Roman" w:hAnsi="Times New Roman" w:cs="Times New Roman"/>
-        </w:rPr>
-        <w:t>portal de prestadores y back-office.</w:t>
-      </w:r>
-    </w:p>
-    <w:p>
-      <w:pPr>
-        <w:pStyle w:val="Prrafodelista"/>
-        <w:ind w:left="1440"/>
-        <w:rPr>
-          <w:rFonts w:ascii="Times New Roman" w:hAnsi="Times New Roman" w:cs="Times New Roman"/>
-        </w:rPr>
-      </w:pPr>
-    </w:p>
-    <w:p>
-      <w:pPr>
-        <w:pStyle w:val="Prrafodelista"/>
-        <w:numPr>
-          <w:ilvl w:val="0"/>
-          <w:numId w:val="4"/>
-        </w:numPr>
-        <w:rPr>
-          <w:rFonts w:ascii="Times New Roman" w:hAnsi="Times New Roman" w:cs="Times New Roman"/>
-          <w:b/>
-        </w:rPr>
-      </w:pPr>
-      <w:r>
-        <w:rPr>
-          <w:rFonts w:ascii="Times New Roman" w:hAnsi="Times New Roman" w:cs="Times New Roman"/>
-          <w:b/>
-        </w:rPr>
-        <w:t>Borde y seguridad:</w:t>
-      </w:r>
-    </w:p>
-    <w:p>
-      <w:pPr>
-        <w:pStyle w:val="Prrafodelista"/>
-        <w:numPr>
-          <w:ilvl w:val="0"/>
-          <w:numId w:val="6"/>
-        </w:numPr>
-        <w:rPr>
-          <w:rFonts w:ascii="Times New Roman" w:hAnsi="Times New Roman" w:cs="Times New Roman"/>
-        </w:rPr>
-      </w:pPr>
-      <w:r>
-        <w:rPr>
-          <w:rFonts w:ascii="Times New Roman" w:hAnsi="Times New Roman" w:cs="Times New Roman"/>
-          <w:b/>
-        </w:rPr>
-        <w:t>Balanceador de carga (LB L7):</w:t>
-      </w:r>
-      <w:r>
-        <w:rPr>
-          <w:rFonts w:ascii="Times New Roman" w:hAnsi="Times New Roman" w:cs="Times New Roman"/>
-        </w:rPr>
-        <w:t xml:space="preserve"> distribuye el tráfico y evita puntos únicos de falla.</w:t>
-      </w:r>
-    </w:p>
-    <w:p>
-      <w:pPr>
-        <w:pStyle w:val="Prrafodelista"/>
-        <w:numPr>
-          <w:ilvl w:val="0"/>
-          <w:numId w:val="6"/>
-        </w:numPr>
-        <w:rPr>
-          <w:rFonts w:ascii="Times New Roman" w:hAnsi="Times New Roman" w:cs="Times New Roman"/>
-        </w:rPr>
-      </w:pPr>
-      <w:r>
-        <w:rPr>
-          <w:rFonts w:ascii="Times New Roman" w:hAnsi="Times New Roman" w:cs="Times New Roman"/>
-          <w:b/>
-        </w:rPr>
-        <w:t>API Gateway + IAM:</w:t>
-      </w:r>
-      <w:r>
-        <w:rPr>
-          <w:rFonts w:ascii="Times New Roman" w:hAnsi="Times New Roman" w:cs="Times New Roman"/>
-        </w:rPr>
-        <w:t xml:space="preserve"> punto único de entrada; gestiona autenticación (OAuth2/JWT), enrutamiento, </w:t>
-      </w:r>
-      <w:proofErr w:type="spellStart"/>
-      <w:r>
-        <w:rPr>
-          <w:rFonts w:ascii="Times New Roman" w:hAnsi="Times New Roman" w:cs="Times New Roman"/>
-        </w:rPr>
-        <w:t>rate</w:t>
-      </w:r>
-      <w:proofErr w:type="spellEnd"/>
-      <w:r>
-        <w:rPr>
-          <w:rFonts w:ascii="Times New Roman" w:hAnsi="Times New Roman" w:cs="Times New Roman"/>
-        </w:rPr>
-        <w:t xml:space="preserve"> </w:t>
-      </w:r>
-      <w:proofErr w:type="spellStart"/>
-      <w:r>
-        <w:rPr>
-          <w:rFonts w:ascii="Times New Roman" w:hAnsi="Times New Roman" w:cs="Times New Roman"/>
-        </w:rPr>
-        <w:t>limiting</w:t>
-      </w:r>
-      <w:proofErr w:type="spellEnd"/>
-      <w:r>
-        <w:rPr>
-          <w:rFonts w:ascii="Times New Roman" w:hAnsi="Times New Roman" w:cs="Times New Roman"/>
-        </w:rPr>
-        <w:t xml:space="preserve"> y auditoría.</w:t>
-      </w:r>
-    </w:p>
-    <w:p>
-      <w:pPr>
-        <w:pStyle w:val="Prrafodelista"/>
-        <w:ind w:left="1440"/>
-        <w:rPr>
-          <w:rFonts w:ascii="Times New Roman" w:hAnsi="Times New Roman" w:cs="Times New Roman"/>
-        </w:rPr>
-      </w:pPr>
-    </w:p>
-    <w:p>
-      <w:pPr>
-        <w:pStyle w:val="Prrafodelista"/>
-        <w:numPr>
-          <w:ilvl w:val="0"/>
-          <w:numId w:val="4"/>
-        </w:numPr>
-        <w:rPr>
-          <w:rFonts w:ascii="Times New Roman" w:hAnsi="Times New Roman" w:cs="Times New Roman"/>
-          <w:b/>
-        </w:rPr>
-      </w:pPr>
-      <w:r>
-        <w:rPr>
-          <w:rFonts w:ascii="Times New Roman" w:hAnsi="Times New Roman" w:cs="Times New Roman"/>
-          <w:b/>
-        </w:rPr>
-        <w:t>Microservicios de negocio (Core EPS)</w:t>
-      </w:r>
-      <w:r>
-        <w:rPr>
-          <w:rFonts w:ascii="Times New Roman" w:hAnsi="Times New Roman" w:cs="Times New Roman"/>
-          <w:b/>
-        </w:rPr>
-        <w:t>:</w:t>
-      </w:r>
-    </w:p>
-    <w:p>
-      <w:pPr>
-        <w:pStyle w:val="Prrafodelista"/>
-        <w:numPr>
-          <w:ilvl w:val="1"/>
-          <w:numId w:val="9"/>
-        </w:numPr>
-        <w:rPr>
-          <w:rFonts w:ascii="Times New Roman" w:hAnsi="Times New Roman" w:cs="Times New Roman"/>
-          <w:b/>
-        </w:rPr>
-      </w:pPr>
-      <w:r>
-        <w:rPr>
-          <w:rFonts w:ascii="Times New Roman" w:hAnsi="Times New Roman" w:cs="Times New Roman"/>
-          <w:b/>
-        </w:rPr>
-        <w:t xml:space="preserve">Afiliación y aportes </w:t>
-      </w:r>
-      <w:r>
-        <w:rPr>
-          <w:rFonts w:ascii="Times New Roman" w:hAnsi="Times New Roman" w:cs="Times New Roman"/>
-        </w:rPr>
-        <w:t>(Afiliados, recaudo PILA, coberturas):</w:t>
-      </w:r>
-      <w:r>
-        <w:rPr>
-          <w:rFonts w:ascii="Times New Roman" w:hAnsi="Times New Roman" w:cs="Times New Roman"/>
-          <w:b/>
-        </w:rPr>
-        <w:t xml:space="preserve"> </w:t>
-      </w:r>
-    </w:p>
-    <w:p>
-      <w:pPr>
-        <w:pStyle w:val="Prrafodelista"/>
-        <w:numPr>
-          <w:ilvl w:val="1"/>
-          <w:numId w:val="11"/>
-        </w:numPr>
-        <w:rPr>
-          <w:rFonts w:ascii="Times New Roman" w:hAnsi="Times New Roman" w:cs="Times New Roman"/>
-        </w:rPr>
-      </w:pPr>
-      <w:r>
-        <w:rPr>
-          <w:rFonts w:ascii="Times New Roman" w:hAnsi="Times New Roman" w:cs="Times New Roman"/>
-        </w:rPr>
-        <w:t>ms-</w:t>
-      </w:r>
-      <w:proofErr w:type="spellStart"/>
-      <w:r>
-        <w:rPr>
-          <w:rFonts w:ascii="Times New Roman" w:hAnsi="Times New Roman" w:cs="Times New Roman"/>
-        </w:rPr>
-        <w:t>afiliacion</w:t>
-      </w:r>
-      <w:proofErr w:type="spellEnd"/>
-    </w:p>
-    <w:p>
-      <w:pPr>
-        <w:pStyle w:val="Prrafodelista"/>
-        <w:numPr>
-          <w:ilvl w:val="1"/>
-          <w:numId w:val="11"/>
-        </w:numPr>
-        <w:rPr>
-          <w:rFonts w:ascii="Times New Roman" w:hAnsi="Times New Roman" w:cs="Times New Roman"/>
-        </w:rPr>
-      </w:pPr>
-      <w:r>
-        <w:rPr>
-          <w:rFonts w:ascii="Times New Roman" w:hAnsi="Times New Roman" w:cs="Times New Roman"/>
-        </w:rPr>
-        <w:t>ms-</w:t>
-      </w:r>
-      <w:proofErr w:type="spellStart"/>
-      <w:r>
-        <w:rPr>
-          <w:rFonts w:ascii="Times New Roman" w:hAnsi="Times New Roman" w:cs="Times New Roman"/>
-        </w:rPr>
-        <w:t>cotizacion</w:t>
-      </w:r>
-      <w:proofErr w:type="spellEnd"/>
-      <w:r>
-        <w:rPr>
-          <w:rFonts w:ascii="Times New Roman" w:hAnsi="Times New Roman" w:cs="Times New Roman"/>
-        </w:rPr>
-        <w:t>-recaudo</w:t>
-      </w:r>
-    </w:p>
-    <w:p>
-      <w:pPr>
-        <w:pStyle w:val="Prrafodelista"/>
-        <w:numPr>
-          <w:ilvl w:val="1"/>
-          <w:numId w:val="11"/>
-        </w:numPr>
-        <w:rPr>
-          <w:rFonts w:ascii="Times New Roman" w:hAnsi="Times New Roman" w:cs="Times New Roman"/>
-          <w:b/>
-        </w:rPr>
-      </w:pPr>
-      <w:r>
-        <w:rPr>
-          <w:rFonts w:ascii="Times New Roman" w:hAnsi="Times New Roman" w:cs="Times New Roman"/>
-        </w:rPr>
-        <w:t>ms-planes-beneficios</w:t>
-      </w:r>
-    </w:p>
-    <w:p>
-      <w:pPr>
-        <w:pStyle w:val="Prrafodelista"/>
-        <w:numPr>
-          <w:ilvl w:val="1"/>
-          <w:numId w:val="10"/>
-        </w:numPr>
-        <w:rPr>
-          <w:rFonts w:ascii="Times New Roman" w:hAnsi="Times New Roman" w:cs="Times New Roman"/>
-        </w:rPr>
-      </w:pPr>
-      <w:r>
-        <w:rPr>
-          <w:rFonts w:ascii="Times New Roman" w:hAnsi="Times New Roman" w:cs="Times New Roman"/>
-          <w:b/>
-        </w:rPr>
-        <w:t xml:space="preserve">Atención en </w:t>
-      </w:r>
-      <w:r>
-        <w:rPr>
-          <w:rFonts w:ascii="Times New Roman" w:hAnsi="Times New Roman" w:cs="Times New Roman"/>
-          <w:b/>
-        </w:rPr>
-        <w:t xml:space="preserve">salud </w:t>
-      </w:r>
-      <w:r>
-        <w:rPr>
-          <w:rFonts w:ascii="Times New Roman" w:hAnsi="Times New Roman" w:cs="Times New Roman"/>
-        </w:rPr>
-        <w:t>(</w:t>
-      </w:r>
-      <w:r>
-        <w:rPr>
-          <w:rFonts w:ascii="Times New Roman" w:hAnsi="Times New Roman" w:cs="Times New Roman"/>
-        </w:rPr>
-        <w:t>Autorizaciones, citas, atención)</w:t>
-      </w:r>
-      <w:r>
-        <w:rPr>
-          <w:rFonts w:ascii="Times New Roman" w:hAnsi="Times New Roman" w:cs="Times New Roman"/>
-        </w:rPr>
-        <w:t>:</w:t>
-      </w:r>
-    </w:p>
-    <w:p>
-      <w:pPr>
-        <w:pStyle w:val="Prrafodelista"/>
-        <w:numPr>
-          <w:ilvl w:val="2"/>
-          <w:numId w:val="10"/>
-        </w:numPr>
-        <w:rPr>
-          <w:rFonts w:ascii="Times New Roman" w:hAnsi="Times New Roman" w:cs="Times New Roman"/>
-        </w:rPr>
-      </w:pPr>
-      <w:r>
-        <w:rPr>
-          <w:rFonts w:ascii="Times New Roman" w:hAnsi="Times New Roman" w:cs="Times New Roman"/>
-        </w:rPr>
-        <w:t>ms-autorizaciones</w:t>
-      </w:r>
-    </w:p>
-    <w:p>
-      <w:pPr>
-        <w:pStyle w:val="Prrafodelista"/>
-        <w:numPr>
-          <w:ilvl w:val="2"/>
-          <w:numId w:val="10"/>
-        </w:numPr>
-        <w:rPr>
-          <w:rFonts w:ascii="Times New Roman" w:hAnsi="Times New Roman" w:cs="Times New Roman"/>
-        </w:rPr>
-      </w:pPr>
-      <w:r>
-        <w:rPr>
-          <w:rFonts w:ascii="Times New Roman" w:hAnsi="Times New Roman" w:cs="Times New Roman"/>
-        </w:rPr>
-        <w:t>ms-agendamiento-citas</w:t>
-      </w:r>
-    </w:p>
-    <w:p>
-      <w:pPr>
-        <w:pStyle w:val="Prrafodelista"/>
-        <w:numPr>
-          <w:ilvl w:val="2"/>
-          <w:numId w:val="10"/>
-        </w:numPr>
-        <w:rPr>
-          <w:rFonts w:ascii="Times New Roman" w:hAnsi="Times New Roman" w:cs="Times New Roman"/>
-        </w:rPr>
-      </w:pPr>
-      <w:r>
-        <w:rPr>
-          <w:rFonts w:ascii="Times New Roman" w:hAnsi="Times New Roman" w:cs="Times New Roman"/>
-        </w:rPr>
-        <w:t>ms-</w:t>
-      </w:r>
-      <w:proofErr w:type="spellStart"/>
-      <w:r>
-        <w:rPr>
-          <w:rFonts w:ascii="Times New Roman" w:hAnsi="Times New Roman" w:cs="Times New Roman"/>
-        </w:rPr>
-        <w:t>atencion</w:t>
-      </w:r>
-      <w:proofErr w:type="spellEnd"/>
-      <w:r>
-        <w:rPr>
-          <w:rFonts w:ascii="Times New Roman" w:hAnsi="Times New Roman" w:cs="Times New Roman"/>
-        </w:rPr>
-        <w:t>-</w:t>
-      </w:r>
-      <w:proofErr w:type="spellStart"/>
-      <w:r>
-        <w:rPr>
-          <w:rFonts w:ascii="Times New Roman" w:hAnsi="Times New Roman" w:cs="Times New Roman"/>
-        </w:rPr>
-        <w:t>clinica</w:t>
-      </w:r>
-      <w:proofErr w:type="spellEnd"/>
-    </w:p>
-    <w:p>
-      <w:pPr>
-        <w:pStyle w:val="Prrafodelista"/>
-        <w:numPr>
-          <w:ilvl w:val="1"/>
-          <w:numId w:val="15"/>
-        </w:numPr>
-        <w:rPr>
-          <w:rFonts w:ascii="Times New Roman" w:hAnsi="Times New Roman" w:cs="Times New Roman"/>
-          <w:b/>
-        </w:rPr>
-      </w:pPr>
-      <w:r>
-        <w:rPr>
-          <w:rFonts w:ascii="Times New Roman" w:hAnsi="Times New Roman" w:cs="Times New Roman"/>
-          <w:b/>
-        </w:rPr>
-        <w:t xml:space="preserve">Red y contratación </w:t>
-      </w:r>
-      <w:r>
-        <w:rPr>
-          <w:rFonts w:ascii="Times New Roman" w:hAnsi="Times New Roman" w:cs="Times New Roman"/>
-        </w:rPr>
-        <w:t>(IPS, contratos, tarifas):</w:t>
-      </w:r>
-    </w:p>
-    <w:p>
-      <w:pPr>
-        <w:pStyle w:val="Prrafodelista"/>
-        <w:numPr>
-          <w:ilvl w:val="2"/>
-          <w:numId w:val="16"/>
-        </w:numPr>
-        <w:rPr>
-          <w:rFonts w:ascii="Times New Roman" w:hAnsi="Times New Roman" w:cs="Times New Roman"/>
-        </w:rPr>
-      </w:pPr>
-      <w:r>
-        <w:rPr>
-          <w:rFonts w:ascii="Times New Roman" w:hAnsi="Times New Roman" w:cs="Times New Roman"/>
-        </w:rPr>
-        <w:t>ms-red-prestadores</w:t>
-      </w:r>
-    </w:p>
-    <w:p>
-      <w:pPr>
-        <w:pStyle w:val="Prrafodelista"/>
-        <w:numPr>
-          <w:ilvl w:val="2"/>
-          <w:numId w:val="16"/>
-        </w:numPr>
-        <w:rPr>
-          <w:rFonts w:ascii="Times New Roman" w:hAnsi="Times New Roman" w:cs="Times New Roman"/>
-        </w:rPr>
-      </w:pPr>
-      <w:r>
-        <w:rPr>
-          <w:rFonts w:ascii="Times New Roman" w:hAnsi="Times New Roman" w:cs="Times New Roman"/>
-        </w:rPr>
-        <w:t>ms-</w:t>
-      </w:r>
-      <w:proofErr w:type="spellStart"/>
-      <w:r>
-        <w:rPr>
-          <w:rFonts w:ascii="Times New Roman" w:hAnsi="Times New Roman" w:cs="Times New Roman"/>
-        </w:rPr>
-        <w:t>contratacion</w:t>
-      </w:r>
-      <w:proofErr w:type="spellEnd"/>
-    </w:p>
-    <w:p>
-      <w:pPr>
-        <w:pStyle w:val="Prrafodelista"/>
-        <w:numPr>
-          <w:ilvl w:val="1"/>
-          <w:numId w:val="15"/>
-        </w:numPr>
-        <w:rPr>
-          <w:rFonts w:ascii="Times New Roman" w:hAnsi="Times New Roman" w:cs="Times New Roman"/>
-        </w:rPr>
-      </w:pPr>
-      <w:r>
-        <w:rPr>
-          <w:rFonts w:ascii="Times New Roman" w:hAnsi="Times New Roman" w:cs="Times New Roman"/>
-          <w:b/>
-        </w:rPr>
-        <w:t xml:space="preserve">Facturación y pagos </w:t>
-      </w:r>
-      <w:r>
-        <w:rPr>
-          <w:rFonts w:ascii="Times New Roman" w:hAnsi="Times New Roman" w:cs="Times New Roman"/>
-        </w:rPr>
-        <w:t>(Radicación, auditoría, pagos):</w:t>
-      </w:r>
-    </w:p>
-    <w:p>
-      <w:pPr>
-        <w:pStyle w:val="Prrafodelista"/>
-        <w:numPr>
-          <w:ilvl w:val="2"/>
-          <w:numId w:val="15"/>
-        </w:numPr>
-        <w:rPr>
-          <w:rFonts w:ascii="Times New Roman" w:hAnsi="Times New Roman" w:cs="Times New Roman"/>
-        </w:rPr>
-      </w:pPr>
-      <w:r>
-        <w:rPr>
-          <w:rFonts w:ascii="Times New Roman" w:hAnsi="Times New Roman" w:cs="Times New Roman"/>
-        </w:rPr>
-        <w:t>ms-</w:t>
-      </w:r>
-      <w:proofErr w:type="spellStart"/>
-      <w:r>
-        <w:rPr>
-          <w:rFonts w:ascii="Times New Roman" w:hAnsi="Times New Roman" w:cs="Times New Roman"/>
-        </w:rPr>
-        <w:t>facturacion</w:t>
-      </w:r>
-      <w:proofErr w:type="spellEnd"/>
-      <w:r>
-        <w:rPr>
-          <w:rFonts w:ascii="Times New Roman" w:hAnsi="Times New Roman" w:cs="Times New Roman"/>
-        </w:rPr>
-        <w:t>-</w:t>
-      </w:r>
-      <w:proofErr w:type="spellStart"/>
-      <w:r>
-        <w:rPr>
-          <w:rFonts w:ascii="Times New Roman" w:hAnsi="Times New Roman" w:cs="Times New Roman"/>
-        </w:rPr>
-        <w:t>radicacion</w:t>
-      </w:r>
-      <w:proofErr w:type="spellEnd"/>
-    </w:p>
-    <w:p>
-      <w:pPr>
-        <w:pStyle w:val="Prrafodelista"/>
-        <w:numPr>
-          <w:ilvl w:val="2"/>
-          <w:numId w:val="15"/>
-        </w:numPr>
-        <w:rPr>
-          <w:rFonts w:ascii="Times New Roman" w:hAnsi="Times New Roman" w:cs="Times New Roman"/>
-        </w:rPr>
-      </w:pPr>
-      <w:r>
-        <w:rPr>
-          <w:rFonts w:ascii="Times New Roman" w:hAnsi="Times New Roman" w:cs="Times New Roman"/>
-        </w:rPr>
-        <w:t>ms-auditoria-medica</w:t>
-      </w:r>
-    </w:p>
-    <w:p>
-      <w:pPr>
-        <w:pStyle w:val="Prrafodelista"/>
-        <w:numPr>
-          <w:ilvl w:val="2"/>
-          <w:numId w:val="15"/>
-        </w:numPr>
-        <w:rPr>
-          <w:rFonts w:ascii="Times New Roman" w:hAnsi="Times New Roman" w:cs="Times New Roman"/>
-        </w:rPr>
-      </w:pPr>
-      <w:r>
-        <w:rPr>
-          <w:rFonts w:ascii="Times New Roman" w:hAnsi="Times New Roman" w:cs="Times New Roman"/>
-        </w:rPr>
-        <w:t>ms-pagos</w:t>
-      </w:r>
-    </w:p>
-    <w:p>
-      <w:pPr>
-        <w:pStyle w:val="Prrafodelista"/>
-        <w:numPr>
-          <w:ilvl w:val="1"/>
-          <w:numId w:val="15"/>
-        </w:numPr>
-        <w:rPr>
-          <w:rFonts w:ascii="Times New Roman" w:hAnsi="Times New Roman" w:cs="Times New Roman"/>
-          <w:b/>
-        </w:rPr>
-      </w:pPr>
-      <w:r>
-        <w:rPr>
-          <w:rFonts w:ascii="Times New Roman" w:hAnsi="Times New Roman" w:cs="Times New Roman"/>
-          <w:b/>
-        </w:rPr>
-        <w:t xml:space="preserve">Servicio al afiliado </w:t>
-      </w:r>
-      <w:r>
-        <w:rPr>
-          <w:rFonts w:ascii="Times New Roman" w:hAnsi="Times New Roman" w:cs="Times New Roman"/>
-        </w:rPr>
-        <w:t>(Peticiones, quejas, reclamos):</w:t>
-      </w:r>
-    </w:p>
-    <w:p>
-      <w:pPr>
-        <w:pStyle w:val="Prrafodelista"/>
-        <w:numPr>
-          <w:ilvl w:val="2"/>
-          <w:numId w:val="15"/>
-        </w:numPr>
-        <w:rPr>
-          <w:rFonts w:ascii="Times New Roman" w:hAnsi="Times New Roman" w:cs="Times New Roman"/>
-        </w:rPr>
-      </w:pPr>
-      <w:r>
-        <w:rPr>
-          <w:rFonts w:ascii="Times New Roman" w:hAnsi="Times New Roman" w:cs="Times New Roman"/>
-        </w:rPr>
-        <w:t>ms-</w:t>
-      </w:r>
-      <w:proofErr w:type="spellStart"/>
-      <w:r>
-        <w:rPr>
-          <w:rFonts w:ascii="Times New Roman" w:hAnsi="Times New Roman" w:cs="Times New Roman"/>
-        </w:rPr>
-        <w:t>pqrs</w:t>
-      </w:r>
-      <w:proofErr w:type="spellEnd"/>
-    </w:p>
-    <w:p>
-      <w:pPr>
-        <w:pStyle w:val="Prrafodelista"/>
-        <w:ind w:left="2160"/>
-        <w:rPr>
-          <w:rFonts w:ascii="Times New Roman" w:hAnsi="Times New Roman" w:cs="Times New Roman"/>
-          <w:b/>
-        </w:rPr>
-      </w:pPr>
-    </w:p>
-    <w:p>
-      <w:pPr>
-        <w:pStyle w:val="Prrafodelista"/>
-        <w:numPr>
-          <w:ilvl w:val="0"/>
-          <w:numId w:val="4"/>
-        </w:numPr>
-        <w:rPr>
-          <w:rFonts w:ascii="Times New Roman" w:hAnsi="Times New Roman" w:cs="Times New Roman"/>
-          <w:b/>
-        </w:rPr>
-      </w:pPr>
-      <w:r>
-        <w:rPr>
-          <w:rFonts w:ascii="Times New Roman" w:hAnsi="Times New Roman" w:cs="Times New Roman"/>
-          <w:b/>
-        </w:rPr>
-        <w:t>Microservicios de soporte</w:t>
-      </w:r>
-      <w:r>
-        <w:rPr>
-          <w:rFonts w:ascii="Times New Roman" w:hAnsi="Times New Roman" w:cs="Times New Roman"/>
-          <w:b/>
-        </w:rPr>
-        <w:t>:</w:t>
-      </w:r>
-    </w:p>
-    <w:p>
-      <w:pPr>
-        <w:pStyle w:val="Prrafodelista"/>
-        <w:numPr>
-          <w:ilvl w:val="0"/>
-          <w:numId w:val="20"/>
-        </w:numPr>
-        <w:rPr>
-          <w:rFonts w:ascii="Times New Roman" w:hAnsi="Times New Roman" w:cs="Times New Roman"/>
-        </w:rPr>
-      </w:pPr>
-      <w:r>
-        <w:rPr>
-          <w:rFonts w:ascii="Times New Roman" w:hAnsi="Times New Roman" w:cs="Times New Roman"/>
-        </w:rPr>
-        <w:t>ms-notificaciones</w:t>
-      </w:r>
-    </w:p>
-    <w:p>
-      <w:pPr>
-        <w:pStyle w:val="Prrafodelista"/>
-        <w:numPr>
-          <w:ilvl w:val="0"/>
-          <w:numId w:val="20"/>
-        </w:numPr>
-        <w:rPr>
-          <w:rFonts w:ascii="Times New Roman" w:hAnsi="Times New Roman" w:cs="Times New Roman"/>
-        </w:rPr>
-      </w:pPr>
-      <w:r>
-        <w:rPr>
-          <w:rFonts w:ascii="Times New Roman" w:hAnsi="Times New Roman" w:cs="Times New Roman"/>
-        </w:rPr>
-        <w:t>ms-documental</w:t>
-      </w:r>
-    </w:p>
-    <w:p>
-      <w:pPr>
-        <w:pStyle w:val="Prrafodelista"/>
-        <w:numPr>
-          <w:ilvl w:val="0"/>
-          <w:numId w:val="20"/>
-        </w:numPr>
-        <w:rPr>
-          <w:rFonts w:ascii="Times New Roman" w:hAnsi="Times New Roman" w:cs="Times New Roman"/>
-        </w:rPr>
-      </w:pPr>
-      <w:r>
-        <w:rPr>
-          <w:rFonts w:ascii="Times New Roman" w:hAnsi="Times New Roman" w:cs="Times New Roman"/>
-        </w:rPr>
-        <w:t>ms-</w:t>
-      </w:r>
-      <w:proofErr w:type="spellStart"/>
-      <w:r>
-        <w:rPr>
-          <w:rFonts w:ascii="Times New Roman" w:hAnsi="Times New Roman" w:cs="Times New Roman"/>
-        </w:rPr>
-        <w:t>catalogos</w:t>
-      </w:r>
-      <w:proofErr w:type="spellEnd"/>
-    </w:p>
-    <w:p>
-      <w:pPr>
-        <w:pStyle w:val="Prrafodelista"/>
-        <w:numPr>
-          <w:ilvl w:val="0"/>
-          <w:numId w:val="20"/>
-        </w:numPr>
-        <w:rPr>
-          <w:rFonts w:ascii="Times New Roman" w:hAnsi="Times New Roman" w:cs="Times New Roman"/>
-        </w:rPr>
-      </w:pPr>
-      <w:r>
-        <w:rPr>
-          <w:rFonts w:ascii="Times New Roman" w:hAnsi="Times New Roman" w:cs="Times New Roman"/>
-        </w:rPr>
-        <w:t>ms-reportes</w:t>
-      </w:r>
-    </w:p>
-    <w:p>
-      <w:pPr>
-        <w:pStyle w:val="Prrafodelista"/>
-        <w:ind w:left="1440"/>
-        <w:rPr>
-          <w:rFonts w:ascii="Times New Roman" w:hAnsi="Times New Roman" w:cs="Times New Roman"/>
-          <w:b/>
-        </w:rPr>
-      </w:pPr>
-    </w:p>
-    <w:p>
-      <w:pPr>
-        <w:pStyle w:val="Prrafodelista"/>
-        <w:numPr>
-          <w:ilvl w:val="0"/>
-          <w:numId w:val="4"/>
-        </w:numPr>
-        <w:rPr>
-          <w:rFonts w:ascii="Times New Roman" w:hAnsi="Times New Roman" w:cs="Times New Roman"/>
-          <w:b/>
-        </w:rPr>
-      </w:pPr>
-      <w:r>
-        <w:rPr>
-          <w:rFonts w:ascii="Times New Roman" w:hAnsi="Times New Roman" w:cs="Times New Roman"/>
-          <w:b/>
-        </w:rPr>
-        <w:lastRenderedPageBreak/>
-        <w:t>Persistencia (</w:t>
-      </w:r>
-      <w:proofErr w:type="spellStart"/>
-      <w:r>
-        <w:rPr>
-          <w:rFonts w:ascii="Times New Roman" w:hAnsi="Times New Roman" w:cs="Times New Roman"/>
-          <w:b/>
-        </w:rPr>
-        <w:t>Database</w:t>
-      </w:r>
-      <w:proofErr w:type="spellEnd"/>
-      <w:r>
-        <w:rPr>
-          <w:rFonts w:ascii="Times New Roman" w:hAnsi="Times New Roman" w:cs="Times New Roman"/>
-          <w:b/>
-        </w:rPr>
-        <w:t xml:space="preserve"> per </w:t>
-      </w:r>
-      <w:proofErr w:type="spellStart"/>
-      <w:r>
-        <w:rPr>
-          <w:rFonts w:ascii="Times New Roman" w:hAnsi="Times New Roman" w:cs="Times New Roman"/>
-          <w:b/>
-        </w:rPr>
-        <w:t>Service</w:t>
-      </w:r>
-      <w:proofErr w:type="spellEnd"/>
-      <w:r>
-        <w:rPr>
-          <w:rFonts w:ascii="Times New Roman" w:hAnsi="Times New Roman" w:cs="Times New Roman"/>
-          <w:b/>
-        </w:rPr>
-        <w:t>):</w:t>
-      </w:r>
-    </w:p>
-    <w:p>
-      <w:pPr>
-        <w:pStyle w:val="Prrafodelista"/>
-        <w:numPr>
-          <w:ilvl w:val="0"/>
-          <w:numId w:val="21"/>
-        </w:numPr>
-        <w:rPr>
-          <w:rFonts w:ascii="Times New Roman" w:hAnsi="Times New Roman" w:cs="Times New Roman"/>
-        </w:rPr>
-      </w:pPr>
-      <w:proofErr w:type="spellStart"/>
-      <w:r>
-        <w:rPr>
-          <w:rFonts w:ascii="Times New Roman" w:hAnsi="Times New Roman" w:cs="Times New Roman"/>
-        </w:rPr>
-        <w:t>PostgreSQL</w:t>
-      </w:r>
-      <w:proofErr w:type="spellEnd"/>
-      <w:r>
-        <w:rPr>
-          <w:rFonts w:ascii="Times New Roman" w:hAnsi="Times New Roman" w:cs="Times New Roman"/>
-        </w:rPr>
-        <w:t xml:space="preserve"> (transaccional), </w:t>
-      </w:r>
-    </w:p>
-    <w:p>
-      <w:pPr>
-        <w:pStyle w:val="Prrafodelista"/>
-        <w:numPr>
-          <w:ilvl w:val="0"/>
-          <w:numId w:val="21"/>
-        </w:numPr>
-        <w:rPr>
-          <w:rFonts w:ascii="Times New Roman" w:hAnsi="Times New Roman" w:cs="Times New Roman"/>
-        </w:rPr>
-      </w:pPr>
-      <w:proofErr w:type="spellStart"/>
-      <w:r>
-        <w:rPr>
-          <w:rFonts w:ascii="Times New Roman" w:hAnsi="Times New Roman" w:cs="Times New Roman"/>
-        </w:rPr>
-        <w:t>MongoDB</w:t>
-      </w:r>
-      <w:proofErr w:type="spellEnd"/>
-      <w:r>
-        <w:rPr>
-          <w:rFonts w:ascii="Times New Roman" w:hAnsi="Times New Roman" w:cs="Times New Roman"/>
-        </w:rPr>
-        <w:t xml:space="preserve"> (documental), </w:t>
-      </w:r>
-    </w:p>
-    <w:p>
-      <w:pPr>
-        <w:pStyle w:val="Prrafodelista"/>
-        <w:numPr>
-          <w:ilvl w:val="0"/>
-          <w:numId w:val="21"/>
-        </w:numPr>
-        <w:rPr>
-          <w:rFonts w:ascii="Times New Roman" w:hAnsi="Times New Roman" w:cs="Times New Roman"/>
-        </w:rPr>
-      </w:pPr>
-      <w:proofErr w:type="spellStart"/>
-      <w:r>
-        <w:rPr>
-          <w:rFonts w:ascii="Times New Roman" w:hAnsi="Times New Roman" w:cs="Times New Roman"/>
-        </w:rPr>
-        <w:t>Redis</w:t>
-      </w:r>
-      <w:proofErr w:type="spellEnd"/>
-      <w:r>
-        <w:rPr>
-          <w:rFonts w:ascii="Times New Roman" w:hAnsi="Times New Roman" w:cs="Times New Roman"/>
-        </w:rPr>
-        <w:t xml:space="preserve"> (caché), </w:t>
-      </w:r>
-    </w:p>
-    <w:p>
-      <w:pPr>
-        <w:pStyle w:val="Prrafodelista"/>
-        <w:numPr>
-          <w:ilvl w:val="0"/>
-          <w:numId w:val="21"/>
-        </w:numPr>
-        <w:rPr>
-          <w:rFonts w:ascii="Times New Roman" w:hAnsi="Times New Roman" w:cs="Times New Roman"/>
-        </w:rPr>
-      </w:pPr>
-      <w:r>
-        <w:rPr>
-          <w:rFonts w:ascii="Times New Roman" w:hAnsi="Times New Roman" w:cs="Times New Roman"/>
-        </w:rPr>
-        <w:t>S3 (documentos).</w:t>
-      </w:r>
-    </w:p>
-    <w:p>
-      <w:pPr>
-        <w:pStyle w:val="Prrafodelista"/>
-        <w:ind w:left="1440"/>
-        <w:rPr>
-          <w:rFonts w:ascii="Times New Roman" w:hAnsi="Times New Roman" w:cs="Times New Roman"/>
-        </w:rPr>
-      </w:pPr>
-    </w:p>
-    <w:p>
-      <w:pPr>
-        <w:pStyle w:val="Prrafodelista"/>
-        <w:numPr>
-          <w:ilvl w:val="0"/>
-          <w:numId w:val="4"/>
-        </w:numPr>
-        <w:rPr>
-          <w:rFonts w:ascii="Times New Roman" w:hAnsi="Times New Roman" w:cs="Times New Roman"/>
-          <w:b/>
-        </w:rPr>
-      </w:pPr>
-      <w:r>
-        <w:rPr>
-          <w:rFonts w:ascii="Times New Roman" w:hAnsi="Times New Roman" w:cs="Times New Roman"/>
-          <w:b/>
-        </w:rPr>
-        <w:t xml:space="preserve">Mensajería: </w:t>
-      </w:r>
-      <w:r>
-        <w:rPr>
-          <w:rFonts w:ascii="Times New Roman" w:hAnsi="Times New Roman" w:cs="Times New Roman"/>
-        </w:rPr>
-        <w:t xml:space="preserve">Kafka como </w:t>
-      </w:r>
-      <w:proofErr w:type="spellStart"/>
-      <w:r>
-        <w:rPr>
-          <w:rFonts w:ascii="Times New Roman" w:hAnsi="Times New Roman" w:cs="Times New Roman"/>
-        </w:rPr>
-        <w:t>backbone</w:t>
-      </w:r>
-      <w:proofErr w:type="spellEnd"/>
-      <w:r>
-        <w:rPr>
-          <w:rFonts w:ascii="Times New Roman" w:hAnsi="Times New Roman" w:cs="Times New Roman"/>
-        </w:rPr>
-        <w:t xml:space="preserve"> de eventos</w:t>
-      </w:r>
-    </w:p>
-    <w:p>
-      <w:pPr>
-        <w:rPr>
-          <w:rFonts w:ascii="Times New Roman" w:hAnsi="Times New Roman" w:cs="Times New Roman"/>
-          <w:b/>
-        </w:rPr>
-      </w:pPr>
-    </w:p>
-    <w:p>
-      <w:pPr>
-        <w:rPr>
-          <w:rFonts w:ascii="Times New Roman" w:hAnsi="Times New Roman" w:cs="Times New Roman"/>
-          <w:b/>
-        </w:rPr>
-      </w:pPr>
-    </w:p>
-    <w:p>
-      <w:pPr>
-        <w:rPr>
-          <w:rFonts w:ascii="Times New Roman" w:hAnsi="Times New Roman" w:cs="Times New Roman"/>
-          <w:b/>
-        </w:rPr>
-      </w:pPr>
-    </w:p>
-    <w:p>
-      <w:pPr>
-        <w:rPr>
-          <w:rFonts w:ascii="Times New Roman" w:hAnsi="Times New Roman" w:cs="Times New Roman"/>
-          <w:b/>
-        </w:rPr>
-      </w:pPr>
-    </w:p>
-    <w:p>
-      <w:pPr>
-        <w:rPr>
-          <w:rFonts w:ascii="Times New Roman" w:hAnsi="Times New Roman" w:cs="Times New Roman"/>
-          <w:b/>
-        </w:rPr>
-      </w:pPr>
-    </w:p>
-    <w:p>
-      <w:pPr>
-        <w:rPr>
-          <w:rFonts w:ascii="Times New Roman" w:hAnsi="Times New Roman" w:cs="Times New Roman"/>
-          <w:b/>
-        </w:rPr>
-      </w:pPr>
-    </w:p>
-    <w:p>
-      <w:pPr>
-        <w:rPr>
-          <w:rFonts w:ascii="Times New Roman" w:hAnsi="Times New Roman" w:cs="Times New Roman"/>
-          <w:b/>
-        </w:rPr>
-      </w:pPr>
-    </w:p>
-    <w:p>
-      <w:pPr>
-        <w:rPr>
-          <w:rFonts w:ascii="Times New Roman" w:hAnsi="Times New Roman" w:cs="Times New Roman"/>
-          <w:b/>
-        </w:rPr>
-      </w:pPr>
-    </w:p>
-    <w:p>
-      <w:pPr>
-        <w:rPr>
-          <w:rFonts w:ascii="Times New Roman" w:hAnsi="Times New Roman" w:cs="Times New Roman"/>
-          <w:b/>
-        </w:rPr>
-      </w:pPr>
-    </w:p>
-    <w:p>
-      <w:pPr>
-        <w:rPr>
-          <w:rFonts w:ascii="Times New Roman" w:hAnsi="Times New Roman" w:cs="Times New Roman"/>
-          <w:b/>
-        </w:rPr>
-      </w:pPr>
-    </w:p>
-    <w:p>
-      <w:pPr>
-        <w:rPr>
-          <w:rFonts w:ascii="Times New Roman" w:hAnsi="Times New Roman" w:cs="Times New Roman"/>
-          <w:b/>
-        </w:rPr>
-      </w:pPr>
-    </w:p>
-    <w:p>
-      <w:pPr>
-        <w:rPr>
-          <w:rFonts w:ascii="Times New Roman" w:hAnsi="Times New Roman" w:cs="Times New Roman"/>
-          <w:b/>
-        </w:rPr>
-      </w:pPr>
-    </w:p>
-    <w:p>
-      <w:pPr>
-        <w:rPr>
-          <w:rFonts w:ascii="Times New Roman" w:hAnsi="Times New Roman" w:cs="Times New Roman"/>
-          <w:b/>
-        </w:rPr>
-      </w:pPr>
-    </w:p>
-    <w:p>
-      <w:pPr>
-        <w:rPr>
-          <w:rFonts w:ascii="Times New Roman" w:hAnsi="Times New Roman" w:cs="Times New Roman"/>
-          <w:b/>
-        </w:rPr>
-      </w:pPr>
-    </w:p>
-    <w:p>
-      <w:pPr>
-        <w:rPr>
-          <w:rFonts w:ascii="Times New Roman" w:hAnsi="Times New Roman" w:cs="Times New Roman"/>
-          <w:b/>
-        </w:rPr>
-      </w:pPr>
-    </w:p>
-    <w:p>
-      <w:pPr>
-        <w:rPr>
-          <w:rFonts w:ascii="Times New Roman" w:hAnsi="Times New Roman" w:cs="Times New Roman"/>
-          <w:b/>
-        </w:rPr>
-      </w:pPr>
-    </w:p>
-    <w:p>
-      <w:pPr>
-        <w:rPr>
-          <w:rFonts w:ascii="Times New Roman" w:hAnsi="Times New Roman" w:cs="Times New Roman"/>
-          <w:b/>
-        </w:rPr>
-      </w:pPr>
-    </w:p>
-    <w:p>
-      <w:pPr>
-        <w:rPr>
-          <w:rFonts w:ascii="Times New Roman" w:hAnsi="Times New Roman" w:cs="Times New Roman"/>
-          <w:b/>
-        </w:rPr>
-      </w:pPr>
-    </w:p>
-    <w:p>
-      <w:pPr>
-        <w:rPr>
-          <w:rFonts w:ascii="Times New Roman" w:hAnsi="Times New Roman" w:cs="Times New Roman"/>
-          <w:b/>
-        </w:rPr>
-      </w:pPr>
-    </w:p>
-    <w:p>
-      <w:pPr>
-        <w:jc w:val="center"/>
-        <w:rPr>
-          <w:rFonts w:ascii="Times New Roman" w:hAnsi="Times New Roman" w:cs="Times New Roman"/>
-          <w:b/>
-        </w:rPr>
-      </w:pPr>
-      <w:r>
-        <w:rPr>
-          <w:rFonts w:ascii="Times New Roman" w:hAnsi="Times New Roman" w:cs="Times New Roman"/>
-          <w:b/>
-          <w:noProof/>
-          <w:lang w:eastAsia="es-CO"/>
-        </w:rPr>
-        <w:lastRenderedPageBreak/>
-        <w:drawing>
-          <wp:anchor distT="0" distB="0" distL="114300" distR="114300" simplePos="0" relativeHeight="251659264" behindDoc="0" locked="0" layoutInCell="1" allowOverlap="1" wp14:anchorId="3B8A663C" wp14:editId="4780CE09">
-            <wp:simplePos x="0" y="0"/>
-            <wp:positionH relativeFrom="column">
-              <wp:posOffset>-822960</wp:posOffset>
-            </wp:positionH>
-            <wp:positionV relativeFrom="paragraph">
-              <wp:posOffset>357505</wp:posOffset>
-            </wp:positionV>
-            <wp:extent cx="7376795" cy="4476750"/>
-            <wp:effectExtent l="0" t="0" r="0" b="0"/>
-            <wp:wrapThrough wrapText="bothSides">
-              <wp:wrapPolygon edited="0">
-                <wp:start x="0" y="0"/>
-                <wp:lineTo x="0" y="21508"/>
-                <wp:lineTo x="21531" y="21508"/>
-                <wp:lineTo x="21531" y="0"/>
-                <wp:lineTo x="0" y="0"/>
-              </wp:wrapPolygon>
-            </wp:wrapThrough>
-            <wp:docPr id="2" name="Imagen 2" descr="C:\Users\USER\Desktop\Arquitectura_MS_EPS.png"/>
-            <wp:cNvGraphicFramePr>
-              <a:graphicFrameLocks xmlns:a="http://schemas.openxmlformats.org/drawingml/2006/main" noChangeAspect="1"/>
-            </wp:cNvGraphicFramePr>
-            <a:graphic xmlns:a="http://schemas.openxmlformats.org/drawingml/2006/main">
-              <a:graphicData uri="http://schemas.openxmlformats.org/drawingml/2006/picture">
-                <pic:pic xmlns:pic="http://schemas.openxmlformats.org/drawingml/2006/picture">
-                  <pic:nvPicPr>
-                    <pic:cNvPr id="0" name="Picture 1" descr="C:\Users\USER\Desktop\Arquitectura_MS_EPS.png"/>
-                    <pic:cNvPicPr>
-                      <a:picLocks noChangeAspect="1" noChangeArrowheads="1"/>
-                    </pic:cNvPicPr>
-                  </pic:nvPicPr>
-                  <pic:blipFill>
-                    <a:blip r:embed="rId7" cstate="print">
-                      <a:extLst>
-                        <a:ext uri="{28A0092B-C50C-407E-A947-70E740481C1C}">
-                          <a14:useLocalDpi xmlns:a14="http://schemas.microsoft.com/office/drawing/2010/main" val="0"/>
-                        </a:ext>
-                      </a:extLst>
-                    </a:blip>
-                    <a:srcRect/>
-                    <a:stretch>
-                      <a:fillRect/>
-                    </a:stretch>
-                  </pic:blipFill>
-                  <pic:spPr bwMode="auto">
-                    <a:xfrm>
-                      <a:off x="0" y="0"/>
-                      <a:ext cx="7376795" cy="4476750"/>
-                    </a:xfrm>
-                    <a:prstGeom prst="rect">
-                      <a:avLst/>
-                    </a:prstGeom>
-                    <a:noFill/>
-                    <a:ln>
-                      <a:noFill/>
-                    </a:ln>
-                  </pic:spPr>
-                </pic:pic>
-              </a:graphicData>
-            </a:graphic>
-            <wp14:sizeRelH relativeFrom="margin">
-              <wp14:pctWidth>0</wp14:pctWidth>
-            </wp14:sizeRelH>
-            <wp14:sizeRelV relativeFrom="margin">
-              <wp14:pctHeight>0</wp14:pctHeight>
-            </wp14:sizeRelV>
-          </wp:anchor>
-        </w:drawing>
-      </w:r>
-      <w:r>
-        <w:rPr>
-          <w:rFonts w:ascii="Times New Roman" w:hAnsi="Times New Roman" w:cs="Times New Roman"/>
-          <w:b/>
-        </w:rPr>
-        <w:t>4. Diagrama de la arquitectura (</w:t>
-      </w:r>
-      <w:proofErr w:type="spellStart"/>
-      <w:r>
-        <w:rPr>
-          <w:rFonts w:ascii="Times New Roman" w:hAnsi="Times New Roman" w:cs="Times New Roman"/>
-          <w:b/>
-        </w:rPr>
-        <w:t>PlantUML</w:t>
-      </w:r>
-      <w:proofErr w:type="spellEnd"/>
-      <w:r>
-        <w:rPr>
-          <w:rFonts w:ascii="Times New Roman" w:hAnsi="Times New Roman" w:cs="Times New Roman"/>
-          <w:b/>
-        </w:rPr>
-        <w:t>)</w:t>
-      </w:r>
-    </w:p>
-    <w:p>
-      <w:pPr>
-        <w:rPr>
-          <w:rFonts w:ascii="Times New Roman" w:hAnsi="Times New Roman" w:cs="Times New Roman"/>
-          <w:b/>
-        </w:rPr>
-      </w:pPr>
-    </w:p>
-    <w:p>
-      <w:pPr>
-        <w:rPr>
-          <w:rFonts w:ascii="Times New Roman" w:hAnsi="Times New Roman" w:cs="Times New Roman"/>
-          <w:b/>
-        </w:rPr>
-      </w:pPr>
-    </w:p>
-    <w:p>
-      <w:pPr>
-        <w:rPr>
-          <w:rFonts w:ascii="Times New Roman" w:hAnsi="Times New Roman" w:cs="Times New Roman"/>
-          <w:b/>
-        </w:rPr>
-      </w:pPr>
-    </w:p>
-    <w:p>
-      <w:pPr>
-        <w:rPr>
-          <w:rFonts w:ascii="Times New Roman" w:hAnsi="Times New Roman" w:cs="Times New Roman"/>
-          <w:b/>
-        </w:rPr>
-      </w:pPr>
-    </w:p>
-    <w:p>
-      <w:pPr>
-        <w:rPr>
-          <w:rFonts w:ascii="Times New Roman" w:hAnsi="Times New Roman" w:cs="Times New Roman"/>
-          <w:b/>
-        </w:rPr>
-      </w:pPr>
-    </w:p>
-    <w:p>
-      <w:pPr>
-        <w:rPr>
-          <w:rFonts w:ascii="Times New Roman" w:hAnsi="Times New Roman" w:cs="Times New Roman"/>
-          <w:b/>
-        </w:rPr>
-      </w:pPr>
-    </w:p>
-    <w:p>
-      <w:pPr>
-        <w:rPr>
-          <w:rFonts w:ascii="Times New Roman" w:hAnsi="Times New Roman" w:cs="Times New Roman"/>
-          <w:b/>
-        </w:rPr>
-      </w:pPr>
-    </w:p>
-    <w:p>
-      <w:pPr>
-        <w:rPr>
-          <w:rFonts w:ascii="Times New Roman" w:hAnsi="Times New Roman" w:cs="Times New Roman"/>
-          <w:b/>
-        </w:rPr>
-      </w:pPr>
-    </w:p>
-    <w:p>
-      <w:pPr>
-        <w:rPr>
-          <w:rFonts w:ascii="Times New Roman" w:hAnsi="Times New Roman" w:cs="Times New Roman"/>
-          <w:b/>
-        </w:rPr>
-      </w:pPr>
-    </w:p>
-    <w:p>
-      <w:pPr>
-        <w:jc w:val="center"/>
-        <w:rPr>
-          <w:rFonts w:ascii="Times New Roman" w:hAnsi="Times New Roman" w:cs="Times New Roman"/>
-          <w:b/>
-        </w:rPr>
-      </w:pPr>
-      <w:r>
-        <w:rPr>
-          <w:rFonts w:ascii="Times New Roman" w:hAnsi="Times New Roman" w:cs="Times New Roman"/>
-          <w:b/>
-        </w:rPr>
-        <w:lastRenderedPageBreak/>
-        <w:t xml:space="preserve">5. </w:t>
-      </w:r>
-      <w:r>
-        <w:rPr>
-          <w:rFonts w:ascii="Times New Roman" w:hAnsi="Times New Roman" w:cs="Times New Roman"/>
-          <w:b/>
-        </w:rPr>
-        <w:t>Justificación y Beneficios</w:t>
-      </w:r>
-      <w:r>
-        <w:rPr>
-          <w:rFonts w:ascii="Times New Roman" w:hAnsi="Times New Roman" w:cs="Times New Roman"/>
-          <w:b/>
-        </w:rPr>
-        <w:br/>
-      </w:r>
-    </w:p>
-    <w:p>
-      <w:pPr>
-        <w:jc w:val="left"/>
-        <w:rPr>
-          <w:rFonts w:ascii="Times New Roman" w:hAnsi="Times New Roman" w:cs="Times New Roman"/>
-          <w:b/>
-        </w:rPr>
-      </w:pPr>
-      <w:r>
-        <w:rPr>
-          <w:rFonts w:ascii="Times New Roman" w:hAnsi="Times New Roman" w:cs="Times New Roman"/>
-          <w:b/>
-        </w:rPr>
-        <w:t xml:space="preserve">5.1 </w:t>
-      </w:r>
-      <w:r>
-        <w:rPr>
-          <w:rFonts w:ascii="Times New Roman" w:hAnsi="Times New Roman" w:cs="Times New Roman"/>
-          <w:b/>
-        </w:rPr>
-        <w:t>Justificación</w:t>
-      </w:r>
-      <w:r>
-        <w:rPr>
-          <w:rFonts w:ascii="Times New Roman" w:hAnsi="Times New Roman" w:cs="Times New Roman"/>
-          <w:b/>
-        </w:rPr>
-        <w:t>:</w:t>
-      </w:r>
-    </w:p>
-    <w:p>
-      <w:pPr>
-        <w:ind w:firstLine="708"/>
-        <w:rPr>
-          <w:rFonts w:ascii="Times New Roman" w:hAnsi="Times New Roman" w:cs="Times New Roman"/>
-        </w:rPr>
-      </w:pPr>
-      <w:r>
-        <w:rPr>
-          <w:rFonts w:ascii="Times New Roman" w:hAnsi="Times New Roman" w:cs="Times New Roman"/>
-        </w:rPr>
-        <w:t xml:space="preserve">Las EPS operan en un entorno de alta complejidad: millones de afiliados, integración con prestadores, ADRES, </w:t>
-      </w:r>
-      <w:proofErr w:type="spellStart"/>
-      <w:r>
-        <w:rPr>
-          <w:rFonts w:ascii="Times New Roman" w:hAnsi="Times New Roman" w:cs="Times New Roman"/>
-        </w:rPr>
-        <w:t>Supersalud</w:t>
-      </w:r>
-      <w:proofErr w:type="spellEnd"/>
-      <w:r>
-        <w:rPr>
-          <w:rFonts w:ascii="Times New Roman" w:hAnsi="Times New Roman" w:cs="Times New Roman"/>
-        </w:rPr>
-        <w:t xml:space="preserve"> y otras entidades, además de estrictos requisitos normativos (Ley 1581 de 2012, Resolución 866 de 2017, estándares HL7 FHIR) y la necesidad de disponibilidad 24/7. Un sistema monolítico dificulta escalar áreas específicas, realizar despliegues sin afectar todo el sistema y mantener equip</w:t>
-      </w:r>
-      <w:r>
-        <w:rPr>
-          <w:rFonts w:ascii="Times New Roman" w:hAnsi="Times New Roman" w:cs="Times New Roman"/>
-        </w:rPr>
-        <w:t>os autónomos por dominio.</w:t>
-      </w:r>
-    </w:p>
-    <w:p>
-      <w:pPr>
-        <w:ind w:firstLine="708"/>
-        <w:rPr>
-          <w:rFonts w:ascii="Times New Roman" w:hAnsi="Times New Roman" w:cs="Times New Roman"/>
-        </w:rPr>
-      </w:pPr>
-      <w:r>
-        <w:rPr>
-          <w:rFonts w:ascii="Times New Roman" w:hAnsi="Times New Roman" w:cs="Times New Roman"/>
-        </w:rPr>
-        <w:t xml:space="preserve">Por ello, se propone una arquitectura de </w:t>
-      </w:r>
-      <w:proofErr w:type="spellStart"/>
-      <w:r>
-        <w:rPr>
-          <w:rFonts w:ascii="Times New Roman" w:hAnsi="Times New Roman" w:cs="Times New Roman"/>
-        </w:rPr>
-        <w:t>microservicios</w:t>
-      </w:r>
-      <w:proofErr w:type="spellEnd"/>
-      <w:r>
-        <w:rPr>
-          <w:rFonts w:ascii="Times New Roman" w:hAnsi="Times New Roman" w:cs="Times New Roman"/>
-        </w:rPr>
-        <w:t xml:space="preserve"> que divide el sistema en servicios independientes alineados a los dominios funcionales de la EPS (afiliación, autorizaciones, facturación, pagos, PQRS, entre otros). Cada servicio puede desplegarse, escalar y evolucionar de forma autónoma, se comunica mediante </w:t>
-      </w:r>
-      <w:proofErr w:type="spellStart"/>
-      <w:r>
-        <w:rPr>
-          <w:rFonts w:ascii="Times New Roman" w:hAnsi="Times New Roman" w:cs="Times New Roman"/>
-        </w:rPr>
-        <w:t>APIs</w:t>
-      </w:r>
-      <w:proofErr w:type="spellEnd"/>
-      <w:r>
-        <w:rPr>
-          <w:rFonts w:ascii="Times New Roman" w:hAnsi="Times New Roman" w:cs="Times New Roman"/>
-        </w:rPr>
-        <w:t xml:space="preserve"> (síncrono) y eventos (asíncrono) y administra su propia base de datos, evitando el acoplamiento entre áreas. El API Gateway centraliza la seguridad y el enrutamiento, mientras que el balanceador de carga garantiza alta disponibilidad desde el borde. Kafka desacopla los procesos de larga duración (notificaciones, analítica, auditoría), permitiendo que los servicios reaccionen a e</w:t>
-      </w:r>
-      <w:r>
-        <w:rPr>
-          <w:rFonts w:ascii="Times New Roman" w:hAnsi="Times New Roman" w:cs="Times New Roman"/>
-        </w:rPr>
-        <w:t>ventos sin bloquearse entre sí.</w:t>
-      </w:r>
-    </w:p>
-    <w:p>
-      <w:pPr>
-        <w:ind w:firstLine="708"/>
-        <w:rPr>
-          <w:rFonts w:ascii="Times New Roman" w:hAnsi="Times New Roman" w:cs="Times New Roman"/>
-        </w:rPr>
-      </w:pPr>
-      <w:r>
-        <w:rPr>
-          <w:rFonts w:ascii="Times New Roman" w:hAnsi="Times New Roman" w:cs="Times New Roman"/>
-        </w:rPr>
-        <w:t>En conjunto, esta arquitectura responde a las necesidades reales del negocio: escalabilidad por demanda, resiliencia ante fallos, integración con terceros, cumplimiento normativo y evolución tecnológica continua.</w:t>
-      </w:r>
-    </w:p>
-    <w:p>
-      <w:pPr>
-        <w:jc w:val="left"/>
-        <w:rPr>
-          <w:rFonts w:ascii="Times New Roman" w:hAnsi="Times New Roman" w:cs="Times New Roman"/>
-          <w:b/>
-        </w:rPr>
-      </w:pPr>
-      <w:r>
-        <w:rPr>
-          <w:rFonts w:ascii="Times New Roman" w:hAnsi="Times New Roman" w:cs="Times New Roman"/>
-          <w:b/>
-        </w:rPr>
-        <w:t>5.2 Beneficios</w:t>
-      </w:r>
-      <w:r>
-        <w:rPr>
-          <w:rFonts w:ascii="Times New Roman" w:hAnsi="Times New Roman" w:cs="Times New Roman"/>
-          <w:b/>
-        </w:rPr>
-        <w:t>:</w:t>
-      </w:r>
-    </w:p>
-    <w:p>
-      <w:pPr>
-        <w:pStyle w:val="Prrafodelista"/>
-        <w:numPr>
-          <w:ilvl w:val="0"/>
-          <w:numId w:val="22"/>
-        </w:numPr>
-        <w:jc w:val="left"/>
-        <w:rPr>
-          <w:rFonts w:ascii="Times New Roman" w:hAnsi="Times New Roman" w:cs="Times New Roman"/>
-        </w:rPr>
-      </w:pPr>
-      <w:r>
-        <w:rPr>
-          <w:rFonts w:ascii="Times New Roman" w:hAnsi="Times New Roman" w:cs="Times New Roman"/>
-          <w:b/>
-        </w:rPr>
-        <w:t>Escalabilidad independiente:</w:t>
-      </w:r>
-      <w:r>
-        <w:rPr>
-          <w:rFonts w:ascii="Times New Roman" w:hAnsi="Times New Roman" w:cs="Times New Roman"/>
-        </w:rPr>
-        <w:t xml:space="preserve"> cada </w:t>
-      </w:r>
-      <w:proofErr w:type="spellStart"/>
-      <w:r>
-        <w:rPr>
-          <w:rFonts w:ascii="Times New Roman" w:hAnsi="Times New Roman" w:cs="Times New Roman"/>
-        </w:rPr>
-        <w:t>microservicio</w:t>
-      </w:r>
-      <w:proofErr w:type="spellEnd"/>
-      <w:r>
-        <w:rPr>
-          <w:rFonts w:ascii="Times New Roman" w:hAnsi="Times New Roman" w:cs="Times New Roman"/>
-        </w:rPr>
-        <w:t xml:space="preserve"> escala según su propia demanda, sin sobredimensionar todo el sistema.</w:t>
-      </w:r>
-    </w:p>
-    <w:p>
-      <w:pPr>
-        <w:pStyle w:val="Prrafodelista"/>
-        <w:numPr>
-          <w:ilvl w:val="0"/>
-          <w:numId w:val="22"/>
-        </w:numPr>
-        <w:jc w:val="left"/>
-        <w:rPr>
-          <w:rFonts w:ascii="Times New Roman" w:hAnsi="Times New Roman" w:cs="Times New Roman"/>
-        </w:rPr>
-      </w:pPr>
-      <w:r>
-        <w:rPr>
-          <w:rFonts w:ascii="Times New Roman" w:hAnsi="Times New Roman" w:cs="Times New Roman"/>
-          <w:b/>
-        </w:rPr>
-        <w:t>Alta disponibilidad:</w:t>
-      </w:r>
-      <w:r>
-        <w:rPr>
-          <w:rFonts w:ascii="Times New Roman" w:hAnsi="Times New Roman" w:cs="Times New Roman"/>
-        </w:rPr>
-        <w:t xml:space="preserve"> el balanceador y el API Gateway pueden replicarse; Kafka y las bases de datos cuentan con redundancia.</w:t>
-      </w:r>
-    </w:p>
-    <w:p>
-      <w:pPr>
-        <w:pStyle w:val="Prrafodelista"/>
-        <w:numPr>
-          <w:ilvl w:val="0"/>
-          <w:numId w:val="22"/>
-        </w:numPr>
-        <w:jc w:val="left"/>
-        <w:rPr>
-          <w:rFonts w:ascii="Times New Roman" w:hAnsi="Times New Roman" w:cs="Times New Roman"/>
-        </w:rPr>
-      </w:pPr>
-      <w:r>
-        <w:rPr>
-          <w:rFonts w:ascii="Times New Roman" w:hAnsi="Times New Roman" w:cs="Times New Roman"/>
-          <w:b/>
-        </w:rPr>
-        <w:t>Desacoplamiento:</w:t>
-      </w:r>
-      <w:r>
-        <w:rPr>
-          <w:rFonts w:ascii="Times New Roman" w:hAnsi="Times New Roman" w:cs="Times New Roman"/>
-        </w:rPr>
-        <w:t xml:space="preserve"> los servicios se comunican por </w:t>
-      </w:r>
-      <w:proofErr w:type="spellStart"/>
-      <w:r>
-        <w:rPr>
-          <w:rFonts w:ascii="Times New Roman" w:hAnsi="Times New Roman" w:cs="Times New Roman"/>
-        </w:rPr>
-        <w:t>APIs</w:t>
-      </w:r>
-      <w:proofErr w:type="spellEnd"/>
-      <w:r>
-        <w:rPr>
-          <w:rFonts w:ascii="Times New Roman" w:hAnsi="Times New Roman" w:cs="Times New Roman"/>
-        </w:rPr>
-        <w:t xml:space="preserve"> y eventos, no por acceso directo a bases de datos ajenas.</w:t>
-      </w:r>
-    </w:p>
-    <w:p>
-      <w:pPr>
-        <w:pStyle w:val="Prrafodelista"/>
-        <w:numPr>
-          <w:ilvl w:val="0"/>
-          <w:numId w:val="22"/>
-        </w:numPr>
-        <w:jc w:val="left"/>
-        <w:rPr>
-          <w:rFonts w:ascii="Times New Roman" w:hAnsi="Times New Roman" w:cs="Times New Roman"/>
-        </w:rPr>
-      </w:pPr>
-      <w:r>
-        <w:rPr>
-          <w:rFonts w:ascii="Times New Roman" w:hAnsi="Times New Roman" w:cs="Times New Roman"/>
-          <w:b/>
-        </w:rPr>
-        <w:t xml:space="preserve">Mantenibilidad: </w:t>
-      </w:r>
-      <w:r>
-        <w:rPr>
-          <w:rFonts w:ascii="Times New Roman" w:hAnsi="Times New Roman" w:cs="Times New Roman"/>
-        </w:rPr>
-        <w:t xml:space="preserve">cada equipo puede modificar y desplegar su </w:t>
-      </w:r>
-      <w:proofErr w:type="spellStart"/>
-      <w:r>
-        <w:rPr>
-          <w:rFonts w:ascii="Times New Roman" w:hAnsi="Times New Roman" w:cs="Times New Roman"/>
-        </w:rPr>
-        <w:t>microservicio</w:t>
-      </w:r>
-      <w:proofErr w:type="spellEnd"/>
-      <w:r>
-        <w:rPr>
-          <w:rFonts w:ascii="Times New Roman" w:hAnsi="Times New Roman" w:cs="Times New Roman"/>
-        </w:rPr>
-        <w:t xml:space="preserve"> sin afectar a los demás.</w:t>
-      </w:r>
-    </w:p>
-    <w:p>
-      <w:pPr>
-        <w:pStyle w:val="Prrafodelista"/>
-        <w:numPr>
-          <w:ilvl w:val="0"/>
-          <w:numId w:val="22"/>
-        </w:numPr>
-        <w:jc w:val="left"/>
-        <w:rPr>
-          <w:rFonts w:ascii="Times New Roman" w:hAnsi="Times New Roman" w:cs="Times New Roman"/>
-        </w:rPr>
-      </w:pPr>
-      <w:r>
-        <w:rPr>
-          <w:rFonts w:ascii="Times New Roman" w:hAnsi="Times New Roman" w:cs="Times New Roman"/>
-          <w:b/>
-        </w:rPr>
-        <w:t>Seguridad centralizada:</w:t>
-      </w:r>
-      <w:r>
-        <w:rPr>
-          <w:rFonts w:ascii="Times New Roman" w:hAnsi="Times New Roman" w:cs="Times New Roman"/>
-        </w:rPr>
-        <w:t xml:space="preserve"> autenticación, autorización y auditoría se gestionan en el API Gateway.</w:t>
-      </w:r>
-    </w:p>
-    <w:p>
-      <w:pPr>
-        <w:pStyle w:val="Prrafodelista"/>
-        <w:numPr>
-          <w:ilvl w:val="0"/>
-          <w:numId w:val="22"/>
-        </w:numPr>
-        <w:jc w:val="left"/>
-        <w:rPr>
-          <w:rFonts w:ascii="Times New Roman" w:hAnsi="Times New Roman" w:cs="Times New Roman"/>
-        </w:rPr>
-      </w:pPr>
-      <w:r>
-        <w:rPr>
-          <w:rFonts w:ascii="Times New Roman" w:hAnsi="Times New Roman" w:cs="Times New Roman"/>
-          <w:b/>
-        </w:rPr>
-        <w:t>Trazabilidad:</w:t>
-      </w:r>
-      <w:r>
-        <w:rPr>
-          <w:rFonts w:ascii="Times New Roman" w:hAnsi="Times New Roman" w:cs="Times New Roman"/>
-        </w:rPr>
-        <w:t xml:space="preserve"> los eventos publicados en Kafka permiten reconstruir el flujo completo de un proceso.</w:t>
-      </w:r>
-    </w:p>
-    <w:p>
-      <w:pPr>
-        <w:pStyle w:val="Prrafodelista"/>
-        <w:numPr>
-          <w:ilvl w:val="0"/>
-          <w:numId w:val="22"/>
-        </w:numPr>
-        <w:jc w:val="left"/>
-        <w:rPr>
-          <w:rFonts w:ascii="Times New Roman" w:hAnsi="Times New Roman" w:cs="Times New Roman"/>
-        </w:rPr>
-      </w:pPr>
-      <w:r>
-        <w:rPr>
-          <w:rFonts w:ascii="Times New Roman" w:hAnsi="Times New Roman" w:cs="Times New Roman"/>
-          <w:b/>
-        </w:rPr>
-        <w:t>Resiliencia:</w:t>
-      </w:r>
-      <w:r>
-        <w:rPr>
-          <w:rFonts w:ascii="Times New Roman" w:hAnsi="Times New Roman" w:cs="Times New Roman"/>
-        </w:rPr>
-        <w:t xml:space="preserve"> el uso de </w:t>
-      </w:r>
-      <w:proofErr w:type="spellStart"/>
-      <w:r>
-        <w:rPr>
-          <w:rFonts w:ascii="Times New Roman" w:hAnsi="Times New Roman" w:cs="Times New Roman"/>
-        </w:rPr>
-        <w:t>Circuit</w:t>
-      </w:r>
-      <w:proofErr w:type="spellEnd"/>
-      <w:r>
-        <w:rPr>
-          <w:rFonts w:ascii="Times New Roman" w:hAnsi="Times New Roman" w:cs="Times New Roman"/>
-        </w:rPr>
-        <w:t xml:space="preserve"> </w:t>
-      </w:r>
-      <w:proofErr w:type="spellStart"/>
-      <w:r>
-        <w:rPr>
-          <w:rFonts w:ascii="Times New Roman" w:hAnsi="Times New Roman" w:cs="Times New Roman"/>
-        </w:rPr>
-        <w:t>Breaker</w:t>
-      </w:r>
-      <w:proofErr w:type="spellEnd"/>
-      <w:r>
-        <w:rPr>
-          <w:rFonts w:ascii="Times New Roman" w:hAnsi="Times New Roman" w:cs="Times New Roman"/>
-        </w:rPr>
-        <w:t xml:space="preserve"> y mensajería asíncrona evita que un fallo se propague.</w:t>
-      </w:r>
-    </w:p>
-    <w:p>
-      <w:pPr>
-        <w:pStyle w:val="Prrafodelista"/>
-        <w:numPr>
-          <w:ilvl w:val="0"/>
-          <w:numId w:val="24"/>
-        </w:numPr>
-        <w:jc w:val="center"/>
-        <w:rPr>
-          <w:rFonts w:ascii="Times New Roman" w:hAnsi="Times New Roman" w:cs="Times New Roman"/>
-          <w:b/>
-        </w:rPr>
-      </w:pPr>
-      <w:bookmarkStart w:id="0" w:name="_GoBack"/>
-      <w:r>
-        <w:rPr>
-          <w:rFonts w:ascii="Times New Roman" w:hAnsi="Times New Roman" w:cs="Times New Roman"/>
-          <w:b/>
-        </w:rPr>
-        <w:lastRenderedPageBreak/>
-        <w:t>Referencias</w:t>
-      </w:r>
-    </w:p>
-    <w:bookmarkEnd w:id="0"/>
-    <w:p>
-      <w:pPr>
-        <w:pStyle w:val="Prrafodelista"/>
-        <w:numPr>
-          <w:ilvl w:val="0"/>
-          <w:numId w:val="23"/>
-        </w:numPr>
-        <w:jc w:val="left"/>
-        <w:rPr>
-          <w:rFonts w:ascii="Times New Roman" w:hAnsi="Times New Roman" w:cs="Times New Roman"/>
-          <w:lang w:val="en-US"/>
-        </w:rPr>
-      </w:pPr>
-      <w:r>
-        <w:rPr>
-          <w:rFonts w:ascii="Times New Roman" w:hAnsi="Times New Roman" w:cs="Times New Roman"/>
-          <w:lang w:val="en-US"/>
-        </w:rPr>
-        <w:t>Newman, S. (2021). Bu</w:t>
-      </w:r>
-      <w:r>
-        <w:rPr>
-          <w:rFonts w:ascii="Times New Roman" w:hAnsi="Times New Roman" w:cs="Times New Roman"/>
-          <w:lang w:val="en-US"/>
-        </w:rPr>
-        <w:t xml:space="preserve">ilding </w:t>
-      </w:r>
-      <w:proofErr w:type="spellStart"/>
-      <w:r>
-        <w:rPr>
-          <w:rFonts w:ascii="Times New Roman" w:hAnsi="Times New Roman" w:cs="Times New Roman"/>
-          <w:lang w:val="en-US"/>
-        </w:rPr>
-        <w:t>Microservices</w:t>
-      </w:r>
-      <w:proofErr w:type="spellEnd"/>
-      <w:r>
-        <w:rPr>
-          <w:rFonts w:ascii="Times New Roman" w:hAnsi="Times New Roman" w:cs="Times New Roman"/>
-          <w:lang w:val="en-US"/>
-        </w:rPr>
-        <w:t>. O'Reilly.</w:t>
-      </w:r>
-    </w:p>
-    <w:p>
-      <w:pPr>
-        <w:pStyle w:val="Prrafodelista"/>
-        <w:numPr>
-          <w:ilvl w:val="0"/>
-          <w:numId w:val="23"/>
-        </w:numPr>
-        <w:jc w:val="left"/>
-        <w:rPr>
-          <w:rFonts w:ascii="Times New Roman" w:hAnsi="Times New Roman" w:cs="Times New Roman"/>
-        </w:rPr>
-      </w:pPr>
-      <w:r>
-        <w:rPr>
-          <w:rFonts w:ascii="Times New Roman" w:hAnsi="Times New Roman" w:cs="Times New Roman"/>
-          <w:lang w:val="en-US"/>
-        </w:rPr>
-        <w:t xml:space="preserve">Richardson, C. (2019). </w:t>
-      </w:r>
-      <w:proofErr w:type="spellStart"/>
-      <w:r>
-        <w:rPr>
-          <w:rFonts w:ascii="Times New Roman" w:hAnsi="Times New Roman" w:cs="Times New Roman"/>
-          <w:lang w:val="en-US"/>
-        </w:rPr>
-        <w:t>Microservices</w:t>
-      </w:r>
-      <w:proofErr w:type="spellEnd"/>
-      <w:r>
-        <w:rPr>
-          <w:rFonts w:ascii="Times New Roman" w:hAnsi="Times New Roman" w:cs="Times New Roman"/>
-          <w:lang w:val="en-US"/>
-        </w:rPr>
-        <w:t xml:space="preserve"> Patterns. </w:t>
-      </w:r>
-      <w:proofErr w:type="spellStart"/>
-      <w:r>
-        <w:rPr>
-          <w:rFonts w:ascii="Times New Roman" w:hAnsi="Times New Roman" w:cs="Times New Roman"/>
-        </w:rPr>
-        <w:t>Manning</w:t>
-      </w:r>
-      <w:proofErr w:type="spellEnd"/>
-      <w:r>
-        <w:rPr>
-          <w:rFonts w:ascii="Times New Roman" w:hAnsi="Times New Roman" w:cs="Times New Roman"/>
-        </w:rPr>
         <w:t>.</w:t>
       </w:r>
-    </w:p>
-    <w:p>
-      <w:pPr>
-        <w:pStyle w:val="Prrafodelista"/>
-        <w:numPr>
-          <w:ilvl w:val="0"/>
-          <w:numId w:val="23"/>
-        </w:numPr>
-        <w:jc w:val="left"/>
-        <w:rPr>
-          <w:rFonts w:ascii="Times New Roman" w:hAnsi="Times New Roman" w:cs="Times New Roman"/>
-        </w:rPr>
-      </w:pPr>
-      <w:r>
-        <w:rPr>
-          <w:rFonts w:ascii="Times New Roman" w:hAnsi="Times New Roman" w:cs="Times New Roman"/>
-        </w:rPr>
-        <w:t>Ley 1581 de 2012 · Res</w:t>
-      </w:r>
-      <w:r>
-        <w:rPr>
-          <w:rFonts w:ascii="Times New Roman" w:hAnsi="Times New Roman" w:cs="Times New Roman"/>
-        </w:rPr>
-        <w:t>olución 866 de 2017 (Colombia).</w:t>
-      </w:r>
-    </w:p>
-    <w:p>
-      <w:pPr>
-        <w:pStyle w:val="Prrafodelista"/>
-        <w:numPr>
-          <w:ilvl w:val="0"/>
-          <w:numId w:val="23"/>
-        </w:numPr>
-        <w:jc w:val="left"/>
-        <w:rPr>
-          <w:rFonts w:ascii="Times New Roman" w:hAnsi="Times New Roman" w:cs="Times New Roman"/>
-        </w:rPr>
-      </w:pPr>
-      <w:proofErr w:type="spellStart"/>
-      <w:r>
-        <w:rPr>
-          <w:rFonts w:ascii="Times New Roman" w:hAnsi="Times New Roman" w:cs="Times New Roman"/>
-        </w:rPr>
-        <w:t>PlantUML</w:t>
-      </w:r>
-      <w:proofErr w:type="spellEnd"/>
-      <w:r>
-        <w:rPr>
-          <w:rFonts w:ascii="Times New Roman" w:hAnsi="Times New Roman" w:cs="Times New Roman"/>
-        </w:rPr>
-        <w:t>: https://plantuml.com</w:t>
-      </w:r>
-    </w:p>
-    <w:p>
-      <w:pPr>
-        <w:jc w:val="left"/>
-        <w:rPr>
-          <w:rFonts w:ascii="Times New Roman" w:hAnsi="Times New Roman" w:cs="Times New Roman"/>
-          <w:b/>
-        </w:rPr>
-      </w:pPr>
-    </w:p>
-    <w:p>
-      <w:pPr>
-        <w:jc w:val="left"/>
-        <w:rPr>
-          <w:rFonts w:ascii="Times New Roman" w:hAnsi="Times New Roman" w:cs="Times New Roman"/>
-          <w:b/>
-        </w:rPr>
-      </w:pPr>
     </w:p>
     <w:p>
       <w:pPr>
@@ -4005,6 +2848,95 @@
     </w:lvl>
   </w:abstractNum>
   <w:abstractNum w:abstractNumId="11" w15:restartNumberingAfterBreak="0">
+    <w:nsid w:val="2A08428A"/>
+    <w:multiLevelType w:val="hybridMultilevel"/>
+    <w:tmpl w:val="66DC6FD0"/>
+    <w:lvl w:ilvl="0" w:tplc="240A000F">
+      <w:start w:val="3"/>
+      <w:numFmt w:val="decimal"/>
+      <w:lvlText w:val="%1."/>
+      <w:lvlJc w:val="left"/>
+      <w:pPr>
+        <w:ind w:left="720" w:hanging="360"/>
+      </w:pPr>
+      <w:rPr>
+        <w:rFonts w:hint="default"/>
+      </w:rPr>
+    </w:lvl>
+    <w:lvl w:ilvl="1" w:tplc="240A0019" w:tentative="1">
+      <w:start w:val="1"/>
+      <w:numFmt w:val="lowerLetter"/>
+      <w:lvlText w:val="%2."/>
+      <w:lvlJc w:val="left"/>
+      <w:pPr>
+        <w:ind w:left="1440" w:hanging="360"/>
+      </w:pPr>
+    </w:lvl>
+    <w:lvl w:ilvl="2" w:tplc="240A001B" w:tentative="1">
+      <w:start w:val="1"/>
+      <w:numFmt w:val="lowerRoman"/>
+      <w:lvlText w:val="%3."/>
+      <w:lvlJc w:val="right"/>
+      <w:pPr>
+        <w:ind w:left="2160" w:hanging="180"/>
+      </w:pPr>
+    </w:lvl>
+    <w:lvl w:ilvl="3" w:tplc="240A000F" w:tentative="1">
+      <w:start w:val="1"/>
+      <w:numFmt w:val="decimal"/>
+      <w:lvlText w:val="%4."/>
+      <w:lvlJc w:val="left"/>
+      <w:pPr>
+        <w:ind w:left="2880" w:hanging="360"/>
+      </w:pPr>
+    </w:lvl>
+    <w:lvl w:ilvl="4" w:tplc="240A0019" w:tentative="1">
+      <w:start w:val="1"/>
+      <w:numFmt w:val="lowerLetter"/>
+      <w:lvlText w:val="%5."/>
+      <w:lvlJc w:val="left"/>
+      <w:pPr>
+        <w:ind w:left="3600" w:hanging="360"/>
+      </w:pPr>
+    </w:lvl>
+    <w:lvl w:ilvl="5" w:tplc="240A001B" w:tentative="1">
+      <w:start w:val="1"/>
+      <w:numFmt w:val="lowerRoman"/>
+      <w:lvlText w:val="%6."/>
+      <w:lvlJc w:val="right"/>
+      <w:pPr>
+        <w:ind w:left="4320" w:hanging="180"/>
+      </w:pPr>
+    </w:lvl>
+    <w:lvl w:ilvl="6" w:tplc="240A000F" w:tentative="1">
+      <w:start w:val="1"/>
+      <w:numFmt w:val="decimal"/>
+      <w:lvlText w:val="%7."/>
+      <w:lvlJc w:val="left"/>
+      <w:pPr>
+        <w:ind w:left="5040" w:hanging="360"/>
+      </w:pPr>
+    </w:lvl>
+    <w:lvl w:ilvl="7" w:tplc="240A0019" w:tentative="1">
+      <w:start w:val="1"/>
+      <w:numFmt w:val="lowerLetter"/>
+      <w:lvlText w:val="%8."/>
+      <w:lvlJc w:val="left"/>
+      <w:pPr>
+        <w:ind w:left="5760" w:hanging="360"/>
+      </w:pPr>
+    </w:lvl>
+    <w:lvl w:ilvl="8" w:tplc="240A001B" w:tentative="1">
+      <w:start w:val="1"/>
+      <w:numFmt w:val="lowerRoman"/>
+      <w:lvlText w:val="%9."/>
+      <w:lvlJc w:val="right"/>
+      <w:pPr>
+        <w:ind w:left="6480" w:hanging="180"/>
+      </w:pPr>
+    </w:lvl>
+  </w:abstractNum>
+  <w:abstractNum w:abstractNumId="12" w15:restartNumberingAfterBreak="0">
     <w:nsid w:val="379B692B"/>
     <w:multiLevelType w:val="hybridMultilevel"/>
     <w:tmpl w:val="C3BEC16C"/>
@@ -4117,7 +3049,7 @@
       </w:rPr>
     </w:lvl>
   </w:abstractNum>
-  <w:abstractNum w:abstractNumId="12" w15:restartNumberingAfterBreak="0">
+  <w:abstractNum w:abstractNumId="13" w15:restartNumberingAfterBreak="0">
     <w:nsid w:val="3D7730A2"/>
     <w:multiLevelType w:val="hybridMultilevel"/>
     <w:tmpl w:val="FA7E7304"/>
@@ -4230,7 +3162,7 @@
       </w:rPr>
     </w:lvl>
   </w:abstractNum>
-  <w:abstractNum w:abstractNumId="13" w15:restartNumberingAfterBreak="0">
+  <w:abstractNum w:abstractNumId="14" w15:restartNumberingAfterBreak="0">
     <w:nsid w:val="431E0ED3"/>
     <w:multiLevelType w:val="hybridMultilevel"/>
     <w:tmpl w:val="BE30E13C"/>
@@ -4343,7 +3275,7 @@
       </w:rPr>
     </w:lvl>
   </w:abstractNum>
-  <w:abstractNum w:abstractNumId="14" w15:restartNumberingAfterBreak="0">
+  <w:abstractNum w:abstractNumId="15" w15:restartNumberingAfterBreak="0">
     <w:nsid w:val="462C5680"/>
     <w:multiLevelType w:val="hybridMultilevel"/>
     <w:tmpl w:val="90104FC6"/>
@@ -4432,7 +3364,7 @@
       </w:pPr>
     </w:lvl>
   </w:abstractNum>
-  <w:abstractNum w:abstractNumId="15" w15:restartNumberingAfterBreak="0">
+  <w:abstractNum w:abstractNumId="16" w15:restartNumberingAfterBreak="0">
     <w:nsid w:val="4A05589F"/>
     <w:multiLevelType w:val="hybridMultilevel"/>
     <w:tmpl w:val="1840AABC"/>
@@ -4545,7 +3477,7 @@
       </w:rPr>
     </w:lvl>
   </w:abstractNum>
-  <w:abstractNum w:abstractNumId="16" w15:restartNumberingAfterBreak="0">
+  <w:abstractNum w:abstractNumId="17" w15:restartNumberingAfterBreak="0">
     <w:nsid w:val="4D0866A6"/>
     <w:multiLevelType w:val="hybridMultilevel"/>
     <w:tmpl w:val="8D96510E"/>
@@ -4658,7 +3590,7 @@
       </w:rPr>
     </w:lvl>
   </w:abstractNum>
-  <w:abstractNum w:abstractNumId="17" w15:restartNumberingAfterBreak="0">
+  <w:abstractNum w:abstractNumId="18" w15:restartNumberingAfterBreak="0">
     <w:nsid w:val="4D822FC0"/>
     <w:multiLevelType w:val="hybridMultilevel"/>
     <w:tmpl w:val="4D2ADA8E"/>
@@ -4771,7 +3703,7 @@
       </w:rPr>
     </w:lvl>
   </w:abstractNum>
-  <w:abstractNum w:abstractNumId="18" w15:restartNumberingAfterBreak="0">
+  <w:abstractNum w:abstractNumId="19" w15:restartNumberingAfterBreak="0">
     <w:nsid w:val="5344190C"/>
     <w:multiLevelType w:val="hybridMultilevel"/>
     <w:tmpl w:val="76389C8E"/>
@@ -4884,7 +3816,7 @@
       </w:rPr>
     </w:lvl>
   </w:abstractNum>
-  <w:abstractNum w:abstractNumId="19" w15:restartNumberingAfterBreak="0">
+  <w:abstractNum w:abstractNumId="20" w15:restartNumberingAfterBreak="0">
     <w:nsid w:val="603E6B77"/>
     <w:multiLevelType w:val="hybridMultilevel"/>
     <w:tmpl w:val="ECC6205C"/>
@@ -4997,7 +3929,7 @@
       </w:rPr>
     </w:lvl>
   </w:abstractNum>
-  <w:abstractNum w:abstractNumId="20" w15:restartNumberingAfterBreak="0">
+  <w:abstractNum w:abstractNumId="21" w15:restartNumberingAfterBreak="0">
     <w:nsid w:val="65831DE8"/>
     <w:multiLevelType w:val="hybridMultilevel"/>
     <w:tmpl w:val="0A0CB3E2"/>
@@ -5110,7 +4042,7 @@
       </w:rPr>
     </w:lvl>
   </w:abstractNum>
-  <w:abstractNum w:abstractNumId="21" w15:restartNumberingAfterBreak="0">
+  <w:abstractNum w:abstractNumId="22" w15:restartNumberingAfterBreak="0">
     <w:nsid w:val="6A910436"/>
     <w:multiLevelType w:val="hybridMultilevel"/>
     <w:tmpl w:val="D85016E2"/>
@@ -5223,7 +4155,7 @@
       </w:rPr>
     </w:lvl>
   </w:abstractNum>
-  <w:abstractNum w:abstractNumId="22" w15:restartNumberingAfterBreak="0">
+  <w:abstractNum w:abstractNumId="23" w15:restartNumberingAfterBreak="0">
     <w:nsid w:val="6B527196"/>
     <w:multiLevelType w:val="hybridMultilevel"/>
     <w:tmpl w:val="CA4A20F2"/>
@@ -5309,7 +4241,7 @@
       </w:pPr>
     </w:lvl>
   </w:abstractNum>
-  <w:abstractNum w:abstractNumId="23" w15:restartNumberingAfterBreak="0">
+  <w:abstractNum w:abstractNumId="24" w15:restartNumberingAfterBreak="0">
     <w:nsid w:val="7F954D94"/>
     <w:multiLevelType w:val="hybridMultilevel"/>
     <w:tmpl w:val="D1903DAA"/>
@@ -5429,7 +4361,7 @@
     <w:abstractNumId w:val="9"/>
   </w:num>
   <w:num w:numId="3">
-    <w:abstractNumId w:val="22"/>
+    <w:abstractNumId w:val="23"/>
   </w:num>
   <w:num w:numId="4">
     <w:abstractNumId w:val="5"/>
@@ -5438,7 +4370,7 @@
     <w:abstractNumId w:val="10"/>
   </w:num>
   <w:num w:numId="6">
-    <w:abstractNumId w:val="11"/>
+    <w:abstractNumId w:val="12"/>
   </w:num>
   <w:num w:numId="7">
     <w:abstractNumId w:val="6"/>
@@ -5447,19 +4379,19 @@
     <w:abstractNumId w:val="7"/>
   </w:num>
   <w:num w:numId="9">
-    <w:abstractNumId w:val="18"/>
+    <w:abstractNumId w:val="19"/>
   </w:num>
   <w:num w:numId="10">
-    <w:abstractNumId w:val="21"/>
+    <w:abstractNumId w:val="22"/>
   </w:num>
   <w:num w:numId="11">
-    <w:abstractNumId w:val="19"/>
+    <w:abstractNumId w:val="20"/>
   </w:num>
   <w:num w:numId="12">
     <w:abstractNumId w:val="8"/>
   </w:num>
   <w:num w:numId="13">
-    <w:abstractNumId w:val="20"/>
+    <w:abstractNumId w:val="21"/>
   </w:num>
   <w:num w:numId="14">
     <w:abstractNumId w:val="1"/>
@@ -5468,16 +4400,16 @@
     <w:abstractNumId w:val="2"/>
   </w:num>
   <w:num w:numId="16">
-    <w:abstractNumId w:val="23"/>
+    <w:abstractNumId w:val="24"/>
   </w:num>
   <w:num w:numId="17">
-    <w:abstractNumId w:val="12"/>
+    <w:abstractNumId w:val="13"/>
   </w:num>
   <w:num w:numId="18">
-    <w:abstractNumId w:val="16"/>
+    <w:abstractNumId w:val="17"/>
   </w:num>
   <w:num w:numId="19">
-    <w:abstractNumId w:val="15"/>
+    <w:abstractNumId w:val="16"/>
   </w:num>
   <w:num w:numId="20">
     <w:abstractNumId w:val="4"/>
@@ -5486,13 +4418,16 @@
     <w:abstractNumId w:val="3"/>
   </w:num>
   <w:num w:numId="22">
-    <w:abstractNumId w:val="13"/>
+    <w:abstractNumId w:val="14"/>
   </w:num>
   <w:num w:numId="23">
-    <w:abstractNumId w:val="17"/>
+    <w:abstractNumId w:val="18"/>
   </w:num>
   <w:num w:numId="24">
-    <w:abstractNumId w:val="14"/>
+    <w:abstractNumId w:val="15"/>
+  </w:num>
+  <w:num w:numId="25">
+    <w:abstractNumId w:val="11"/>
   </w:num>
 </w:numbering>
 </file>
@@ -6210,7 +5145,7 @@
 </file>
 
 <file path=customXml/itemProps1.xml><?xml version="1.0" encoding="utf-8"?>
-<ds:datastoreItem xmlns:ds="http://schemas.openxmlformats.org/officeDocument/2006/customXml" ds:itemID="{2E0C93BA-C16F-46A9-BF64-2FFE21E23540}">
+<ds:datastoreItem xmlns:ds="http://schemas.openxmlformats.org/officeDocument/2006/customXml" ds:itemID="{7BBD543B-3655-424A-950C-8BB9CBB82814}">
   <ds:schemaRefs>
     <ds:schemaRef ds:uri="http://schemas.openxmlformats.org/officeDocument/2006/bibliography"/>
   </ds:schemaRefs>

</xml_diff>

<commit_message>
Estructura base de microservicios de la EPS en main
</commit_message>
<xml_diff>
--- a/EstructuraMicroservicios_EPS.docx
+++ b/EstructuraMicroservicios_EPS.docx
@@ -26,7 +26,17 @@
           <w:b/>
           <w:bCs/>
         </w:rPr>
-        <w:t>Arquitectura de Microservicios para una EPS</w:t>
+        <w:t>Estructura</w:t>
+      </w:r>
+      <w:bookmarkStart w:id="0" w:name="_GoBack"/>
+      <w:bookmarkEnd w:id="0"/>
+      <w:r>
+        <w:rPr>
+          <w:rFonts w:ascii="Times New Roman" w:eastAsia="Times New Roman" w:hAnsi="Times New Roman" w:cs="Times New Roman"/>
+          <w:b/>
+          <w:bCs/>
+        </w:rPr>
+        <w:t xml:space="preserve"> de Microservicios para una EPS</w:t>
       </w:r>
     </w:p>
     <w:p>
@@ -431,7 +441,7 @@
         <w:rPr>
           <w:rFonts w:ascii="Times New Roman" w:hAnsi="Times New Roman" w:cs="Times New Roman"/>
         </w:rPr>
-        <w:t xml:space="preserve">Las EPS gestionan grandes volúmenes de información (afiliados, cotizaciones, autorizaciones, facturación y pagos). Los sistemas monolíticos limitan la escalabilidad y el mantenimiento. La arquitectura de </w:t>
+        <w:t xml:space="preserve">El presente documento describe la estructura de carpetas del proyecto de </w:t>
       </w:r>
       <w:proofErr w:type="spellStart"/>
       <w:r>
@@ -445,7 +455,7 @@
         <w:rPr>
           <w:rFonts w:ascii="Times New Roman" w:hAnsi="Times New Roman" w:cs="Times New Roman"/>
         </w:rPr>
-        <w:t xml:space="preserve"> divide el sistema en servicios pequeños e independientes, cada uno responsable de un dominio funcional del negocio.</w:t>
+        <w:t xml:space="preserve"> para una EPS. Cada microservicio corresponde a un dominio funcional del negocio y se encuentra organizado dentro de la carpeta eps-microservicios/. En esta fase del proyecto solo se define el esqueleto (carpetas), sin implementación de código.</w:t>
       </w:r>
     </w:p>
     <w:p>
@@ -623,7 +633,7 @@
           <w:b/>
         </w:rPr>
         <w:lastRenderedPageBreak/>
-        <w:t>2. Objetivo</w:t>
+        <w:t>2. Estructura de Carpetas</w:t>
       </w:r>
     </w:p>
     <w:p>
@@ -637,7 +647,992 @@
         <w:rPr>
           <w:rFonts w:ascii="Times New Roman" w:hAnsi="Times New Roman" w:cs="Times New Roman"/>
         </w:rPr>
-        <w:t xml:space="preserve">Diseñar una arquitectura de </w:t>
+        <w:t>evaluacionGit/</w:t>
+      </w:r>
+    </w:p>
+    <w:p>
+      <w:pPr>
+        <w:ind w:firstLine="708"/>
+        <w:rPr>
+          <w:rFonts w:ascii="Times New Roman" w:hAnsi="Times New Roman" w:cs="Times New Roman"/>
+        </w:rPr>
+      </w:pPr>
+      <w:r>
+        <w:rPr>
+          <w:rFonts w:ascii="Times New Roman" w:hAnsi="Times New Roman" w:cs="Times New Roman"/>
+        </w:rPr>
+        <w:t>├── eps-microservicios/</w:t>
+      </w:r>
+    </w:p>
+    <w:p>
+      <w:pPr>
+        <w:ind w:firstLine="708"/>
+        <w:rPr>
+          <w:rFonts w:ascii="Times New Roman" w:hAnsi="Times New Roman" w:cs="Times New Roman"/>
+        </w:rPr>
+      </w:pPr>
+      <w:r>
+        <w:rPr>
+          <w:rFonts w:ascii="Times New Roman" w:hAnsi="Times New Roman" w:cs="Times New Roman"/>
+        </w:rPr>
+        <w:t>│   ├── ms-</w:t>
+      </w:r>
+      <w:proofErr w:type="spellStart"/>
+      <w:r>
+        <w:rPr>
+          <w:rFonts w:ascii="Times New Roman" w:hAnsi="Times New Roman" w:cs="Times New Roman"/>
+        </w:rPr>
+        <w:t>afiliacion</w:t>
+      </w:r>
+      <w:proofErr w:type="spellEnd"/>
+      <w:r>
+        <w:rPr>
+          <w:rFonts w:ascii="Times New Roman" w:hAnsi="Times New Roman" w:cs="Times New Roman"/>
+        </w:rPr>
+        <w:t>/</w:t>
+      </w:r>
+    </w:p>
+    <w:p>
+      <w:pPr>
+        <w:ind w:firstLine="708"/>
+        <w:rPr>
+          <w:rFonts w:ascii="Times New Roman" w:hAnsi="Times New Roman" w:cs="Times New Roman"/>
+        </w:rPr>
+      </w:pPr>
+      <w:r>
+        <w:rPr>
+          <w:rFonts w:ascii="Times New Roman" w:hAnsi="Times New Roman" w:cs="Times New Roman"/>
+        </w:rPr>
+        <w:t>│   ├── ms-autorizaciones/</w:t>
+      </w:r>
+    </w:p>
+    <w:p>
+      <w:pPr>
+        <w:ind w:firstLine="708"/>
+        <w:rPr>
+          <w:rFonts w:ascii="Times New Roman" w:hAnsi="Times New Roman" w:cs="Times New Roman"/>
+        </w:rPr>
+      </w:pPr>
+      <w:r>
+        <w:rPr>
+          <w:rFonts w:ascii="Times New Roman" w:hAnsi="Times New Roman" w:cs="Times New Roman"/>
+        </w:rPr>
+        <w:t>│   ├── ms-</w:t>
+      </w:r>
+      <w:proofErr w:type="spellStart"/>
+      <w:r>
+        <w:rPr>
+          <w:rFonts w:ascii="Times New Roman" w:hAnsi="Times New Roman" w:cs="Times New Roman"/>
+        </w:rPr>
+        <w:t>facturacion</w:t>
+      </w:r>
+      <w:proofErr w:type="spellEnd"/>
+      <w:r>
+        <w:rPr>
+          <w:rFonts w:ascii="Times New Roman" w:hAnsi="Times New Roman" w:cs="Times New Roman"/>
+        </w:rPr>
+        <w:t>/</w:t>
+      </w:r>
+    </w:p>
+    <w:p>
+      <w:pPr>
+        <w:ind w:firstLine="708"/>
+        <w:rPr>
+          <w:rFonts w:ascii="Times New Roman" w:hAnsi="Times New Roman" w:cs="Times New Roman"/>
+        </w:rPr>
+      </w:pPr>
+      <w:r>
+        <w:rPr>
+          <w:rFonts w:ascii="Times New Roman" w:hAnsi="Times New Roman" w:cs="Times New Roman"/>
+        </w:rPr>
+        <w:t>│   ├── ms-pagos/</w:t>
+      </w:r>
+    </w:p>
+    <w:p>
+      <w:pPr>
+        <w:ind w:firstLine="708"/>
+        <w:rPr>
+          <w:rFonts w:ascii="Times New Roman" w:hAnsi="Times New Roman" w:cs="Times New Roman"/>
+        </w:rPr>
+      </w:pPr>
+      <w:r>
+        <w:rPr>
+          <w:rFonts w:ascii="Times New Roman" w:hAnsi="Times New Roman" w:cs="Times New Roman"/>
+        </w:rPr>
+        <w:t>│   └── ms-</w:t>
+      </w:r>
+      <w:proofErr w:type="spellStart"/>
+      <w:r>
+        <w:rPr>
+          <w:rFonts w:ascii="Times New Roman" w:hAnsi="Times New Roman" w:cs="Times New Roman"/>
+        </w:rPr>
+        <w:t>pqrs</w:t>
+      </w:r>
+      <w:proofErr w:type="spellEnd"/>
+      <w:r>
+        <w:rPr>
+          <w:rFonts w:ascii="Times New Roman" w:hAnsi="Times New Roman" w:cs="Times New Roman"/>
+        </w:rPr>
+        <w:t>/</w:t>
+      </w:r>
+    </w:p>
+    <w:p>
+      <w:pPr>
+        <w:ind w:firstLine="708"/>
+        <w:rPr>
+          <w:rFonts w:ascii="Times New Roman" w:hAnsi="Times New Roman" w:cs="Times New Roman"/>
+        </w:rPr>
+      </w:pPr>
+      <w:r>
+        <w:rPr>
+          <w:rFonts w:ascii="Times New Roman" w:hAnsi="Times New Roman" w:cs="Times New Roman"/>
+        </w:rPr>
+        <w:t>├── EstructuraMicroservicios_EPS.docx</w:t>
+      </w:r>
+    </w:p>
+    <w:p>
+      <w:pPr>
+        <w:ind w:firstLine="708"/>
+        <w:rPr>
+          <w:rFonts w:ascii="Times New Roman" w:hAnsi="Times New Roman" w:cs="Times New Roman"/>
+        </w:rPr>
+      </w:pPr>
+      <w:r>
+        <w:rPr>
+          <w:rFonts w:ascii="Times New Roman" w:hAnsi="Times New Roman" w:cs="Times New Roman"/>
+        </w:rPr>
+        <w:t>└── README.md</w:t>
+      </w:r>
+    </w:p>
+    <w:p>
+      <w:pPr>
+        <w:ind w:firstLine="708"/>
+        <w:rPr>
+          <w:rFonts w:ascii="Times New Roman" w:hAnsi="Times New Roman" w:cs="Times New Roman"/>
+        </w:rPr>
+      </w:pPr>
+    </w:p>
+    <w:p>
+      <w:pPr>
+        <w:ind w:firstLine="708"/>
+        <w:rPr>
+          <w:rFonts w:ascii="Times New Roman" w:hAnsi="Times New Roman" w:cs="Times New Roman"/>
+        </w:rPr>
+      </w:pPr>
+    </w:p>
+    <w:p>
+      <w:pPr>
+        <w:ind w:firstLine="708"/>
+        <w:rPr>
+          <w:rFonts w:ascii="Times New Roman" w:hAnsi="Times New Roman" w:cs="Times New Roman"/>
+        </w:rPr>
+      </w:pPr>
+    </w:p>
+    <w:p>
+      <w:pPr>
+        <w:ind w:firstLine="708"/>
+        <w:rPr>
+          <w:rFonts w:ascii="Times New Roman" w:hAnsi="Times New Roman" w:cs="Times New Roman"/>
+        </w:rPr>
+      </w:pPr>
+    </w:p>
+    <w:p>
+      <w:pPr>
+        <w:ind w:firstLine="708"/>
+        <w:rPr>
+          <w:rFonts w:ascii="Times New Roman" w:hAnsi="Times New Roman" w:cs="Times New Roman"/>
+        </w:rPr>
+      </w:pPr>
+    </w:p>
+    <w:p>
+      <w:pPr>
+        <w:ind w:firstLine="708"/>
+        <w:rPr>
+          <w:rFonts w:ascii="Times New Roman" w:hAnsi="Times New Roman" w:cs="Times New Roman"/>
+        </w:rPr>
+      </w:pPr>
+    </w:p>
+    <w:p>
+      <w:pPr>
+        <w:ind w:firstLine="708"/>
+        <w:rPr>
+          <w:rFonts w:ascii="Times New Roman" w:hAnsi="Times New Roman" w:cs="Times New Roman"/>
+        </w:rPr>
+      </w:pPr>
+    </w:p>
+    <w:p>
+      <w:pPr>
+        <w:ind w:firstLine="708"/>
+        <w:rPr>
+          <w:rFonts w:ascii="Times New Roman" w:hAnsi="Times New Roman" w:cs="Times New Roman"/>
+        </w:rPr>
+      </w:pPr>
+    </w:p>
+    <w:p>
+      <w:pPr>
+        <w:ind w:firstLine="708"/>
+        <w:rPr>
+          <w:rFonts w:ascii="Times New Roman" w:hAnsi="Times New Roman" w:cs="Times New Roman"/>
+        </w:rPr>
+      </w:pPr>
+    </w:p>
+    <w:p>
+      <w:pPr>
+        <w:rPr>
+          <w:rFonts w:ascii="Times New Roman" w:hAnsi="Times New Roman" w:cs="Times New Roman"/>
+        </w:rPr>
+      </w:pPr>
+    </w:p>
+    <w:p>
+      <w:pPr>
+        <w:rPr>
+          <w:rFonts w:ascii="Times New Roman" w:hAnsi="Times New Roman" w:cs="Times New Roman"/>
+        </w:rPr>
+      </w:pPr>
+    </w:p>
+    <w:p>
+      <w:pPr>
+        <w:ind w:firstLine="708"/>
+        <w:rPr>
+          <w:rFonts w:ascii="Times New Roman" w:hAnsi="Times New Roman" w:cs="Times New Roman"/>
+        </w:rPr>
+      </w:pPr>
+    </w:p>
+    <w:p>
+      <w:pPr>
+        <w:ind w:firstLine="708"/>
+        <w:rPr>
+          <w:rFonts w:ascii="Times New Roman" w:hAnsi="Times New Roman" w:cs="Times New Roman"/>
+        </w:rPr>
+      </w:pPr>
+    </w:p>
+    <w:p>
+      <w:pPr>
+        <w:pStyle w:val="Prrafodelista"/>
+        <w:numPr>
+          <w:ilvl w:val="0"/>
+          <w:numId w:val="25"/>
+        </w:numPr>
+        <w:jc w:val="center"/>
+        <w:rPr>
+          <w:rFonts w:ascii="Times New Roman" w:hAnsi="Times New Roman" w:cs="Times New Roman"/>
+          <w:b/>
+        </w:rPr>
+      </w:pPr>
+      <w:r>
+        <w:rPr>
+          <w:rFonts w:ascii="Times New Roman" w:hAnsi="Times New Roman" w:cs="Times New Roman"/>
+          <w:b/>
+        </w:rPr>
+        <w:lastRenderedPageBreak/>
+        <w:t>Descripción de cada microservicio</w:t>
+      </w:r>
+    </w:p>
+    <w:p>
+      <w:pPr>
+        <w:rPr>
+          <w:rFonts w:ascii="Times New Roman" w:hAnsi="Times New Roman" w:cs="Times New Roman"/>
+          <w:b/>
+        </w:rPr>
+      </w:pPr>
+    </w:p>
+    <w:tbl>
+      <w:tblPr>
+        <w:tblW w:w="9060" w:type="dxa"/>
+        <w:tblCellMar>
+          <w:left w:w="70" w:type="dxa"/>
+          <w:right w:w="70" w:type="dxa"/>
+        </w:tblCellMar>
+        <w:tblLook w:val="04A0" w:firstRow="1" w:lastRow="0" w:firstColumn="1" w:lastColumn="0" w:noHBand="0" w:noVBand="1"/>
+      </w:tblPr>
+      <w:tblGrid>
+        <w:gridCol w:w="2540"/>
+        <w:gridCol w:w="6520"/>
+      </w:tblGrid>
+      <w:tr>
+        <w:trPr>
+          <w:trHeight w:val="330"/>
+        </w:trPr>
+        <w:tc>
+          <w:tcPr>
+            <w:tcW w:w="2540" w:type="dxa"/>
+            <w:tcBorders>
+              <w:top w:val="single" w:sz="4" w:space="0" w:color="auto"/>
+              <w:left w:val="single" w:sz="4" w:space="0" w:color="auto"/>
+              <w:bottom w:val="single" w:sz="4" w:space="0" w:color="auto"/>
+              <w:right w:val="single" w:sz="4" w:space="0" w:color="auto"/>
+            </w:tcBorders>
+            <w:shd w:val="clear" w:color="auto" w:fill="auto"/>
+            <w:vAlign w:val="center"/>
+            <w:hideMark/>
+          </w:tcPr>
+          <w:p>
+            <w:pPr>
+              <w:spacing w:before="0" w:after="0" w:line="240" w:lineRule="auto"/>
+              <w:jc w:val="center"/>
+              <w:rPr>
+                <w:rFonts w:ascii="Segoe UI" w:eastAsia="Times New Roman" w:hAnsi="Segoe UI" w:cs="Segoe UI"/>
+                <w:b/>
+                <w:bCs/>
+                <w:color w:val="000000"/>
+                <w:sz w:val="22"/>
+                <w:szCs w:val="22"/>
+                <w:lang w:eastAsia="es-CO"/>
+              </w:rPr>
+            </w:pPr>
+            <w:r>
+              <w:rPr>
+                <w:rFonts w:ascii="Segoe UI" w:eastAsia="Times New Roman" w:hAnsi="Segoe UI" w:cs="Segoe UI"/>
+                <w:b/>
+                <w:bCs/>
+                <w:color w:val="000000"/>
+                <w:sz w:val="22"/>
+                <w:szCs w:val="22"/>
+                <w:lang w:eastAsia="es-CO"/>
+              </w:rPr>
+              <w:t>Microservicio</w:t>
+            </w:r>
+          </w:p>
+        </w:tc>
+        <w:tc>
+          <w:tcPr>
+            <w:tcW w:w="6520" w:type="dxa"/>
+            <w:tcBorders>
+              <w:top w:val="single" w:sz="4" w:space="0" w:color="auto"/>
+              <w:left w:val="nil"/>
+              <w:bottom w:val="single" w:sz="4" w:space="0" w:color="auto"/>
+              <w:right w:val="single" w:sz="4" w:space="0" w:color="auto"/>
+            </w:tcBorders>
+            <w:shd w:val="clear" w:color="auto" w:fill="auto"/>
+            <w:vAlign w:val="center"/>
+            <w:hideMark/>
+          </w:tcPr>
+          <w:p>
+            <w:pPr>
+              <w:spacing w:before="0" w:after="0" w:line="240" w:lineRule="auto"/>
+              <w:jc w:val="center"/>
+              <w:rPr>
+                <w:rFonts w:ascii="Segoe UI" w:eastAsia="Times New Roman" w:hAnsi="Segoe UI" w:cs="Segoe UI"/>
+                <w:b/>
+                <w:bCs/>
+                <w:color w:val="000000"/>
+                <w:sz w:val="22"/>
+                <w:szCs w:val="22"/>
+                <w:lang w:eastAsia="es-CO"/>
+              </w:rPr>
+            </w:pPr>
+            <w:r>
+              <w:rPr>
+                <w:rFonts w:ascii="Segoe UI" w:eastAsia="Times New Roman" w:hAnsi="Segoe UI" w:cs="Segoe UI"/>
+                <w:b/>
+                <w:bCs/>
+                <w:color w:val="000000"/>
+                <w:sz w:val="22"/>
+                <w:szCs w:val="22"/>
+                <w:lang w:eastAsia="es-CO"/>
+              </w:rPr>
+              <w:t>Descripción</w:t>
+            </w:r>
+          </w:p>
+        </w:tc>
+      </w:tr>
+      <w:tr>
+        <w:trPr>
+          <w:trHeight w:val="990"/>
+        </w:trPr>
+        <w:tc>
+          <w:tcPr>
+            <w:tcW w:w="2540" w:type="dxa"/>
+            <w:tcBorders>
+              <w:top w:val="nil"/>
+              <w:left w:val="single" w:sz="4" w:space="0" w:color="auto"/>
+              <w:bottom w:val="single" w:sz="4" w:space="0" w:color="auto"/>
+              <w:right w:val="single" w:sz="4" w:space="0" w:color="auto"/>
+            </w:tcBorders>
+            <w:shd w:val="clear" w:color="auto" w:fill="auto"/>
+            <w:vAlign w:val="center"/>
+            <w:hideMark/>
+          </w:tcPr>
+          <w:p>
+            <w:pPr>
+              <w:spacing w:before="0" w:after="0" w:line="240" w:lineRule="auto"/>
+              <w:jc w:val="left"/>
+              <w:rPr>
+                <w:rFonts w:ascii="Segoe UI" w:eastAsia="Times New Roman" w:hAnsi="Segoe UI" w:cs="Segoe UI"/>
+                <w:b/>
+                <w:bCs/>
+                <w:color w:val="000000"/>
+                <w:sz w:val="22"/>
+                <w:szCs w:val="22"/>
+                <w:lang w:eastAsia="es-CO"/>
+              </w:rPr>
+            </w:pPr>
+            <w:r>
+              <w:rPr>
+                <w:rFonts w:ascii="Segoe UI" w:eastAsia="Times New Roman" w:hAnsi="Segoe UI" w:cs="Segoe UI"/>
+                <w:b/>
+                <w:bCs/>
+                <w:color w:val="000000"/>
+                <w:sz w:val="22"/>
+                <w:szCs w:val="22"/>
+                <w:lang w:eastAsia="es-CO"/>
+              </w:rPr>
+              <w:t>ms-</w:t>
+            </w:r>
+            <w:proofErr w:type="spellStart"/>
+            <w:r>
+              <w:rPr>
+                <w:rFonts w:ascii="Segoe UI" w:eastAsia="Times New Roman" w:hAnsi="Segoe UI" w:cs="Segoe UI"/>
+                <w:b/>
+                <w:bCs/>
+                <w:color w:val="000000"/>
+                <w:sz w:val="22"/>
+                <w:szCs w:val="22"/>
+                <w:lang w:eastAsia="es-CO"/>
+              </w:rPr>
+              <w:t>afiliacion</w:t>
+            </w:r>
+            <w:proofErr w:type="spellEnd"/>
+          </w:p>
+        </w:tc>
+        <w:tc>
+          <w:tcPr>
+            <w:tcW w:w="6520" w:type="dxa"/>
+            <w:tcBorders>
+              <w:top w:val="nil"/>
+              <w:left w:val="nil"/>
+              <w:bottom w:val="single" w:sz="4" w:space="0" w:color="auto"/>
+              <w:right w:val="single" w:sz="4" w:space="0" w:color="auto"/>
+            </w:tcBorders>
+            <w:shd w:val="clear" w:color="auto" w:fill="auto"/>
+            <w:vAlign w:val="center"/>
+            <w:hideMark/>
+          </w:tcPr>
+          <w:p>
+            <w:pPr>
+              <w:spacing w:before="0" w:after="0" w:line="240" w:lineRule="auto"/>
+              <w:jc w:val="left"/>
+              <w:rPr>
+                <w:rFonts w:ascii="Segoe UI" w:eastAsia="Times New Roman" w:hAnsi="Segoe UI" w:cs="Segoe UI"/>
+                <w:color w:val="000000"/>
+                <w:sz w:val="22"/>
+                <w:szCs w:val="22"/>
+                <w:lang w:eastAsia="es-CO"/>
+              </w:rPr>
+            </w:pPr>
+            <w:r>
+              <w:rPr>
+                <w:rFonts w:ascii="Segoe UI" w:eastAsia="Times New Roman" w:hAnsi="Segoe UI" w:cs="Segoe UI"/>
+                <w:color w:val="000000"/>
+                <w:sz w:val="22"/>
+                <w:szCs w:val="22"/>
+                <w:lang w:eastAsia="es-CO"/>
+              </w:rPr>
+              <w:t>Gestiona el registro, novedades y datos personales de los afiliados a la EPS.</w:t>
+            </w:r>
+          </w:p>
+        </w:tc>
+      </w:tr>
+      <w:tr>
+        <w:trPr>
+          <w:trHeight w:val="990"/>
+        </w:trPr>
+        <w:tc>
+          <w:tcPr>
+            <w:tcW w:w="2540" w:type="dxa"/>
+            <w:tcBorders>
+              <w:top w:val="nil"/>
+              <w:left w:val="single" w:sz="4" w:space="0" w:color="auto"/>
+              <w:bottom w:val="single" w:sz="4" w:space="0" w:color="auto"/>
+              <w:right w:val="single" w:sz="4" w:space="0" w:color="auto"/>
+            </w:tcBorders>
+            <w:shd w:val="clear" w:color="auto" w:fill="auto"/>
+            <w:vAlign w:val="center"/>
+            <w:hideMark/>
+          </w:tcPr>
+          <w:p>
+            <w:pPr>
+              <w:spacing w:before="0" w:after="0" w:line="240" w:lineRule="auto"/>
+              <w:jc w:val="left"/>
+              <w:rPr>
+                <w:rFonts w:ascii="Segoe UI" w:eastAsia="Times New Roman" w:hAnsi="Segoe UI" w:cs="Segoe UI"/>
+                <w:b/>
+                <w:bCs/>
+                <w:color w:val="000000"/>
+                <w:sz w:val="22"/>
+                <w:szCs w:val="22"/>
+                <w:lang w:eastAsia="es-CO"/>
+              </w:rPr>
+            </w:pPr>
+            <w:r>
+              <w:rPr>
+                <w:rFonts w:ascii="Segoe UI" w:eastAsia="Times New Roman" w:hAnsi="Segoe UI" w:cs="Segoe UI"/>
+                <w:b/>
+                <w:bCs/>
+                <w:color w:val="000000"/>
+                <w:sz w:val="22"/>
+                <w:szCs w:val="22"/>
+                <w:lang w:eastAsia="es-CO"/>
+              </w:rPr>
+              <w:t>ms-autorizaciones</w:t>
+            </w:r>
+          </w:p>
+        </w:tc>
+        <w:tc>
+          <w:tcPr>
+            <w:tcW w:w="6520" w:type="dxa"/>
+            <w:tcBorders>
+              <w:top w:val="nil"/>
+              <w:left w:val="nil"/>
+              <w:bottom w:val="single" w:sz="4" w:space="0" w:color="auto"/>
+              <w:right w:val="single" w:sz="4" w:space="0" w:color="auto"/>
+            </w:tcBorders>
+            <w:shd w:val="clear" w:color="auto" w:fill="auto"/>
+            <w:vAlign w:val="center"/>
+            <w:hideMark/>
+          </w:tcPr>
+          <w:p>
+            <w:pPr>
+              <w:spacing w:before="0" w:after="0" w:line="240" w:lineRule="auto"/>
+              <w:jc w:val="left"/>
+              <w:rPr>
+                <w:rFonts w:ascii="Segoe UI" w:eastAsia="Times New Roman" w:hAnsi="Segoe UI" w:cs="Segoe UI"/>
+                <w:color w:val="000000"/>
+                <w:sz w:val="22"/>
+                <w:szCs w:val="22"/>
+                <w:lang w:eastAsia="es-CO"/>
+              </w:rPr>
+            </w:pPr>
+            <w:r>
+              <w:rPr>
+                <w:rFonts w:ascii="Segoe UI" w:eastAsia="Times New Roman" w:hAnsi="Segoe UI" w:cs="Segoe UI"/>
+                <w:color w:val="000000"/>
+                <w:sz w:val="22"/>
+                <w:szCs w:val="22"/>
+                <w:lang w:eastAsia="es-CO"/>
+              </w:rPr>
+              <w:t>Administra las solicitudes y emisión de autorizaciones de servicios médicos.</w:t>
+            </w:r>
+          </w:p>
+        </w:tc>
+      </w:tr>
+      <w:tr>
+        <w:trPr>
+          <w:trHeight w:val="660"/>
+        </w:trPr>
+        <w:tc>
+          <w:tcPr>
+            <w:tcW w:w="2540" w:type="dxa"/>
+            <w:tcBorders>
+              <w:top w:val="nil"/>
+              <w:left w:val="single" w:sz="4" w:space="0" w:color="auto"/>
+              <w:bottom w:val="single" w:sz="4" w:space="0" w:color="auto"/>
+              <w:right w:val="single" w:sz="4" w:space="0" w:color="auto"/>
+            </w:tcBorders>
+            <w:shd w:val="clear" w:color="auto" w:fill="auto"/>
+            <w:vAlign w:val="center"/>
+            <w:hideMark/>
+          </w:tcPr>
+          <w:p>
+            <w:pPr>
+              <w:spacing w:before="0" w:after="0" w:line="240" w:lineRule="auto"/>
+              <w:jc w:val="left"/>
+              <w:rPr>
+                <w:rFonts w:ascii="Segoe UI" w:eastAsia="Times New Roman" w:hAnsi="Segoe UI" w:cs="Segoe UI"/>
+                <w:b/>
+                <w:bCs/>
+                <w:color w:val="000000"/>
+                <w:sz w:val="22"/>
+                <w:szCs w:val="22"/>
+                <w:lang w:eastAsia="es-CO"/>
+              </w:rPr>
+            </w:pPr>
+            <w:r>
+              <w:rPr>
+                <w:rFonts w:ascii="Segoe UI" w:eastAsia="Times New Roman" w:hAnsi="Segoe UI" w:cs="Segoe UI"/>
+                <w:b/>
+                <w:bCs/>
+                <w:color w:val="000000"/>
+                <w:sz w:val="22"/>
+                <w:szCs w:val="22"/>
+                <w:lang w:eastAsia="es-CO"/>
+              </w:rPr>
+              <w:t>ms-</w:t>
+            </w:r>
+            <w:proofErr w:type="spellStart"/>
+            <w:r>
+              <w:rPr>
+                <w:rFonts w:ascii="Segoe UI" w:eastAsia="Times New Roman" w:hAnsi="Segoe UI" w:cs="Segoe UI"/>
+                <w:b/>
+                <w:bCs/>
+                <w:color w:val="000000"/>
+                <w:sz w:val="22"/>
+                <w:szCs w:val="22"/>
+                <w:lang w:eastAsia="es-CO"/>
+              </w:rPr>
+              <w:t>facturacion</w:t>
+            </w:r>
+            <w:proofErr w:type="spellEnd"/>
+          </w:p>
+        </w:tc>
+        <w:tc>
+          <w:tcPr>
+            <w:tcW w:w="6520" w:type="dxa"/>
+            <w:tcBorders>
+              <w:top w:val="nil"/>
+              <w:left w:val="nil"/>
+              <w:bottom w:val="single" w:sz="4" w:space="0" w:color="auto"/>
+              <w:right w:val="single" w:sz="4" w:space="0" w:color="auto"/>
+            </w:tcBorders>
+            <w:shd w:val="clear" w:color="auto" w:fill="auto"/>
+            <w:vAlign w:val="center"/>
+            <w:hideMark/>
+          </w:tcPr>
+          <w:p>
+            <w:pPr>
+              <w:spacing w:before="0" w:after="0" w:line="240" w:lineRule="auto"/>
+              <w:jc w:val="left"/>
+              <w:rPr>
+                <w:rFonts w:ascii="Segoe UI" w:eastAsia="Times New Roman" w:hAnsi="Segoe UI" w:cs="Segoe UI"/>
+                <w:color w:val="000000"/>
+                <w:sz w:val="22"/>
+                <w:szCs w:val="22"/>
+                <w:lang w:eastAsia="es-CO"/>
+              </w:rPr>
+            </w:pPr>
+            <w:r>
+              <w:rPr>
+                <w:rFonts w:ascii="Segoe UI" w:eastAsia="Times New Roman" w:hAnsi="Segoe UI" w:cs="Segoe UI"/>
+                <w:color w:val="000000"/>
+                <w:sz w:val="22"/>
+                <w:szCs w:val="22"/>
+                <w:lang w:eastAsia="es-CO"/>
+              </w:rPr>
+              <w:t>Radica, valida y gestiona las facturas enviadas por los prestadores.</w:t>
+            </w:r>
+          </w:p>
+        </w:tc>
+      </w:tr>
+      <w:tr>
+        <w:trPr>
+          <w:trHeight w:val="990"/>
+        </w:trPr>
+        <w:tc>
+          <w:tcPr>
+            <w:tcW w:w="2540" w:type="dxa"/>
+            <w:tcBorders>
+              <w:top w:val="nil"/>
+              <w:left w:val="single" w:sz="4" w:space="0" w:color="auto"/>
+              <w:bottom w:val="single" w:sz="4" w:space="0" w:color="auto"/>
+              <w:right w:val="single" w:sz="4" w:space="0" w:color="auto"/>
+            </w:tcBorders>
+            <w:shd w:val="clear" w:color="auto" w:fill="auto"/>
+            <w:vAlign w:val="center"/>
+            <w:hideMark/>
+          </w:tcPr>
+          <w:p>
+            <w:pPr>
+              <w:spacing w:before="0" w:after="0" w:line="240" w:lineRule="auto"/>
+              <w:jc w:val="left"/>
+              <w:rPr>
+                <w:rFonts w:ascii="Segoe UI" w:eastAsia="Times New Roman" w:hAnsi="Segoe UI" w:cs="Segoe UI"/>
+                <w:b/>
+                <w:bCs/>
+                <w:color w:val="000000"/>
+                <w:sz w:val="22"/>
+                <w:szCs w:val="22"/>
+                <w:lang w:eastAsia="es-CO"/>
+              </w:rPr>
+            </w:pPr>
+            <w:r>
+              <w:rPr>
+                <w:rFonts w:ascii="Segoe UI" w:eastAsia="Times New Roman" w:hAnsi="Segoe UI" w:cs="Segoe UI"/>
+                <w:b/>
+                <w:bCs/>
+                <w:color w:val="000000"/>
+                <w:sz w:val="22"/>
+                <w:szCs w:val="22"/>
+                <w:lang w:eastAsia="es-CO"/>
+              </w:rPr>
+              <w:t>ms-pagos</w:t>
+            </w:r>
+          </w:p>
+        </w:tc>
+        <w:tc>
+          <w:tcPr>
+            <w:tcW w:w="6520" w:type="dxa"/>
+            <w:tcBorders>
+              <w:top w:val="nil"/>
+              <w:left w:val="nil"/>
+              <w:bottom w:val="single" w:sz="4" w:space="0" w:color="auto"/>
+              <w:right w:val="single" w:sz="4" w:space="0" w:color="auto"/>
+            </w:tcBorders>
+            <w:shd w:val="clear" w:color="auto" w:fill="auto"/>
+            <w:vAlign w:val="center"/>
+            <w:hideMark/>
+          </w:tcPr>
+          <w:p>
+            <w:pPr>
+              <w:spacing w:before="0" w:after="0" w:line="240" w:lineRule="auto"/>
+              <w:jc w:val="left"/>
+              <w:rPr>
+                <w:rFonts w:ascii="Segoe UI" w:eastAsia="Times New Roman" w:hAnsi="Segoe UI" w:cs="Segoe UI"/>
+                <w:color w:val="000000"/>
+                <w:sz w:val="22"/>
+                <w:szCs w:val="22"/>
+                <w:lang w:eastAsia="es-CO"/>
+              </w:rPr>
+            </w:pPr>
+            <w:r>
+              <w:rPr>
+                <w:rFonts w:ascii="Segoe UI" w:eastAsia="Times New Roman" w:hAnsi="Segoe UI" w:cs="Segoe UI"/>
+                <w:color w:val="000000"/>
+                <w:sz w:val="22"/>
+                <w:szCs w:val="22"/>
+                <w:lang w:eastAsia="es-CO"/>
+              </w:rPr>
+              <w:t>Ejecuta la dispersión de pagos a prestadores y conciliaciones financieras.</w:t>
+            </w:r>
+          </w:p>
+        </w:tc>
+      </w:tr>
+      <w:tr>
+        <w:trPr>
+          <w:trHeight w:val="660"/>
+        </w:trPr>
+        <w:tc>
+          <w:tcPr>
+            <w:tcW w:w="2540" w:type="dxa"/>
+            <w:tcBorders>
+              <w:top w:val="nil"/>
+              <w:left w:val="single" w:sz="4" w:space="0" w:color="auto"/>
+              <w:bottom w:val="single" w:sz="4" w:space="0" w:color="auto"/>
+              <w:right w:val="single" w:sz="4" w:space="0" w:color="auto"/>
+            </w:tcBorders>
+            <w:shd w:val="clear" w:color="auto" w:fill="auto"/>
+            <w:vAlign w:val="center"/>
+            <w:hideMark/>
+          </w:tcPr>
+          <w:p>
+            <w:pPr>
+              <w:spacing w:before="0" w:after="0" w:line="240" w:lineRule="auto"/>
+              <w:jc w:val="left"/>
+              <w:rPr>
+                <w:rFonts w:ascii="Segoe UI" w:eastAsia="Times New Roman" w:hAnsi="Segoe UI" w:cs="Segoe UI"/>
+                <w:b/>
+                <w:bCs/>
+                <w:color w:val="000000"/>
+                <w:sz w:val="22"/>
+                <w:szCs w:val="22"/>
+                <w:lang w:eastAsia="es-CO"/>
+              </w:rPr>
+            </w:pPr>
+            <w:r>
+              <w:rPr>
+                <w:rFonts w:ascii="Segoe UI" w:eastAsia="Times New Roman" w:hAnsi="Segoe UI" w:cs="Segoe UI"/>
+                <w:b/>
+                <w:bCs/>
+                <w:color w:val="000000"/>
+                <w:sz w:val="22"/>
+                <w:szCs w:val="22"/>
+                <w:lang w:eastAsia="es-CO"/>
+              </w:rPr>
+              <w:t>ms-</w:t>
+            </w:r>
+            <w:proofErr w:type="spellStart"/>
+            <w:r>
+              <w:rPr>
+                <w:rFonts w:ascii="Segoe UI" w:eastAsia="Times New Roman" w:hAnsi="Segoe UI" w:cs="Segoe UI"/>
+                <w:b/>
+                <w:bCs/>
+                <w:color w:val="000000"/>
+                <w:sz w:val="22"/>
+                <w:szCs w:val="22"/>
+                <w:lang w:eastAsia="es-CO"/>
+              </w:rPr>
+              <w:t>pqrs</w:t>
+            </w:r>
+            <w:proofErr w:type="spellEnd"/>
+          </w:p>
+        </w:tc>
+        <w:tc>
+          <w:tcPr>
+            <w:tcW w:w="6520" w:type="dxa"/>
+            <w:tcBorders>
+              <w:top w:val="nil"/>
+              <w:left w:val="nil"/>
+              <w:bottom w:val="single" w:sz="4" w:space="0" w:color="auto"/>
+              <w:right w:val="single" w:sz="4" w:space="0" w:color="auto"/>
+            </w:tcBorders>
+            <w:shd w:val="clear" w:color="auto" w:fill="auto"/>
+            <w:vAlign w:val="center"/>
+            <w:hideMark/>
+          </w:tcPr>
+          <w:p>
+            <w:pPr>
+              <w:spacing w:before="0" w:after="0" w:line="240" w:lineRule="auto"/>
+              <w:jc w:val="left"/>
+              <w:rPr>
+                <w:rFonts w:ascii="Segoe UI" w:eastAsia="Times New Roman" w:hAnsi="Segoe UI" w:cs="Segoe UI"/>
+                <w:color w:val="000000"/>
+                <w:sz w:val="22"/>
+                <w:szCs w:val="22"/>
+                <w:lang w:eastAsia="es-CO"/>
+              </w:rPr>
+            </w:pPr>
+            <w:r>
+              <w:rPr>
+                <w:rFonts w:ascii="Segoe UI" w:eastAsia="Times New Roman" w:hAnsi="Segoe UI" w:cs="Segoe UI"/>
+                <w:color w:val="000000"/>
+                <w:sz w:val="22"/>
+                <w:szCs w:val="22"/>
+                <w:lang w:eastAsia="es-CO"/>
+              </w:rPr>
+              <w:t>Atiende peticiones, quejas, reclamos y sugerencias de los afiliados.</w:t>
+            </w:r>
+          </w:p>
+        </w:tc>
+      </w:tr>
+    </w:tbl>
+    <w:p>
+      <w:pPr>
+        <w:pStyle w:val="Prrafodelista"/>
+        <w:rPr>
+          <w:rFonts w:ascii="Times New Roman" w:hAnsi="Times New Roman" w:cs="Times New Roman"/>
+          <w:b/>
+        </w:rPr>
+      </w:pPr>
+    </w:p>
+    <w:p>
+      <w:pPr>
+        <w:rPr>
+          <w:rFonts w:ascii="Times New Roman" w:hAnsi="Times New Roman" w:cs="Times New Roman"/>
+          <w:b/>
+        </w:rPr>
+      </w:pPr>
+    </w:p>
+    <w:p>
+      <w:pPr>
+        <w:rPr>
+          <w:rFonts w:ascii="Times New Roman" w:hAnsi="Times New Roman" w:cs="Times New Roman"/>
+          <w:b/>
+        </w:rPr>
+      </w:pPr>
+    </w:p>
+    <w:p>
+      <w:pPr>
+        <w:rPr>
+          <w:rFonts w:ascii="Times New Roman" w:hAnsi="Times New Roman" w:cs="Times New Roman"/>
+          <w:b/>
+        </w:rPr>
+      </w:pPr>
+    </w:p>
+    <w:p>
+      <w:pPr>
+        <w:rPr>
+          <w:rFonts w:ascii="Times New Roman" w:hAnsi="Times New Roman" w:cs="Times New Roman"/>
+          <w:b/>
+        </w:rPr>
+      </w:pPr>
+    </w:p>
+    <w:p>
+      <w:pPr>
+        <w:jc w:val="left"/>
+        <w:rPr>
+          <w:rFonts w:ascii="Times New Roman" w:hAnsi="Times New Roman" w:cs="Times New Roman"/>
+          <w:b/>
+        </w:rPr>
+      </w:pPr>
+    </w:p>
+    <w:p>
+      <w:pPr>
+        <w:jc w:val="left"/>
+        <w:rPr>
+          <w:rFonts w:ascii="Times New Roman" w:hAnsi="Times New Roman" w:cs="Times New Roman"/>
+          <w:b/>
+        </w:rPr>
+      </w:pPr>
+    </w:p>
+    <w:p>
+      <w:pPr>
+        <w:jc w:val="left"/>
+        <w:rPr>
+          <w:rFonts w:ascii="Times New Roman" w:hAnsi="Times New Roman" w:cs="Times New Roman"/>
+          <w:b/>
+        </w:rPr>
+      </w:pPr>
+    </w:p>
+    <w:p>
+      <w:pPr>
+        <w:jc w:val="left"/>
+        <w:rPr>
+          <w:rFonts w:ascii="Times New Roman" w:hAnsi="Times New Roman" w:cs="Times New Roman"/>
+          <w:b/>
+        </w:rPr>
+      </w:pPr>
+    </w:p>
+    <w:p>
+      <w:pPr>
+        <w:jc w:val="left"/>
+        <w:rPr>
+          <w:rFonts w:ascii="Times New Roman" w:hAnsi="Times New Roman" w:cs="Times New Roman"/>
+          <w:b/>
+        </w:rPr>
+      </w:pPr>
+    </w:p>
+    <w:p>
+      <w:pPr>
+        <w:jc w:val="left"/>
+        <w:rPr>
+          <w:rFonts w:ascii="Times New Roman" w:hAnsi="Times New Roman" w:cs="Times New Roman"/>
+          <w:b/>
+        </w:rPr>
+      </w:pPr>
+    </w:p>
+    <w:p>
+      <w:pPr>
+        <w:jc w:val="left"/>
+        <w:rPr>
+          <w:rFonts w:ascii="Times New Roman" w:hAnsi="Times New Roman" w:cs="Times New Roman"/>
+          <w:b/>
+        </w:rPr>
+      </w:pPr>
+    </w:p>
+    <w:p>
+      <w:pPr>
+        <w:pStyle w:val="Prrafodelista"/>
+        <w:numPr>
+          <w:ilvl w:val="0"/>
+          <w:numId w:val="25"/>
+        </w:numPr>
+        <w:jc w:val="center"/>
+        <w:rPr>
+          <w:rFonts w:ascii="Times New Roman" w:hAnsi="Times New Roman" w:cs="Times New Roman"/>
+          <w:b/>
+        </w:rPr>
+      </w:pPr>
+      <w:r>
+        <w:rPr>
+          <w:rFonts w:ascii="Times New Roman" w:hAnsi="Times New Roman" w:cs="Times New Roman"/>
+          <w:b/>
+        </w:rPr>
+        <w:lastRenderedPageBreak/>
+        <w:t>Conclusión</w:t>
+      </w:r>
+    </w:p>
+    <w:p>
+      <w:pPr>
+        <w:ind w:firstLine="708"/>
+        <w:jc w:val="left"/>
+        <w:rPr>
+          <w:rFonts w:ascii="Times New Roman" w:hAnsi="Times New Roman" w:cs="Times New Roman"/>
+        </w:rPr>
+      </w:pPr>
+      <w:r>
+        <w:rPr>
+          <w:rFonts w:ascii="Times New Roman" w:hAnsi="Times New Roman" w:cs="Times New Roman"/>
+        </w:rPr>
+        <w:t xml:space="preserve">La estructura definida permite organizar el proyecto por dominios funcionales, facilitando el desarrollo, despliegue y mantenimiento independiente de cada microservicio, conforme a las buenas prácticas de arquitecturas basadas en </w:t>
       </w:r>
       <w:proofErr w:type="spellStart"/>
       <w:r>
@@ -651,2160 +1646,8 @@
         <w:rPr>
           <w:rFonts w:ascii="Times New Roman" w:hAnsi="Times New Roman" w:cs="Times New Roman"/>
         </w:rPr>
-        <w:t xml:space="preserve"> para una EPS que garantice escalabilidad, alta disponibilidad, seguridad y desacoplamiento, apoyada en API Gateway, balanceadores de carga, bases de datos por servicio y mensajería asíncrona.</w:t>
-      </w:r>
-    </w:p>
-    <w:p>
-      <w:pPr>
-        <w:ind w:firstLine="708"/>
-        <w:rPr>
-          <w:rFonts w:ascii="Times New Roman" w:hAnsi="Times New Roman" w:cs="Times New Roman"/>
-        </w:rPr>
-      </w:pPr>
-    </w:p>
-    <w:p>
-      <w:pPr>
-        <w:ind w:firstLine="708"/>
-        <w:rPr>
-          <w:rFonts w:ascii="Times New Roman" w:hAnsi="Times New Roman" w:cs="Times New Roman"/>
-        </w:rPr>
-      </w:pPr>
-    </w:p>
-    <w:p>
-      <w:pPr>
-        <w:ind w:firstLine="708"/>
-        <w:rPr>
-          <w:rFonts w:ascii="Times New Roman" w:hAnsi="Times New Roman" w:cs="Times New Roman"/>
-        </w:rPr>
-      </w:pPr>
-    </w:p>
-    <w:p>
-      <w:pPr>
-        <w:ind w:firstLine="708"/>
-        <w:rPr>
-          <w:rFonts w:ascii="Times New Roman" w:hAnsi="Times New Roman" w:cs="Times New Roman"/>
-        </w:rPr>
-      </w:pPr>
-    </w:p>
-    <w:p>
-      <w:pPr>
-        <w:ind w:firstLine="708"/>
-        <w:rPr>
-          <w:rFonts w:ascii="Times New Roman" w:hAnsi="Times New Roman" w:cs="Times New Roman"/>
-        </w:rPr>
-      </w:pPr>
-    </w:p>
-    <w:p>
-      <w:pPr>
-        <w:ind w:firstLine="708"/>
-        <w:rPr>
-          <w:rFonts w:ascii="Times New Roman" w:hAnsi="Times New Roman" w:cs="Times New Roman"/>
-        </w:rPr>
-      </w:pPr>
-    </w:p>
-    <w:p>
-      <w:pPr>
-        <w:ind w:firstLine="708"/>
-        <w:rPr>
-          <w:rFonts w:ascii="Times New Roman" w:hAnsi="Times New Roman" w:cs="Times New Roman"/>
-        </w:rPr>
-      </w:pPr>
-    </w:p>
-    <w:p>
-      <w:pPr>
-        <w:ind w:firstLine="708"/>
-        <w:rPr>
-          <w:rFonts w:ascii="Times New Roman" w:hAnsi="Times New Roman" w:cs="Times New Roman"/>
-        </w:rPr>
-      </w:pPr>
-    </w:p>
-    <w:p>
-      <w:pPr>
-        <w:ind w:firstLine="708"/>
-        <w:rPr>
-          <w:rFonts w:ascii="Times New Roman" w:hAnsi="Times New Roman" w:cs="Times New Roman"/>
-        </w:rPr>
-      </w:pPr>
-    </w:p>
-    <w:p>
-      <w:pPr>
-        <w:ind w:firstLine="708"/>
-        <w:rPr>
-          <w:rFonts w:ascii="Times New Roman" w:hAnsi="Times New Roman" w:cs="Times New Roman"/>
-        </w:rPr>
-      </w:pPr>
-    </w:p>
-    <w:p>
-      <w:pPr>
-        <w:ind w:firstLine="708"/>
-        <w:rPr>
-          <w:rFonts w:ascii="Times New Roman" w:hAnsi="Times New Roman" w:cs="Times New Roman"/>
-        </w:rPr>
-      </w:pPr>
-    </w:p>
-    <w:p>
-      <w:pPr>
-        <w:ind w:firstLine="708"/>
-        <w:rPr>
-          <w:rFonts w:ascii="Times New Roman" w:hAnsi="Times New Roman" w:cs="Times New Roman"/>
-        </w:rPr>
-      </w:pPr>
-    </w:p>
-    <w:p>
-      <w:pPr>
-        <w:ind w:firstLine="708"/>
-        <w:rPr>
-          <w:rFonts w:ascii="Times New Roman" w:hAnsi="Times New Roman" w:cs="Times New Roman"/>
-        </w:rPr>
-      </w:pPr>
-    </w:p>
-    <w:p>
-      <w:pPr>
-        <w:ind w:firstLine="708"/>
-        <w:rPr>
-          <w:rFonts w:ascii="Times New Roman" w:hAnsi="Times New Roman" w:cs="Times New Roman"/>
-        </w:rPr>
-      </w:pPr>
-    </w:p>
-    <w:p>
-      <w:pPr>
-        <w:ind w:firstLine="708"/>
-        <w:rPr>
-          <w:rFonts w:ascii="Times New Roman" w:hAnsi="Times New Roman" w:cs="Times New Roman"/>
-        </w:rPr>
-      </w:pPr>
-    </w:p>
-    <w:p>
-      <w:pPr>
-        <w:ind w:firstLine="708"/>
-        <w:rPr>
-          <w:rFonts w:ascii="Times New Roman" w:hAnsi="Times New Roman" w:cs="Times New Roman"/>
-        </w:rPr>
-      </w:pPr>
-    </w:p>
-    <w:p>
-      <w:pPr>
-        <w:ind w:firstLine="708"/>
-        <w:rPr>
-          <w:rFonts w:ascii="Times New Roman" w:hAnsi="Times New Roman" w:cs="Times New Roman"/>
-        </w:rPr>
-      </w:pPr>
-    </w:p>
-    <w:p>
-      <w:pPr>
-        <w:ind w:firstLine="708"/>
-        <w:rPr>
-          <w:rFonts w:ascii="Times New Roman" w:hAnsi="Times New Roman" w:cs="Times New Roman"/>
-        </w:rPr>
-      </w:pPr>
-    </w:p>
-    <w:p>
-      <w:pPr>
-        <w:ind w:firstLine="708"/>
-        <w:rPr>
-          <w:rFonts w:ascii="Times New Roman" w:hAnsi="Times New Roman" w:cs="Times New Roman"/>
-        </w:rPr>
-      </w:pPr>
-    </w:p>
-    <w:p>
-      <w:pPr>
-        <w:ind w:firstLine="708"/>
-        <w:rPr>
-          <w:rFonts w:ascii="Times New Roman" w:hAnsi="Times New Roman" w:cs="Times New Roman"/>
-        </w:rPr>
-      </w:pPr>
-    </w:p>
-    <w:p>
-      <w:pPr>
-        <w:ind w:firstLine="708"/>
-        <w:jc w:val="center"/>
-        <w:rPr>
-          <w:rFonts w:ascii="Times New Roman" w:hAnsi="Times New Roman" w:cs="Times New Roman"/>
-          <w:b/>
-        </w:rPr>
-      </w:pPr>
-      <w:r>
-        <w:rPr>
-          <w:rFonts w:ascii="Times New Roman" w:hAnsi="Times New Roman" w:cs="Times New Roman"/>
-          <w:b/>
-        </w:rPr>
-        <w:lastRenderedPageBreak/>
-        <w:t>3. Descripción de la arquitectura</w:t>
-      </w:r>
-    </w:p>
-    <w:p>
-      <w:pPr>
-        <w:rPr>
-          <w:rFonts w:ascii="Times New Roman" w:hAnsi="Times New Roman" w:cs="Times New Roman"/>
-        </w:rPr>
-      </w:pPr>
-      <w:r>
-        <w:rPr>
-          <w:rFonts w:ascii="Times New Roman" w:hAnsi="Times New Roman" w:cs="Times New Roman"/>
-        </w:rPr>
-        <w:t>La arquitec</w:t>
-      </w:r>
-      <w:r>
-        <w:rPr>
-          <w:rFonts w:ascii="Times New Roman" w:hAnsi="Times New Roman" w:cs="Times New Roman"/>
-        </w:rPr>
-        <w:t>tura se organiza en seis capas:</w:t>
-      </w:r>
-    </w:p>
-    <w:p>
-      <w:pPr>
-        <w:pStyle w:val="Prrafodelista"/>
-        <w:numPr>
-          <w:ilvl w:val="0"/>
-          <w:numId w:val="4"/>
-        </w:numPr>
-        <w:rPr>
-          <w:rFonts w:ascii="Times New Roman" w:hAnsi="Times New Roman" w:cs="Times New Roman"/>
-        </w:rPr>
-      </w:pPr>
-      <w:r>
-        <w:rPr>
-          <w:rFonts w:ascii="Times New Roman" w:hAnsi="Times New Roman" w:cs="Times New Roman"/>
-          <w:b/>
-        </w:rPr>
-        <w:t>Clientes:</w:t>
-      </w:r>
-      <w:r>
-        <w:rPr>
-          <w:rFonts w:ascii="Times New Roman" w:hAnsi="Times New Roman" w:cs="Times New Roman"/>
-        </w:rPr>
-        <w:t xml:space="preserve"> </w:t>
-      </w:r>
-    </w:p>
-    <w:p>
-      <w:pPr>
-        <w:pStyle w:val="Prrafodelista"/>
-        <w:numPr>
-          <w:ilvl w:val="0"/>
-          <w:numId w:val="5"/>
-        </w:numPr>
-        <w:rPr>
-          <w:rFonts w:ascii="Times New Roman" w:hAnsi="Times New Roman" w:cs="Times New Roman"/>
-        </w:rPr>
-      </w:pPr>
-      <w:r>
-        <w:rPr>
-          <w:rFonts w:ascii="Times New Roman" w:hAnsi="Times New Roman" w:cs="Times New Roman"/>
-        </w:rPr>
-        <w:t>app móvil,</w:t>
-      </w:r>
-    </w:p>
-    <w:p>
-      <w:pPr>
-        <w:pStyle w:val="Prrafodelista"/>
-        <w:numPr>
-          <w:ilvl w:val="0"/>
-          <w:numId w:val="5"/>
-        </w:numPr>
-        <w:rPr>
-          <w:rFonts w:ascii="Times New Roman" w:hAnsi="Times New Roman" w:cs="Times New Roman"/>
-        </w:rPr>
-      </w:pPr>
-      <w:r>
-        <w:rPr>
-          <w:rFonts w:ascii="Times New Roman" w:hAnsi="Times New Roman" w:cs="Times New Roman"/>
-        </w:rPr>
-        <w:t xml:space="preserve">portal web </w:t>
-      </w:r>
-    </w:p>
-    <w:p>
-      <w:pPr>
-        <w:pStyle w:val="Prrafodelista"/>
-        <w:numPr>
-          <w:ilvl w:val="0"/>
-          <w:numId w:val="5"/>
-        </w:numPr>
-        <w:rPr>
-          <w:rFonts w:ascii="Times New Roman" w:hAnsi="Times New Roman" w:cs="Times New Roman"/>
-        </w:rPr>
-      </w:pPr>
-      <w:r>
-        <w:rPr>
-          <w:rFonts w:ascii="Times New Roman" w:hAnsi="Times New Roman" w:cs="Times New Roman"/>
-        </w:rPr>
-        <w:t>portal de prestadores y back-office.</w:t>
-      </w:r>
-    </w:p>
-    <w:p>
-      <w:pPr>
-        <w:pStyle w:val="Prrafodelista"/>
-        <w:ind w:left="1440"/>
-        <w:rPr>
-          <w:rFonts w:ascii="Times New Roman" w:hAnsi="Times New Roman" w:cs="Times New Roman"/>
-        </w:rPr>
-      </w:pPr>
-    </w:p>
-    <w:p>
-      <w:pPr>
-        <w:pStyle w:val="Prrafodelista"/>
-        <w:numPr>
-          <w:ilvl w:val="0"/>
-          <w:numId w:val="4"/>
-        </w:numPr>
-        <w:rPr>
-          <w:rFonts w:ascii="Times New Roman" w:hAnsi="Times New Roman" w:cs="Times New Roman"/>
-          <w:b/>
-        </w:rPr>
-      </w:pPr>
-      <w:r>
-        <w:rPr>
-          <w:rFonts w:ascii="Times New Roman" w:hAnsi="Times New Roman" w:cs="Times New Roman"/>
-          <w:b/>
-        </w:rPr>
-        <w:t>Borde y seguridad:</w:t>
-      </w:r>
-    </w:p>
-    <w:p>
-      <w:pPr>
-        <w:pStyle w:val="Prrafodelista"/>
-        <w:numPr>
-          <w:ilvl w:val="0"/>
-          <w:numId w:val="6"/>
-        </w:numPr>
-        <w:rPr>
-          <w:rFonts w:ascii="Times New Roman" w:hAnsi="Times New Roman" w:cs="Times New Roman"/>
-        </w:rPr>
-      </w:pPr>
-      <w:r>
-        <w:rPr>
-          <w:rFonts w:ascii="Times New Roman" w:hAnsi="Times New Roman" w:cs="Times New Roman"/>
-          <w:b/>
-        </w:rPr>
-        <w:t>Balanceador de carga (LB L7):</w:t>
-      </w:r>
-      <w:r>
-        <w:rPr>
-          <w:rFonts w:ascii="Times New Roman" w:hAnsi="Times New Roman" w:cs="Times New Roman"/>
-        </w:rPr>
-        <w:t xml:space="preserve"> distribuye el tráfico y evita puntos únicos de falla.</w:t>
-      </w:r>
-    </w:p>
-    <w:p>
-      <w:pPr>
-        <w:pStyle w:val="Prrafodelista"/>
-        <w:numPr>
-          <w:ilvl w:val="0"/>
-          <w:numId w:val="6"/>
-        </w:numPr>
-        <w:rPr>
-          <w:rFonts w:ascii="Times New Roman" w:hAnsi="Times New Roman" w:cs="Times New Roman"/>
-        </w:rPr>
-      </w:pPr>
-      <w:r>
-        <w:rPr>
-          <w:rFonts w:ascii="Times New Roman" w:hAnsi="Times New Roman" w:cs="Times New Roman"/>
-          <w:b/>
-        </w:rPr>
-        <w:t>API Gateway + IAM:</w:t>
-      </w:r>
-      <w:r>
-        <w:rPr>
-          <w:rFonts w:ascii="Times New Roman" w:hAnsi="Times New Roman" w:cs="Times New Roman"/>
-        </w:rPr>
-        <w:t xml:space="preserve"> punto único de entrada; gestiona autenticación (OAuth2/JWT), enrutamiento, </w:t>
-      </w:r>
-      <w:proofErr w:type="spellStart"/>
-      <w:r>
-        <w:rPr>
-          <w:rFonts w:ascii="Times New Roman" w:hAnsi="Times New Roman" w:cs="Times New Roman"/>
-        </w:rPr>
-        <w:t>rate</w:t>
-      </w:r>
-      <w:proofErr w:type="spellEnd"/>
-      <w:r>
-        <w:rPr>
-          <w:rFonts w:ascii="Times New Roman" w:hAnsi="Times New Roman" w:cs="Times New Roman"/>
-        </w:rPr>
-        <w:t xml:space="preserve"> </w:t>
-      </w:r>
-      <w:proofErr w:type="spellStart"/>
-      <w:r>
-        <w:rPr>
-          <w:rFonts w:ascii="Times New Roman" w:hAnsi="Times New Roman" w:cs="Times New Roman"/>
-        </w:rPr>
-        <w:t>limiting</w:t>
-      </w:r>
-      <w:proofErr w:type="spellEnd"/>
-      <w:r>
-        <w:rPr>
-          <w:rFonts w:ascii="Times New Roman" w:hAnsi="Times New Roman" w:cs="Times New Roman"/>
-        </w:rPr>
-        <w:t xml:space="preserve"> y auditoría.</w:t>
-      </w:r>
-    </w:p>
-    <w:p>
-      <w:pPr>
-        <w:pStyle w:val="Prrafodelista"/>
-        <w:ind w:left="1440"/>
-        <w:rPr>
-          <w:rFonts w:ascii="Times New Roman" w:hAnsi="Times New Roman" w:cs="Times New Roman"/>
-        </w:rPr>
-      </w:pPr>
-    </w:p>
-    <w:p>
-      <w:pPr>
-        <w:pStyle w:val="Prrafodelista"/>
-        <w:numPr>
-          <w:ilvl w:val="0"/>
-          <w:numId w:val="4"/>
-        </w:numPr>
-        <w:rPr>
-          <w:rFonts w:ascii="Times New Roman" w:hAnsi="Times New Roman" w:cs="Times New Roman"/>
-          <w:b/>
-        </w:rPr>
-      </w:pPr>
-      <w:r>
-        <w:rPr>
-          <w:rFonts w:ascii="Times New Roman" w:hAnsi="Times New Roman" w:cs="Times New Roman"/>
-          <w:b/>
-        </w:rPr>
-        <w:t>Microservicios de negocio (Core EPS)</w:t>
-      </w:r>
-      <w:r>
-        <w:rPr>
-          <w:rFonts w:ascii="Times New Roman" w:hAnsi="Times New Roman" w:cs="Times New Roman"/>
-          <w:b/>
-        </w:rPr>
-        <w:t>:</w:t>
-      </w:r>
-    </w:p>
-    <w:p>
-      <w:pPr>
-        <w:pStyle w:val="Prrafodelista"/>
-        <w:numPr>
-          <w:ilvl w:val="1"/>
-          <w:numId w:val="9"/>
-        </w:numPr>
-        <w:rPr>
-          <w:rFonts w:ascii="Times New Roman" w:hAnsi="Times New Roman" w:cs="Times New Roman"/>
-          <w:b/>
-        </w:rPr>
-      </w:pPr>
-      <w:r>
-        <w:rPr>
-          <w:rFonts w:ascii="Times New Roman" w:hAnsi="Times New Roman" w:cs="Times New Roman"/>
-          <w:b/>
-        </w:rPr>
-        <w:t xml:space="preserve">Afiliación y aportes </w:t>
-      </w:r>
-      <w:r>
-        <w:rPr>
-          <w:rFonts w:ascii="Times New Roman" w:hAnsi="Times New Roman" w:cs="Times New Roman"/>
-        </w:rPr>
-        <w:t>(Afiliados, recaudo PILA, coberturas):</w:t>
-      </w:r>
-      <w:r>
-        <w:rPr>
-          <w:rFonts w:ascii="Times New Roman" w:hAnsi="Times New Roman" w:cs="Times New Roman"/>
-          <w:b/>
-        </w:rPr>
-        <w:t xml:space="preserve"> </w:t>
-      </w:r>
-    </w:p>
-    <w:p>
-      <w:pPr>
-        <w:pStyle w:val="Prrafodelista"/>
-        <w:numPr>
-          <w:ilvl w:val="1"/>
-          <w:numId w:val="11"/>
-        </w:numPr>
-        <w:rPr>
-          <w:rFonts w:ascii="Times New Roman" w:hAnsi="Times New Roman" w:cs="Times New Roman"/>
-        </w:rPr>
-      </w:pPr>
-      <w:r>
-        <w:rPr>
-          <w:rFonts w:ascii="Times New Roman" w:hAnsi="Times New Roman" w:cs="Times New Roman"/>
-        </w:rPr>
-        <w:t>ms-</w:t>
-      </w:r>
-      <w:proofErr w:type="spellStart"/>
-      <w:r>
-        <w:rPr>
-          <w:rFonts w:ascii="Times New Roman" w:hAnsi="Times New Roman" w:cs="Times New Roman"/>
-        </w:rPr>
-        <w:t>afiliacion</w:t>
-      </w:r>
-      <w:proofErr w:type="spellEnd"/>
-    </w:p>
-    <w:p>
-      <w:pPr>
-        <w:pStyle w:val="Prrafodelista"/>
-        <w:numPr>
-          <w:ilvl w:val="1"/>
-          <w:numId w:val="11"/>
-        </w:numPr>
-        <w:rPr>
-          <w:rFonts w:ascii="Times New Roman" w:hAnsi="Times New Roman" w:cs="Times New Roman"/>
-        </w:rPr>
-      </w:pPr>
-      <w:r>
-        <w:rPr>
-          <w:rFonts w:ascii="Times New Roman" w:hAnsi="Times New Roman" w:cs="Times New Roman"/>
-        </w:rPr>
-        <w:t>ms-</w:t>
-      </w:r>
-      <w:proofErr w:type="spellStart"/>
-      <w:r>
-        <w:rPr>
-          <w:rFonts w:ascii="Times New Roman" w:hAnsi="Times New Roman" w:cs="Times New Roman"/>
-        </w:rPr>
-        <w:t>cotizacion</w:t>
-      </w:r>
-      <w:proofErr w:type="spellEnd"/>
-      <w:r>
-        <w:rPr>
-          <w:rFonts w:ascii="Times New Roman" w:hAnsi="Times New Roman" w:cs="Times New Roman"/>
-        </w:rPr>
-        <w:t>-recaudo</w:t>
-      </w:r>
-    </w:p>
-    <w:p>
-      <w:pPr>
-        <w:pStyle w:val="Prrafodelista"/>
-        <w:numPr>
-          <w:ilvl w:val="1"/>
-          <w:numId w:val="11"/>
-        </w:numPr>
-        <w:rPr>
-          <w:rFonts w:ascii="Times New Roman" w:hAnsi="Times New Roman" w:cs="Times New Roman"/>
-          <w:b/>
-        </w:rPr>
-      </w:pPr>
-      <w:r>
-        <w:rPr>
-          <w:rFonts w:ascii="Times New Roman" w:hAnsi="Times New Roman" w:cs="Times New Roman"/>
-        </w:rPr>
-        <w:t>ms-planes-beneficios</w:t>
-      </w:r>
-    </w:p>
-    <w:p>
-      <w:pPr>
-        <w:pStyle w:val="Prrafodelista"/>
-        <w:numPr>
-          <w:ilvl w:val="1"/>
-          <w:numId w:val="10"/>
-        </w:numPr>
-        <w:rPr>
-          <w:rFonts w:ascii="Times New Roman" w:hAnsi="Times New Roman" w:cs="Times New Roman"/>
-        </w:rPr>
-      </w:pPr>
-      <w:r>
-        <w:rPr>
-          <w:rFonts w:ascii="Times New Roman" w:hAnsi="Times New Roman" w:cs="Times New Roman"/>
-          <w:b/>
-        </w:rPr>
-        <w:t xml:space="preserve">Atención en </w:t>
-      </w:r>
-      <w:r>
-        <w:rPr>
-          <w:rFonts w:ascii="Times New Roman" w:hAnsi="Times New Roman" w:cs="Times New Roman"/>
-          <w:b/>
-        </w:rPr>
-        <w:t xml:space="preserve">salud </w:t>
-      </w:r>
-      <w:r>
-        <w:rPr>
-          <w:rFonts w:ascii="Times New Roman" w:hAnsi="Times New Roman" w:cs="Times New Roman"/>
-        </w:rPr>
-        <w:t>(</w:t>
-      </w:r>
-      <w:r>
-        <w:rPr>
-          <w:rFonts w:ascii="Times New Roman" w:hAnsi="Times New Roman" w:cs="Times New Roman"/>
-        </w:rPr>
-        <w:t>Autorizaciones, citas, atención)</w:t>
-      </w:r>
-      <w:r>
-        <w:rPr>
-          <w:rFonts w:ascii="Times New Roman" w:hAnsi="Times New Roman" w:cs="Times New Roman"/>
-        </w:rPr>
-        <w:t>:</w:t>
-      </w:r>
-    </w:p>
-    <w:p>
-      <w:pPr>
-        <w:pStyle w:val="Prrafodelista"/>
-        <w:numPr>
-          <w:ilvl w:val="2"/>
-          <w:numId w:val="10"/>
-        </w:numPr>
-        <w:rPr>
-          <w:rFonts w:ascii="Times New Roman" w:hAnsi="Times New Roman" w:cs="Times New Roman"/>
-        </w:rPr>
-      </w:pPr>
-      <w:r>
-        <w:rPr>
-          <w:rFonts w:ascii="Times New Roman" w:hAnsi="Times New Roman" w:cs="Times New Roman"/>
-        </w:rPr>
-        <w:t>ms-autorizaciones</w:t>
-      </w:r>
-    </w:p>
-    <w:p>
-      <w:pPr>
-        <w:pStyle w:val="Prrafodelista"/>
-        <w:numPr>
-          <w:ilvl w:val="2"/>
-          <w:numId w:val="10"/>
-        </w:numPr>
-        <w:rPr>
-          <w:rFonts w:ascii="Times New Roman" w:hAnsi="Times New Roman" w:cs="Times New Roman"/>
-        </w:rPr>
-      </w:pPr>
-      <w:r>
-        <w:rPr>
-          <w:rFonts w:ascii="Times New Roman" w:hAnsi="Times New Roman" w:cs="Times New Roman"/>
-        </w:rPr>
-        <w:t>ms-agendamiento-citas</w:t>
-      </w:r>
-    </w:p>
-    <w:p>
-      <w:pPr>
-        <w:pStyle w:val="Prrafodelista"/>
-        <w:numPr>
-          <w:ilvl w:val="2"/>
-          <w:numId w:val="10"/>
-        </w:numPr>
-        <w:rPr>
-          <w:rFonts w:ascii="Times New Roman" w:hAnsi="Times New Roman" w:cs="Times New Roman"/>
-        </w:rPr>
-      </w:pPr>
-      <w:r>
-        <w:rPr>
-          <w:rFonts w:ascii="Times New Roman" w:hAnsi="Times New Roman" w:cs="Times New Roman"/>
-        </w:rPr>
-        <w:t>ms-</w:t>
-      </w:r>
-      <w:proofErr w:type="spellStart"/>
-      <w:r>
-        <w:rPr>
-          <w:rFonts w:ascii="Times New Roman" w:hAnsi="Times New Roman" w:cs="Times New Roman"/>
-        </w:rPr>
-        <w:t>atencion</w:t>
-      </w:r>
-      <w:proofErr w:type="spellEnd"/>
-      <w:r>
-        <w:rPr>
-          <w:rFonts w:ascii="Times New Roman" w:hAnsi="Times New Roman" w:cs="Times New Roman"/>
-        </w:rPr>
-        <w:t>-</w:t>
-      </w:r>
-      <w:proofErr w:type="spellStart"/>
-      <w:r>
-        <w:rPr>
-          <w:rFonts w:ascii="Times New Roman" w:hAnsi="Times New Roman" w:cs="Times New Roman"/>
-        </w:rPr>
-        <w:t>clinica</w:t>
-      </w:r>
-      <w:proofErr w:type="spellEnd"/>
-    </w:p>
-    <w:p>
-      <w:pPr>
-        <w:pStyle w:val="Prrafodelista"/>
-        <w:numPr>
-          <w:ilvl w:val="1"/>
-          <w:numId w:val="15"/>
-        </w:numPr>
-        <w:rPr>
-          <w:rFonts w:ascii="Times New Roman" w:hAnsi="Times New Roman" w:cs="Times New Roman"/>
-          <w:b/>
-        </w:rPr>
-      </w:pPr>
-      <w:r>
-        <w:rPr>
-          <w:rFonts w:ascii="Times New Roman" w:hAnsi="Times New Roman" w:cs="Times New Roman"/>
-          <w:b/>
-        </w:rPr>
-        <w:t xml:space="preserve">Red y contratación </w:t>
-      </w:r>
-      <w:r>
-        <w:rPr>
-          <w:rFonts w:ascii="Times New Roman" w:hAnsi="Times New Roman" w:cs="Times New Roman"/>
-        </w:rPr>
-        <w:t>(IPS, contratos, tarifas):</w:t>
-      </w:r>
-    </w:p>
-    <w:p>
-      <w:pPr>
-        <w:pStyle w:val="Prrafodelista"/>
-        <w:numPr>
-          <w:ilvl w:val="2"/>
-          <w:numId w:val="16"/>
-        </w:numPr>
-        <w:rPr>
-          <w:rFonts w:ascii="Times New Roman" w:hAnsi="Times New Roman" w:cs="Times New Roman"/>
-        </w:rPr>
-      </w:pPr>
-      <w:r>
-        <w:rPr>
-          <w:rFonts w:ascii="Times New Roman" w:hAnsi="Times New Roman" w:cs="Times New Roman"/>
-        </w:rPr>
-        <w:t>ms-red-prestadores</w:t>
-      </w:r>
-    </w:p>
-    <w:p>
-      <w:pPr>
-        <w:pStyle w:val="Prrafodelista"/>
-        <w:numPr>
-          <w:ilvl w:val="2"/>
-          <w:numId w:val="16"/>
-        </w:numPr>
-        <w:rPr>
-          <w:rFonts w:ascii="Times New Roman" w:hAnsi="Times New Roman" w:cs="Times New Roman"/>
-        </w:rPr>
-      </w:pPr>
-      <w:r>
-        <w:rPr>
-          <w:rFonts w:ascii="Times New Roman" w:hAnsi="Times New Roman" w:cs="Times New Roman"/>
-        </w:rPr>
-        <w:t>ms-</w:t>
-      </w:r>
-      <w:proofErr w:type="spellStart"/>
-      <w:r>
-        <w:rPr>
-          <w:rFonts w:ascii="Times New Roman" w:hAnsi="Times New Roman" w:cs="Times New Roman"/>
-        </w:rPr>
-        <w:t>contratacion</w:t>
-      </w:r>
-      <w:proofErr w:type="spellEnd"/>
-    </w:p>
-    <w:p>
-      <w:pPr>
-        <w:pStyle w:val="Prrafodelista"/>
-        <w:numPr>
-          <w:ilvl w:val="1"/>
-          <w:numId w:val="15"/>
-        </w:numPr>
-        <w:rPr>
-          <w:rFonts w:ascii="Times New Roman" w:hAnsi="Times New Roman" w:cs="Times New Roman"/>
-        </w:rPr>
-      </w:pPr>
-      <w:r>
-        <w:rPr>
-          <w:rFonts w:ascii="Times New Roman" w:hAnsi="Times New Roman" w:cs="Times New Roman"/>
-          <w:b/>
-        </w:rPr>
-        <w:t xml:space="preserve">Facturación y pagos </w:t>
-      </w:r>
-      <w:r>
-        <w:rPr>
-          <w:rFonts w:ascii="Times New Roman" w:hAnsi="Times New Roman" w:cs="Times New Roman"/>
-        </w:rPr>
-        <w:t>(Radicación, auditoría, pagos):</w:t>
-      </w:r>
-    </w:p>
-    <w:p>
-      <w:pPr>
-        <w:pStyle w:val="Prrafodelista"/>
-        <w:numPr>
-          <w:ilvl w:val="2"/>
-          <w:numId w:val="15"/>
-        </w:numPr>
-        <w:rPr>
-          <w:rFonts w:ascii="Times New Roman" w:hAnsi="Times New Roman" w:cs="Times New Roman"/>
-        </w:rPr>
-      </w:pPr>
-      <w:r>
-        <w:rPr>
-          <w:rFonts w:ascii="Times New Roman" w:hAnsi="Times New Roman" w:cs="Times New Roman"/>
-        </w:rPr>
-        <w:t>ms-</w:t>
-      </w:r>
-      <w:proofErr w:type="spellStart"/>
-      <w:r>
-        <w:rPr>
-          <w:rFonts w:ascii="Times New Roman" w:hAnsi="Times New Roman" w:cs="Times New Roman"/>
-        </w:rPr>
-        <w:t>facturacion</w:t>
-      </w:r>
-      <w:proofErr w:type="spellEnd"/>
-      <w:r>
-        <w:rPr>
-          <w:rFonts w:ascii="Times New Roman" w:hAnsi="Times New Roman" w:cs="Times New Roman"/>
-        </w:rPr>
-        <w:t>-</w:t>
-      </w:r>
-      <w:proofErr w:type="spellStart"/>
-      <w:r>
-        <w:rPr>
-          <w:rFonts w:ascii="Times New Roman" w:hAnsi="Times New Roman" w:cs="Times New Roman"/>
-        </w:rPr>
-        <w:t>radicacion</w:t>
-      </w:r>
-      <w:proofErr w:type="spellEnd"/>
-    </w:p>
-    <w:p>
-      <w:pPr>
-        <w:pStyle w:val="Prrafodelista"/>
-        <w:numPr>
-          <w:ilvl w:val="2"/>
-          <w:numId w:val="15"/>
-        </w:numPr>
-        <w:rPr>
-          <w:rFonts w:ascii="Times New Roman" w:hAnsi="Times New Roman" w:cs="Times New Roman"/>
-        </w:rPr>
-      </w:pPr>
-      <w:r>
-        <w:rPr>
-          <w:rFonts w:ascii="Times New Roman" w:hAnsi="Times New Roman" w:cs="Times New Roman"/>
-        </w:rPr>
-        <w:t>ms-auditoria-medica</w:t>
-      </w:r>
-    </w:p>
-    <w:p>
-      <w:pPr>
-        <w:pStyle w:val="Prrafodelista"/>
-        <w:numPr>
-          <w:ilvl w:val="2"/>
-          <w:numId w:val="15"/>
-        </w:numPr>
-        <w:rPr>
-          <w:rFonts w:ascii="Times New Roman" w:hAnsi="Times New Roman" w:cs="Times New Roman"/>
-        </w:rPr>
-      </w:pPr>
-      <w:r>
-        <w:rPr>
-          <w:rFonts w:ascii="Times New Roman" w:hAnsi="Times New Roman" w:cs="Times New Roman"/>
-        </w:rPr>
-        <w:t>ms-pagos</w:t>
-      </w:r>
-    </w:p>
-    <w:p>
-      <w:pPr>
-        <w:pStyle w:val="Prrafodelista"/>
-        <w:numPr>
-          <w:ilvl w:val="1"/>
-          <w:numId w:val="15"/>
-        </w:numPr>
-        <w:rPr>
-          <w:rFonts w:ascii="Times New Roman" w:hAnsi="Times New Roman" w:cs="Times New Roman"/>
-          <w:b/>
-        </w:rPr>
-      </w:pPr>
-      <w:r>
-        <w:rPr>
-          <w:rFonts w:ascii="Times New Roman" w:hAnsi="Times New Roman" w:cs="Times New Roman"/>
-          <w:b/>
-        </w:rPr>
-        <w:t xml:space="preserve">Servicio al afiliado </w:t>
-      </w:r>
-      <w:r>
-        <w:rPr>
-          <w:rFonts w:ascii="Times New Roman" w:hAnsi="Times New Roman" w:cs="Times New Roman"/>
-        </w:rPr>
-        <w:t>(Peticiones, quejas, reclamos):</w:t>
-      </w:r>
-    </w:p>
-    <w:p>
-      <w:pPr>
-        <w:pStyle w:val="Prrafodelista"/>
-        <w:numPr>
-          <w:ilvl w:val="2"/>
-          <w:numId w:val="15"/>
-        </w:numPr>
-        <w:rPr>
-          <w:rFonts w:ascii="Times New Roman" w:hAnsi="Times New Roman" w:cs="Times New Roman"/>
-        </w:rPr>
-      </w:pPr>
-      <w:r>
-        <w:rPr>
-          <w:rFonts w:ascii="Times New Roman" w:hAnsi="Times New Roman" w:cs="Times New Roman"/>
-        </w:rPr>
-        <w:t>ms-</w:t>
-      </w:r>
-      <w:proofErr w:type="spellStart"/>
-      <w:r>
-        <w:rPr>
-          <w:rFonts w:ascii="Times New Roman" w:hAnsi="Times New Roman" w:cs="Times New Roman"/>
-        </w:rPr>
-        <w:t>pqrs</w:t>
-      </w:r>
-      <w:proofErr w:type="spellEnd"/>
-    </w:p>
-    <w:p>
-      <w:pPr>
-        <w:pStyle w:val="Prrafodelista"/>
-        <w:ind w:left="2160"/>
-        <w:rPr>
-          <w:rFonts w:ascii="Times New Roman" w:hAnsi="Times New Roman" w:cs="Times New Roman"/>
-          <w:b/>
-        </w:rPr>
-      </w:pPr>
-    </w:p>
-    <w:p>
-      <w:pPr>
-        <w:pStyle w:val="Prrafodelista"/>
-        <w:numPr>
-          <w:ilvl w:val="0"/>
-          <w:numId w:val="4"/>
-        </w:numPr>
-        <w:rPr>
-          <w:rFonts w:ascii="Times New Roman" w:hAnsi="Times New Roman" w:cs="Times New Roman"/>
-          <w:b/>
-        </w:rPr>
-      </w:pPr>
-      <w:r>
-        <w:rPr>
-          <w:rFonts w:ascii="Times New Roman" w:hAnsi="Times New Roman" w:cs="Times New Roman"/>
-          <w:b/>
-        </w:rPr>
-        <w:t>Microservicios de soporte</w:t>
-      </w:r>
-      <w:r>
-        <w:rPr>
-          <w:rFonts w:ascii="Times New Roman" w:hAnsi="Times New Roman" w:cs="Times New Roman"/>
-          <w:b/>
-        </w:rPr>
-        <w:t>:</w:t>
-      </w:r>
-    </w:p>
-    <w:p>
-      <w:pPr>
-        <w:pStyle w:val="Prrafodelista"/>
-        <w:numPr>
-          <w:ilvl w:val="0"/>
-          <w:numId w:val="20"/>
-        </w:numPr>
-        <w:rPr>
-          <w:rFonts w:ascii="Times New Roman" w:hAnsi="Times New Roman" w:cs="Times New Roman"/>
-        </w:rPr>
-      </w:pPr>
-      <w:r>
-        <w:rPr>
-          <w:rFonts w:ascii="Times New Roman" w:hAnsi="Times New Roman" w:cs="Times New Roman"/>
-        </w:rPr>
-        <w:t>ms-notificaciones</w:t>
-      </w:r>
-    </w:p>
-    <w:p>
-      <w:pPr>
-        <w:pStyle w:val="Prrafodelista"/>
-        <w:numPr>
-          <w:ilvl w:val="0"/>
-          <w:numId w:val="20"/>
-        </w:numPr>
-        <w:rPr>
-          <w:rFonts w:ascii="Times New Roman" w:hAnsi="Times New Roman" w:cs="Times New Roman"/>
-        </w:rPr>
-      </w:pPr>
-      <w:r>
-        <w:rPr>
-          <w:rFonts w:ascii="Times New Roman" w:hAnsi="Times New Roman" w:cs="Times New Roman"/>
-        </w:rPr>
-        <w:t>ms-documental</w:t>
-      </w:r>
-    </w:p>
-    <w:p>
-      <w:pPr>
-        <w:pStyle w:val="Prrafodelista"/>
-        <w:numPr>
-          <w:ilvl w:val="0"/>
-          <w:numId w:val="20"/>
-        </w:numPr>
-        <w:rPr>
-          <w:rFonts w:ascii="Times New Roman" w:hAnsi="Times New Roman" w:cs="Times New Roman"/>
-        </w:rPr>
-      </w:pPr>
-      <w:r>
-        <w:rPr>
-          <w:rFonts w:ascii="Times New Roman" w:hAnsi="Times New Roman" w:cs="Times New Roman"/>
-        </w:rPr>
-        <w:t>ms-</w:t>
-      </w:r>
-      <w:proofErr w:type="spellStart"/>
-      <w:r>
-        <w:rPr>
-          <w:rFonts w:ascii="Times New Roman" w:hAnsi="Times New Roman" w:cs="Times New Roman"/>
-        </w:rPr>
-        <w:t>catalogos</w:t>
-      </w:r>
-      <w:proofErr w:type="spellEnd"/>
-    </w:p>
-    <w:p>
-      <w:pPr>
-        <w:pStyle w:val="Prrafodelista"/>
-        <w:numPr>
-          <w:ilvl w:val="0"/>
-          <w:numId w:val="20"/>
-        </w:numPr>
-        <w:rPr>
-          <w:rFonts w:ascii="Times New Roman" w:hAnsi="Times New Roman" w:cs="Times New Roman"/>
-        </w:rPr>
-      </w:pPr>
-      <w:r>
-        <w:rPr>
-          <w:rFonts w:ascii="Times New Roman" w:hAnsi="Times New Roman" w:cs="Times New Roman"/>
-        </w:rPr>
-        <w:t>ms-reportes</w:t>
-      </w:r>
-    </w:p>
-    <w:p>
-      <w:pPr>
-        <w:pStyle w:val="Prrafodelista"/>
-        <w:ind w:left="1440"/>
-        <w:rPr>
-          <w:rFonts w:ascii="Times New Roman" w:hAnsi="Times New Roman" w:cs="Times New Roman"/>
-          <w:b/>
-        </w:rPr>
-      </w:pPr>
-    </w:p>
-    <w:p>
-      <w:pPr>
-        <w:pStyle w:val="Prrafodelista"/>
-        <w:numPr>
-          <w:ilvl w:val="0"/>
-          <w:numId w:val="4"/>
-        </w:numPr>
-        <w:rPr>
-          <w:rFonts w:ascii="Times New Roman" w:hAnsi="Times New Roman" w:cs="Times New Roman"/>
-          <w:b/>
-        </w:rPr>
-      </w:pPr>
-      <w:r>
-        <w:rPr>
-          <w:rFonts w:ascii="Times New Roman" w:hAnsi="Times New Roman" w:cs="Times New Roman"/>
-          <w:b/>
-        </w:rPr>
-        <w:lastRenderedPageBreak/>
-        <w:t>Persistencia (</w:t>
-      </w:r>
-      <w:proofErr w:type="spellStart"/>
-      <w:r>
-        <w:rPr>
-          <w:rFonts w:ascii="Times New Roman" w:hAnsi="Times New Roman" w:cs="Times New Roman"/>
-          <w:b/>
-        </w:rPr>
-        <w:t>Database</w:t>
-      </w:r>
-      <w:proofErr w:type="spellEnd"/>
-      <w:r>
-        <w:rPr>
-          <w:rFonts w:ascii="Times New Roman" w:hAnsi="Times New Roman" w:cs="Times New Roman"/>
-          <w:b/>
-        </w:rPr>
-        <w:t xml:space="preserve"> per </w:t>
-      </w:r>
-      <w:proofErr w:type="spellStart"/>
-      <w:r>
-        <w:rPr>
-          <w:rFonts w:ascii="Times New Roman" w:hAnsi="Times New Roman" w:cs="Times New Roman"/>
-          <w:b/>
-        </w:rPr>
-        <w:t>Service</w:t>
-      </w:r>
-      <w:proofErr w:type="spellEnd"/>
-      <w:r>
-        <w:rPr>
-          <w:rFonts w:ascii="Times New Roman" w:hAnsi="Times New Roman" w:cs="Times New Roman"/>
-          <w:b/>
-        </w:rPr>
-        <w:t>):</w:t>
-      </w:r>
-    </w:p>
-    <w:p>
-      <w:pPr>
-        <w:pStyle w:val="Prrafodelista"/>
-        <w:numPr>
-          <w:ilvl w:val="0"/>
-          <w:numId w:val="21"/>
-        </w:numPr>
-        <w:rPr>
-          <w:rFonts w:ascii="Times New Roman" w:hAnsi="Times New Roman" w:cs="Times New Roman"/>
-        </w:rPr>
-      </w:pPr>
-      <w:proofErr w:type="spellStart"/>
-      <w:r>
-        <w:rPr>
-          <w:rFonts w:ascii="Times New Roman" w:hAnsi="Times New Roman" w:cs="Times New Roman"/>
-        </w:rPr>
-        <w:t>PostgreSQL</w:t>
-      </w:r>
-      <w:proofErr w:type="spellEnd"/>
-      <w:r>
-        <w:rPr>
-          <w:rFonts w:ascii="Times New Roman" w:hAnsi="Times New Roman" w:cs="Times New Roman"/>
-        </w:rPr>
-        <w:t xml:space="preserve"> (transaccional), </w:t>
-      </w:r>
-    </w:p>
-    <w:p>
-      <w:pPr>
-        <w:pStyle w:val="Prrafodelista"/>
-        <w:numPr>
-          <w:ilvl w:val="0"/>
-          <w:numId w:val="21"/>
-        </w:numPr>
-        <w:rPr>
-          <w:rFonts w:ascii="Times New Roman" w:hAnsi="Times New Roman" w:cs="Times New Roman"/>
-        </w:rPr>
-      </w:pPr>
-      <w:proofErr w:type="spellStart"/>
-      <w:r>
-        <w:rPr>
-          <w:rFonts w:ascii="Times New Roman" w:hAnsi="Times New Roman" w:cs="Times New Roman"/>
-        </w:rPr>
-        <w:t>MongoDB</w:t>
-      </w:r>
-      <w:proofErr w:type="spellEnd"/>
-      <w:r>
-        <w:rPr>
-          <w:rFonts w:ascii="Times New Roman" w:hAnsi="Times New Roman" w:cs="Times New Roman"/>
-        </w:rPr>
-        <w:t xml:space="preserve"> (documental), </w:t>
-      </w:r>
-    </w:p>
-    <w:p>
-      <w:pPr>
-        <w:pStyle w:val="Prrafodelista"/>
-        <w:numPr>
-          <w:ilvl w:val="0"/>
-          <w:numId w:val="21"/>
-        </w:numPr>
-        <w:rPr>
-          <w:rFonts w:ascii="Times New Roman" w:hAnsi="Times New Roman" w:cs="Times New Roman"/>
-        </w:rPr>
-      </w:pPr>
-      <w:proofErr w:type="spellStart"/>
-      <w:r>
-        <w:rPr>
-          <w:rFonts w:ascii="Times New Roman" w:hAnsi="Times New Roman" w:cs="Times New Roman"/>
-        </w:rPr>
-        <w:t>Redis</w:t>
-      </w:r>
-      <w:proofErr w:type="spellEnd"/>
-      <w:r>
-        <w:rPr>
-          <w:rFonts w:ascii="Times New Roman" w:hAnsi="Times New Roman" w:cs="Times New Roman"/>
-        </w:rPr>
-        <w:t xml:space="preserve"> (caché), </w:t>
-      </w:r>
-    </w:p>
-    <w:p>
-      <w:pPr>
-        <w:pStyle w:val="Prrafodelista"/>
-        <w:numPr>
-          <w:ilvl w:val="0"/>
-          <w:numId w:val="21"/>
-        </w:numPr>
-        <w:rPr>
-          <w:rFonts w:ascii="Times New Roman" w:hAnsi="Times New Roman" w:cs="Times New Roman"/>
-        </w:rPr>
-      </w:pPr>
-      <w:r>
-        <w:rPr>
-          <w:rFonts w:ascii="Times New Roman" w:hAnsi="Times New Roman" w:cs="Times New Roman"/>
-        </w:rPr>
-        <w:t>S3 (documentos).</w:t>
-      </w:r>
-    </w:p>
-    <w:p>
-      <w:pPr>
-        <w:pStyle w:val="Prrafodelista"/>
-        <w:ind w:left="1440"/>
-        <w:rPr>
-          <w:rFonts w:ascii="Times New Roman" w:hAnsi="Times New Roman" w:cs="Times New Roman"/>
-        </w:rPr>
-      </w:pPr>
-    </w:p>
-    <w:p>
-      <w:pPr>
-        <w:pStyle w:val="Prrafodelista"/>
-        <w:numPr>
-          <w:ilvl w:val="0"/>
-          <w:numId w:val="4"/>
-        </w:numPr>
-        <w:rPr>
-          <w:rFonts w:ascii="Times New Roman" w:hAnsi="Times New Roman" w:cs="Times New Roman"/>
-          <w:b/>
-        </w:rPr>
-      </w:pPr>
-      <w:r>
-        <w:rPr>
-          <w:rFonts w:ascii="Times New Roman" w:hAnsi="Times New Roman" w:cs="Times New Roman"/>
-          <w:b/>
-        </w:rPr>
-        <w:t xml:space="preserve">Mensajería: </w:t>
-      </w:r>
-      <w:r>
-        <w:rPr>
-          <w:rFonts w:ascii="Times New Roman" w:hAnsi="Times New Roman" w:cs="Times New Roman"/>
-        </w:rPr>
-        <w:t xml:space="preserve">Kafka como </w:t>
-      </w:r>
-      <w:proofErr w:type="spellStart"/>
-      <w:r>
-        <w:rPr>
-          <w:rFonts w:ascii="Times New Roman" w:hAnsi="Times New Roman" w:cs="Times New Roman"/>
-        </w:rPr>
-        <w:t>backbone</w:t>
-      </w:r>
-      <w:proofErr w:type="spellEnd"/>
-      <w:r>
-        <w:rPr>
-          <w:rFonts w:ascii="Times New Roman" w:hAnsi="Times New Roman" w:cs="Times New Roman"/>
-        </w:rPr>
-        <w:t xml:space="preserve"> de eventos</w:t>
-      </w:r>
-    </w:p>
-    <w:p>
-      <w:pPr>
-        <w:rPr>
-          <w:rFonts w:ascii="Times New Roman" w:hAnsi="Times New Roman" w:cs="Times New Roman"/>
-          <w:b/>
-        </w:rPr>
-      </w:pPr>
-    </w:p>
-    <w:p>
-      <w:pPr>
-        <w:rPr>
-          <w:rFonts w:ascii="Times New Roman" w:hAnsi="Times New Roman" w:cs="Times New Roman"/>
-          <w:b/>
-        </w:rPr>
-      </w:pPr>
-    </w:p>
-    <w:p>
-      <w:pPr>
-        <w:rPr>
-          <w:rFonts w:ascii="Times New Roman" w:hAnsi="Times New Roman" w:cs="Times New Roman"/>
-          <w:b/>
-        </w:rPr>
-      </w:pPr>
-    </w:p>
-    <w:p>
-      <w:pPr>
-        <w:rPr>
-          <w:rFonts w:ascii="Times New Roman" w:hAnsi="Times New Roman" w:cs="Times New Roman"/>
-          <w:b/>
-        </w:rPr>
-      </w:pPr>
-    </w:p>
-    <w:p>
-      <w:pPr>
-        <w:rPr>
-          <w:rFonts w:ascii="Times New Roman" w:hAnsi="Times New Roman" w:cs="Times New Roman"/>
-          <w:b/>
-        </w:rPr>
-      </w:pPr>
-    </w:p>
-    <w:p>
-      <w:pPr>
-        <w:rPr>
-          <w:rFonts w:ascii="Times New Roman" w:hAnsi="Times New Roman" w:cs="Times New Roman"/>
-          <w:b/>
-        </w:rPr>
-      </w:pPr>
-    </w:p>
-    <w:p>
-      <w:pPr>
-        <w:rPr>
-          <w:rFonts w:ascii="Times New Roman" w:hAnsi="Times New Roman" w:cs="Times New Roman"/>
-          <w:b/>
-        </w:rPr>
-      </w:pPr>
-    </w:p>
-    <w:p>
-      <w:pPr>
-        <w:rPr>
-          <w:rFonts w:ascii="Times New Roman" w:hAnsi="Times New Roman" w:cs="Times New Roman"/>
-          <w:b/>
-        </w:rPr>
-      </w:pPr>
-    </w:p>
-    <w:p>
-      <w:pPr>
-        <w:rPr>
-          <w:rFonts w:ascii="Times New Roman" w:hAnsi="Times New Roman" w:cs="Times New Roman"/>
-          <w:b/>
-        </w:rPr>
-      </w:pPr>
-    </w:p>
-    <w:p>
-      <w:pPr>
-        <w:rPr>
-          <w:rFonts w:ascii="Times New Roman" w:hAnsi="Times New Roman" w:cs="Times New Roman"/>
-          <w:b/>
-        </w:rPr>
-      </w:pPr>
-    </w:p>
-    <w:p>
-      <w:pPr>
-        <w:rPr>
-          <w:rFonts w:ascii="Times New Roman" w:hAnsi="Times New Roman" w:cs="Times New Roman"/>
-          <w:b/>
-        </w:rPr>
-      </w:pPr>
-    </w:p>
-    <w:p>
-      <w:pPr>
-        <w:rPr>
-          <w:rFonts w:ascii="Times New Roman" w:hAnsi="Times New Roman" w:cs="Times New Roman"/>
-          <w:b/>
-        </w:rPr>
-      </w:pPr>
-    </w:p>
-    <w:p>
-      <w:pPr>
-        <w:rPr>
-          <w:rFonts w:ascii="Times New Roman" w:hAnsi="Times New Roman" w:cs="Times New Roman"/>
-          <w:b/>
-        </w:rPr>
-      </w:pPr>
-    </w:p>
-    <w:p>
-      <w:pPr>
-        <w:rPr>
-          <w:rFonts w:ascii="Times New Roman" w:hAnsi="Times New Roman" w:cs="Times New Roman"/>
-          <w:b/>
-        </w:rPr>
-      </w:pPr>
-    </w:p>
-    <w:p>
-      <w:pPr>
-        <w:rPr>
-          <w:rFonts w:ascii="Times New Roman" w:hAnsi="Times New Roman" w:cs="Times New Roman"/>
-          <w:b/>
-        </w:rPr>
-      </w:pPr>
-    </w:p>
-    <w:p>
-      <w:pPr>
-        <w:rPr>
-          <w:rFonts w:ascii="Times New Roman" w:hAnsi="Times New Roman" w:cs="Times New Roman"/>
-          <w:b/>
-        </w:rPr>
-      </w:pPr>
-    </w:p>
-    <w:p>
-      <w:pPr>
-        <w:rPr>
-          <w:rFonts w:ascii="Times New Roman" w:hAnsi="Times New Roman" w:cs="Times New Roman"/>
-          <w:b/>
-        </w:rPr>
-      </w:pPr>
-    </w:p>
-    <w:p>
-      <w:pPr>
-        <w:rPr>
-          <w:rFonts w:ascii="Times New Roman" w:hAnsi="Times New Roman" w:cs="Times New Roman"/>
-          <w:b/>
-        </w:rPr>
-      </w:pPr>
-    </w:p>
-    <w:p>
-      <w:pPr>
-        <w:rPr>
-          <w:rFonts w:ascii="Times New Roman" w:hAnsi="Times New Roman" w:cs="Times New Roman"/>
-          <w:b/>
-        </w:rPr>
-      </w:pPr>
-    </w:p>
-    <w:p>
-      <w:pPr>
-        <w:jc w:val="center"/>
-        <w:rPr>
-          <w:rFonts w:ascii="Times New Roman" w:hAnsi="Times New Roman" w:cs="Times New Roman"/>
-          <w:b/>
-        </w:rPr>
-      </w:pPr>
-      <w:r>
-        <w:rPr>
-          <w:rFonts w:ascii="Times New Roman" w:hAnsi="Times New Roman" w:cs="Times New Roman"/>
-          <w:b/>
-          <w:noProof/>
-          <w:lang w:eastAsia="es-CO"/>
-        </w:rPr>
-        <w:lastRenderedPageBreak/>
-        <w:drawing>
-          <wp:anchor distT="0" distB="0" distL="114300" distR="114300" simplePos="0" relativeHeight="251659264" behindDoc="0" locked="0" layoutInCell="1" allowOverlap="1" wp14:anchorId="3B8A663C" wp14:editId="4780CE09">
-            <wp:simplePos x="0" y="0"/>
-            <wp:positionH relativeFrom="column">
-              <wp:posOffset>-822960</wp:posOffset>
-            </wp:positionH>
-            <wp:positionV relativeFrom="paragraph">
-              <wp:posOffset>357505</wp:posOffset>
-            </wp:positionV>
-            <wp:extent cx="7376795" cy="4476750"/>
-            <wp:effectExtent l="0" t="0" r="0" b="0"/>
-            <wp:wrapThrough wrapText="bothSides">
-              <wp:wrapPolygon edited="0">
-                <wp:start x="0" y="0"/>
-                <wp:lineTo x="0" y="21508"/>
-                <wp:lineTo x="21531" y="21508"/>
-                <wp:lineTo x="21531" y="0"/>
-                <wp:lineTo x="0" y="0"/>
-              </wp:wrapPolygon>
-            </wp:wrapThrough>
-            <wp:docPr id="2" name="Imagen 2" descr="C:\Users\USER\Desktop\Arquitectura_MS_EPS.png"/>
-            <wp:cNvGraphicFramePr>
-              <a:graphicFrameLocks xmlns:a="http://schemas.openxmlformats.org/drawingml/2006/main" noChangeAspect="1"/>
-            </wp:cNvGraphicFramePr>
-            <a:graphic xmlns:a="http://schemas.openxmlformats.org/drawingml/2006/main">
-              <a:graphicData uri="http://schemas.openxmlformats.org/drawingml/2006/picture">
-                <pic:pic xmlns:pic="http://schemas.openxmlformats.org/drawingml/2006/picture">
-                  <pic:nvPicPr>
-                    <pic:cNvPr id="0" name="Picture 1" descr="C:\Users\USER\Desktop\Arquitectura_MS_EPS.png"/>
-                    <pic:cNvPicPr>
-                      <a:picLocks noChangeAspect="1" noChangeArrowheads="1"/>
-                    </pic:cNvPicPr>
-                  </pic:nvPicPr>
-                  <pic:blipFill>
-                    <a:blip r:embed="rId7" cstate="print">
-                      <a:extLst>
-                        <a:ext uri="{28A0092B-C50C-407E-A947-70E740481C1C}">
-                          <a14:useLocalDpi xmlns:a14="http://schemas.microsoft.com/office/drawing/2010/main" val="0"/>
-                        </a:ext>
-                      </a:extLst>
-                    </a:blip>
-                    <a:srcRect/>
-                    <a:stretch>
-                      <a:fillRect/>
-                    </a:stretch>
-                  </pic:blipFill>
-                  <pic:spPr bwMode="auto">
-                    <a:xfrm>
-                      <a:off x="0" y="0"/>
-                      <a:ext cx="7376795" cy="4476750"/>
-                    </a:xfrm>
-                    <a:prstGeom prst="rect">
-                      <a:avLst/>
-                    </a:prstGeom>
-                    <a:noFill/>
-                    <a:ln>
-                      <a:noFill/>
-                    </a:ln>
-                  </pic:spPr>
-                </pic:pic>
-              </a:graphicData>
-            </a:graphic>
-            <wp14:sizeRelH relativeFrom="margin">
-              <wp14:pctWidth>0</wp14:pctWidth>
-            </wp14:sizeRelH>
-            <wp14:sizeRelV relativeFrom="margin">
-              <wp14:pctHeight>0</wp14:pctHeight>
-            </wp14:sizeRelV>
-          </wp:anchor>
-        </w:drawing>
-      </w:r>
-      <w:r>
-        <w:rPr>
-          <w:rFonts w:ascii="Times New Roman" w:hAnsi="Times New Roman" w:cs="Times New Roman"/>
-          <w:b/>
-        </w:rPr>
-        <w:t>4. Diagrama de la arquitectura (</w:t>
-      </w:r>
-      <w:proofErr w:type="spellStart"/>
-      <w:r>
-        <w:rPr>
-          <w:rFonts w:ascii="Times New Roman" w:hAnsi="Times New Roman" w:cs="Times New Roman"/>
-          <w:b/>
-        </w:rPr>
-        <w:t>PlantUML</w:t>
-      </w:r>
-      <w:proofErr w:type="spellEnd"/>
-      <w:r>
-        <w:rPr>
-          <w:rFonts w:ascii="Times New Roman" w:hAnsi="Times New Roman" w:cs="Times New Roman"/>
-          <w:b/>
-        </w:rPr>
-        <w:t>)</w:t>
-      </w:r>
-    </w:p>
-    <w:p>
-      <w:pPr>
-        <w:rPr>
-          <w:rFonts w:ascii="Times New Roman" w:hAnsi="Times New Roman" w:cs="Times New Roman"/>
-          <w:b/>
-        </w:rPr>
-      </w:pPr>
-    </w:p>
-    <w:p>
-      <w:pPr>
-        <w:rPr>
-          <w:rFonts w:ascii="Times New Roman" w:hAnsi="Times New Roman" w:cs="Times New Roman"/>
-          <w:b/>
-        </w:rPr>
-      </w:pPr>
-    </w:p>
-    <w:p>
-      <w:pPr>
-        <w:rPr>
-          <w:rFonts w:ascii="Times New Roman" w:hAnsi="Times New Roman" w:cs="Times New Roman"/>
-          <w:b/>
-        </w:rPr>
-      </w:pPr>
-    </w:p>
-    <w:p>
-      <w:pPr>
-        <w:rPr>
-          <w:rFonts w:ascii="Times New Roman" w:hAnsi="Times New Roman" w:cs="Times New Roman"/>
-          <w:b/>
-        </w:rPr>
-      </w:pPr>
-    </w:p>
-    <w:p>
-      <w:pPr>
-        <w:rPr>
-          <w:rFonts w:ascii="Times New Roman" w:hAnsi="Times New Roman" w:cs="Times New Roman"/>
-          <w:b/>
-        </w:rPr>
-      </w:pPr>
-    </w:p>
-    <w:p>
-      <w:pPr>
-        <w:rPr>
-          <w:rFonts w:ascii="Times New Roman" w:hAnsi="Times New Roman" w:cs="Times New Roman"/>
-          <w:b/>
-        </w:rPr>
-      </w:pPr>
-    </w:p>
-    <w:p>
-      <w:pPr>
-        <w:rPr>
-          <w:rFonts w:ascii="Times New Roman" w:hAnsi="Times New Roman" w:cs="Times New Roman"/>
-          <w:b/>
-        </w:rPr>
-      </w:pPr>
-    </w:p>
-    <w:p>
-      <w:pPr>
-        <w:rPr>
-          <w:rFonts w:ascii="Times New Roman" w:hAnsi="Times New Roman" w:cs="Times New Roman"/>
-          <w:b/>
-        </w:rPr>
-      </w:pPr>
-    </w:p>
-    <w:p>
-      <w:pPr>
-        <w:rPr>
-          <w:rFonts w:ascii="Times New Roman" w:hAnsi="Times New Roman" w:cs="Times New Roman"/>
-          <w:b/>
-        </w:rPr>
-      </w:pPr>
-    </w:p>
-    <w:p>
-      <w:pPr>
-        <w:jc w:val="center"/>
-        <w:rPr>
-          <w:rFonts w:ascii="Times New Roman" w:hAnsi="Times New Roman" w:cs="Times New Roman"/>
-          <w:b/>
-        </w:rPr>
-      </w:pPr>
-      <w:r>
-        <w:rPr>
-          <w:rFonts w:ascii="Times New Roman" w:hAnsi="Times New Roman" w:cs="Times New Roman"/>
-          <w:b/>
-        </w:rPr>
-        <w:lastRenderedPageBreak/>
-        <w:t xml:space="preserve">5. </w:t>
-      </w:r>
-      <w:r>
-        <w:rPr>
-          <w:rFonts w:ascii="Times New Roman" w:hAnsi="Times New Roman" w:cs="Times New Roman"/>
-          <w:b/>
-        </w:rPr>
-        <w:t>Justificación y Beneficios</w:t>
-      </w:r>
-      <w:r>
-        <w:rPr>
-          <w:rFonts w:ascii="Times New Roman" w:hAnsi="Times New Roman" w:cs="Times New Roman"/>
-          <w:b/>
-        </w:rPr>
-        <w:br/>
-      </w:r>
-    </w:p>
-    <w:p>
-      <w:pPr>
-        <w:jc w:val="left"/>
-        <w:rPr>
-          <w:rFonts w:ascii="Times New Roman" w:hAnsi="Times New Roman" w:cs="Times New Roman"/>
-          <w:b/>
-        </w:rPr>
-      </w:pPr>
-      <w:r>
-        <w:rPr>
-          <w:rFonts w:ascii="Times New Roman" w:hAnsi="Times New Roman" w:cs="Times New Roman"/>
-          <w:b/>
-        </w:rPr>
-        <w:t xml:space="preserve">5.1 </w:t>
-      </w:r>
-      <w:r>
-        <w:rPr>
-          <w:rFonts w:ascii="Times New Roman" w:hAnsi="Times New Roman" w:cs="Times New Roman"/>
-          <w:b/>
-        </w:rPr>
-        <w:t>Justificación</w:t>
-      </w:r>
-      <w:r>
-        <w:rPr>
-          <w:rFonts w:ascii="Times New Roman" w:hAnsi="Times New Roman" w:cs="Times New Roman"/>
-          <w:b/>
-        </w:rPr>
-        <w:t>:</w:t>
-      </w:r>
-    </w:p>
-    <w:p>
-      <w:pPr>
-        <w:ind w:firstLine="708"/>
-        <w:rPr>
-          <w:rFonts w:ascii="Times New Roman" w:hAnsi="Times New Roman" w:cs="Times New Roman"/>
-        </w:rPr>
-      </w:pPr>
-      <w:r>
-        <w:rPr>
-          <w:rFonts w:ascii="Times New Roman" w:hAnsi="Times New Roman" w:cs="Times New Roman"/>
-        </w:rPr>
-        <w:t xml:space="preserve">Las EPS operan en un entorno de alta complejidad: millones de afiliados, integración con prestadores, ADRES, </w:t>
-      </w:r>
-      <w:proofErr w:type="spellStart"/>
-      <w:r>
-        <w:rPr>
-          <w:rFonts w:ascii="Times New Roman" w:hAnsi="Times New Roman" w:cs="Times New Roman"/>
-        </w:rPr>
-        <w:t>Supersalud</w:t>
-      </w:r>
-      <w:proofErr w:type="spellEnd"/>
-      <w:r>
-        <w:rPr>
-          <w:rFonts w:ascii="Times New Roman" w:hAnsi="Times New Roman" w:cs="Times New Roman"/>
-        </w:rPr>
-        <w:t xml:space="preserve"> y otras entidades, además de estrictos requisitos normativos (Ley 1581 de 2012, Resolución 866 de 2017, estándares HL7 FHIR) y la necesidad de disponibilidad 24/7. Un sistema monolítico dificulta escalar áreas específicas, realizar despliegues sin afectar todo el sistema y mantener equip</w:t>
-      </w:r>
-      <w:r>
-        <w:rPr>
-          <w:rFonts w:ascii="Times New Roman" w:hAnsi="Times New Roman" w:cs="Times New Roman"/>
-        </w:rPr>
-        <w:t>os autónomos por dominio.</w:t>
-      </w:r>
-    </w:p>
-    <w:p>
-      <w:pPr>
-        <w:ind w:firstLine="708"/>
-        <w:rPr>
-          <w:rFonts w:ascii="Times New Roman" w:hAnsi="Times New Roman" w:cs="Times New Roman"/>
-        </w:rPr>
-      </w:pPr>
-      <w:r>
-        <w:rPr>
-          <w:rFonts w:ascii="Times New Roman" w:hAnsi="Times New Roman" w:cs="Times New Roman"/>
-        </w:rPr>
-        <w:t xml:space="preserve">Por ello, se propone una arquitectura de </w:t>
-      </w:r>
-      <w:proofErr w:type="spellStart"/>
-      <w:r>
-        <w:rPr>
-          <w:rFonts w:ascii="Times New Roman" w:hAnsi="Times New Roman" w:cs="Times New Roman"/>
-        </w:rPr>
-        <w:t>microservicios</w:t>
-      </w:r>
-      <w:proofErr w:type="spellEnd"/>
-      <w:r>
-        <w:rPr>
-          <w:rFonts w:ascii="Times New Roman" w:hAnsi="Times New Roman" w:cs="Times New Roman"/>
-        </w:rPr>
-        <w:t xml:space="preserve"> que divide el sistema en servicios independientes alineados a los dominios funcionales de la EPS (afiliación, autorizaciones, facturación, pagos, PQRS, entre otros). Cada servicio puede desplegarse, escalar y evolucionar de forma autónoma, se comunica mediante </w:t>
-      </w:r>
-      <w:proofErr w:type="spellStart"/>
-      <w:r>
-        <w:rPr>
-          <w:rFonts w:ascii="Times New Roman" w:hAnsi="Times New Roman" w:cs="Times New Roman"/>
-        </w:rPr>
-        <w:t>APIs</w:t>
-      </w:r>
-      <w:proofErr w:type="spellEnd"/>
-      <w:r>
-        <w:rPr>
-          <w:rFonts w:ascii="Times New Roman" w:hAnsi="Times New Roman" w:cs="Times New Roman"/>
-        </w:rPr>
-        <w:t xml:space="preserve"> (síncrono) y eventos (asíncrono) y administra su propia base de datos, evitando el acoplamiento entre áreas. El API Gateway centraliza la seguridad y el enrutamiento, mientras que el balanceador de carga garantiza alta disponibilidad desde el borde. Kafka desacopla los procesos de larga duración (notificaciones, analítica, auditoría), permitiendo que los servicios reaccionen a e</w:t>
-      </w:r>
-      <w:r>
-        <w:rPr>
-          <w:rFonts w:ascii="Times New Roman" w:hAnsi="Times New Roman" w:cs="Times New Roman"/>
-        </w:rPr>
-        <w:t>ventos sin bloquearse entre sí.</w:t>
-      </w:r>
-    </w:p>
-    <w:p>
-      <w:pPr>
-        <w:ind w:firstLine="708"/>
-        <w:rPr>
-          <w:rFonts w:ascii="Times New Roman" w:hAnsi="Times New Roman" w:cs="Times New Roman"/>
-        </w:rPr>
-      </w:pPr>
-      <w:r>
-        <w:rPr>
-          <w:rFonts w:ascii="Times New Roman" w:hAnsi="Times New Roman" w:cs="Times New Roman"/>
-        </w:rPr>
-        <w:t>En conjunto, esta arquitectura responde a las necesidades reales del negocio: escalabilidad por demanda, resiliencia ante fallos, integración con terceros, cumplimiento normativo y evolución tecnológica continua.</w:t>
-      </w:r>
-    </w:p>
-    <w:p>
-      <w:pPr>
-        <w:jc w:val="left"/>
-        <w:rPr>
-          <w:rFonts w:ascii="Times New Roman" w:hAnsi="Times New Roman" w:cs="Times New Roman"/>
-          <w:b/>
-        </w:rPr>
-      </w:pPr>
-      <w:r>
-        <w:rPr>
-          <w:rFonts w:ascii="Times New Roman" w:hAnsi="Times New Roman" w:cs="Times New Roman"/>
-          <w:b/>
-        </w:rPr>
-        <w:t>5.2 Beneficios</w:t>
-      </w:r>
-      <w:r>
-        <w:rPr>
-          <w:rFonts w:ascii="Times New Roman" w:hAnsi="Times New Roman" w:cs="Times New Roman"/>
-          <w:b/>
-        </w:rPr>
-        <w:t>:</w:t>
-      </w:r>
-    </w:p>
-    <w:p>
-      <w:pPr>
-        <w:pStyle w:val="Prrafodelista"/>
-        <w:numPr>
-          <w:ilvl w:val="0"/>
-          <w:numId w:val="22"/>
-        </w:numPr>
-        <w:jc w:val="left"/>
-        <w:rPr>
-          <w:rFonts w:ascii="Times New Roman" w:hAnsi="Times New Roman" w:cs="Times New Roman"/>
-        </w:rPr>
-      </w:pPr>
-      <w:r>
-        <w:rPr>
-          <w:rFonts w:ascii="Times New Roman" w:hAnsi="Times New Roman" w:cs="Times New Roman"/>
-          <w:b/>
-        </w:rPr>
-        <w:t>Escalabilidad independiente:</w:t>
-      </w:r>
-      <w:r>
-        <w:rPr>
-          <w:rFonts w:ascii="Times New Roman" w:hAnsi="Times New Roman" w:cs="Times New Roman"/>
-        </w:rPr>
-        <w:t xml:space="preserve"> cada </w:t>
-      </w:r>
-      <w:proofErr w:type="spellStart"/>
-      <w:r>
-        <w:rPr>
-          <w:rFonts w:ascii="Times New Roman" w:hAnsi="Times New Roman" w:cs="Times New Roman"/>
-        </w:rPr>
-        <w:t>microservicio</w:t>
-      </w:r>
-      <w:proofErr w:type="spellEnd"/>
-      <w:r>
-        <w:rPr>
-          <w:rFonts w:ascii="Times New Roman" w:hAnsi="Times New Roman" w:cs="Times New Roman"/>
-        </w:rPr>
-        <w:t xml:space="preserve"> escala según su propia demanda, sin sobredimensionar todo el sistema.</w:t>
-      </w:r>
-    </w:p>
-    <w:p>
-      <w:pPr>
-        <w:pStyle w:val="Prrafodelista"/>
-        <w:numPr>
-          <w:ilvl w:val="0"/>
-          <w:numId w:val="22"/>
-        </w:numPr>
-        <w:jc w:val="left"/>
-        <w:rPr>
-          <w:rFonts w:ascii="Times New Roman" w:hAnsi="Times New Roman" w:cs="Times New Roman"/>
-        </w:rPr>
-      </w:pPr>
-      <w:r>
-        <w:rPr>
-          <w:rFonts w:ascii="Times New Roman" w:hAnsi="Times New Roman" w:cs="Times New Roman"/>
-          <w:b/>
-        </w:rPr>
-        <w:t>Alta disponibilidad:</w:t>
-      </w:r>
-      <w:r>
-        <w:rPr>
-          <w:rFonts w:ascii="Times New Roman" w:hAnsi="Times New Roman" w:cs="Times New Roman"/>
-        </w:rPr>
-        <w:t xml:space="preserve"> el balanceador y el API Gateway pueden replicarse; Kafka y las bases de datos cuentan con redundancia.</w:t>
-      </w:r>
-    </w:p>
-    <w:p>
-      <w:pPr>
-        <w:pStyle w:val="Prrafodelista"/>
-        <w:numPr>
-          <w:ilvl w:val="0"/>
-          <w:numId w:val="22"/>
-        </w:numPr>
-        <w:jc w:val="left"/>
-        <w:rPr>
-          <w:rFonts w:ascii="Times New Roman" w:hAnsi="Times New Roman" w:cs="Times New Roman"/>
-        </w:rPr>
-      </w:pPr>
-      <w:r>
-        <w:rPr>
-          <w:rFonts w:ascii="Times New Roman" w:hAnsi="Times New Roman" w:cs="Times New Roman"/>
-          <w:b/>
-        </w:rPr>
-        <w:t>Desacoplamiento:</w:t>
-      </w:r>
-      <w:r>
-        <w:rPr>
-          <w:rFonts w:ascii="Times New Roman" w:hAnsi="Times New Roman" w:cs="Times New Roman"/>
-        </w:rPr>
-        <w:t xml:space="preserve"> los servicios se comunican por </w:t>
-      </w:r>
-      <w:proofErr w:type="spellStart"/>
-      <w:r>
-        <w:rPr>
-          <w:rFonts w:ascii="Times New Roman" w:hAnsi="Times New Roman" w:cs="Times New Roman"/>
-        </w:rPr>
-        <w:t>APIs</w:t>
-      </w:r>
-      <w:proofErr w:type="spellEnd"/>
-      <w:r>
-        <w:rPr>
-          <w:rFonts w:ascii="Times New Roman" w:hAnsi="Times New Roman" w:cs="Times New Roman"/>
-        </w:rPr>
-        <w:t xml:space="preserve"> y eventos, no por acceso directo a bases de datos ajenas.</w:t>
-      </w:r>
-    </w:p>
-    <w:p>
-      <w:pPr>
-        <w:pStyle w:val="Prrafodelista"/>
-        <w:numPr>
-          <w:ilvl w:val="0"/>
-          <w:numId w:val="22"/>
-        </w:numPr>
-        <w:jc w:val="left"/>
-        <w:rPr>
-          <w:rFonts w:ascii="Times New Roman" w:hAnsi="Times New Roman" w:cs="Times New Roman"/>
-        </w:rPr>
-      </w:pPr>
-      <w:r>
-        <w:rPr>
-          <w:rFonts w:ascii="Times New Roman" w:hAnsi="Times New Roman" w:cs="Times New Roman"/>
-          <w:b/>
-        </w:rPr>
-        <w:t xml:space="preserve">Mantenibilidad: </w:t>
-      </w:r>
-      <w:r>
-        <w:rPr>
-          <w:rFonts w:ascii="Times New Roman" w:hAnsi="Times New Roman" w:cs="Times New Roman"/>
-        </w:rPr>
-        <w:t xml:space="preserve">cada equipo puede modificar y desplegar su </w:t>
-      </w:r>
-      <w:proofErr w:type="spellStart"/>
-      <w:r>
-        <w:rPr>
-          <w:rFonts w:ascii="Times New Roman" w:hAnsi="Times New Roman" w:cs="Times New Roman"/>
-        </w:rPr>
-        <w:t>microservicio</w:t>
-      </w:r>
-      <w:proofErr w:type="spellEnd"/>
-      <w:r>
-        <w:rPr>
-          <w:rFonts w:ascii="Times New Roman" w:hAnsi="Times New Roman" w:cs="Times New Roman"/>
-        </w:rPr>
-        <w:t xml:space="preserve"> sin afectar a los demás.</w:t>
-      </w:r>
-    </w:p>
-    <w:p>
-      <w:pPr>
-        <w:pStyle w:val="Prrafodelista"/>
-        <w:numPr>
-          <w:ilvl w:val="0"/>
-          <w:numId w:val="22"/>
-        </w:numPr>
-        <w:jc w:val="left"/>
-        <w:rPr>
-          <w:rFonts w:ascii="Times New Roman" w:hAnsi="Times New Roman" w:cs="Times New Roman"/>
-        </w:rPr>
-      </w:pPr>
-      <w:r>
-        <w:rPr>
-          <w:rFonts w:ascii="Times New Roman" w:hAnsi="Times New Roman" w:cs="Times New Roman"/>
-          <w:b/>
-        </w:rPr>
-        <w:t>Seguridad centralizada:</w:t>
-      </w:r>
-      <w:r>
-        <w:rPr>
-          <w:rFonts w:ascii="Times New Roman" w:hAnsi="Times New Roman" w:cs="Times New Roman"/>
-        </w:rPr>
-        <w:t xml:space="preserve"> autenticación, autorización y auditoría se gestionan en el API Gateway.</w:t>
-      </w:r>
-    </w:p>
-    <w:p>
-      <w:pPr>
-        <w:pStyle w:val="Prrafodelista"/>
-        <w:numPr>
-          <w:ilvl w:val="0"/>
-          <w:numId w:val="22"/>
-        </w:numPr>
-        <w:jc w:val="left"/>
-        <w:rPr>
-          <w:rFonts w:ascii="Times New Roman" w:hAnsi="Times New Roman" w:cs="Times New Roman"/>
-        </w:rPr>
-      </w:pPr>
-      <w:r>
-        <w:rPr>
-          <w:rFonts w:ascii="Times New Roman" w:hAnsi="Times New Roman" w:cs="Times New Roman"/>
-          <w:b/>
-        </w:rPr>
-        <w:t>Trazabilidad:</w:t>
-      </w:r>
-      <w:r>
-        <w:rPr>
-          <w:rFonts w:ascii="Times New Roman" w:hAnsi="Times New Roman" w:cs="Times New Roman"/>
-        </w:rPr>
-        <w:t xml:space="preserve"> los eventos publicados en Kafka permiten reconstruir el flujo completo de un proceso.</w:t>
-      </w:r>
-    </w:p>
-    <w:p>
-      <w:pPr>
-        <w:pStyle w:val="Prrafodelista"/>
-        <w:numPr>
-          <w:ilvl w:val="0"/>
-          <w:numId w:val="22"/>
-        </w:numPr>
-        <w:jc w:val="left"/>
-        <w:rPr>
-          <w:rFonts w:ascii="Times New Roman" w:hAnsi="Times New Roman" w:cs="Times New Roman"/>
-        </w:rPr>
-      </w:pPr>
-      <w:r>
-        <w:rPr>
-          <w:rFonts w:ascii="Times New Roman" w:hAnsi="Times New Roman" w:cs="Times New Roman"/>
-          <w:b/>
-        </w:rPr>
-        <w:t>Resiliencia:</w:t>
-      </w:r>
-      <w:r>
-        <w:rPr>
-          <w:rFonts w:ascii="Times New Roman" w:hAnsi="Times New Roman" w:cs="Times New Roman"/>
-        </w:rPr>
-        <w:t xml:space="preserve"> el uso de </w:t>
-      </w:r>
-      <w:proofErr w:type="spellStart"/>
-      <w:r>
-        <w:rPr>
-          <w:rFonts w:ascii="Times New Roman" w:hAnsi="Times New Roman" w:cs="Times New Roman"/>
-        </w:rPr>
-        <w:t>Circuit</w:t>
-      </w:r>
-      <w:proofErr w:type="spellEnd"/>
-      <w:r>
-        <w:rPr>
-          <w:rFonts w:ascii="Times New Roman" w:hAnsi="Times New Roman" w:cs="Times New Roman"/>
-        </w:rPr>
-        <w:t xml:space="preserve"> </w:t>
-      </w:r>
-      <w:proofErr w:type="spellStart"/>
-      <w:r>
-        <w:rPr>
-          <w:rFonts w:ascii="Times New Roman" w:hAnsi="Times New Roman" w:cs="Times New Roman"/>
-        </w:rPr>
-        <w:t>Breaker</w:t>
-      </w:r>
-      <w:proofErr w:type="spellEnd"/>
-      <w:r>
-        <w:rPr>
-          <w:rFonts w:ascii="Times New Roman" w:hAnsi="Times New Roman" w:cs="Times New Roman"/>
-        </w:rPr>
-        <w:t xml:space="preserve"> y mensajería asíncrona evita que un fallo se propague.</w:t>
-      </w:r>
-    </w:p>
-    <w:p>
-      <w:pPr>
-        <w:pStyle w:val="Prrafodelista"/>
-        <w:numPr>
-          <w:ilvl w:val="0"/>
-          <w:numId w:val="24"/>
-        </w:numPr>
-        <w:jc w:val="center"/>
-        <w:rPr>
-          <w:rFonts w:ascii="Times New Roman" w:hAnsi="Times New Roman" w:cs="Times New Roman"/>
-          <w:b/>
-        </w:rPr>
-      </w:pPr>
-      <w:bookmarkStart w:id="0" w:name="_GoBack"/>
-      <w:r>
-        <w:rPr>
-          <w:rFonts w:ascii="Times New Roman" w:hAnsi="Times New Roman" w:cs="Times New Roman"/>
-          <w:b/>
-        </w:rPr>
-        <w:lastRenderedPageBreak/>
-        <w:t>Referencias</w:t>
-      </w:r>
-    </w:p>
-    <w:bookmarkEnd w:id="0"/>
-    <w:p>
-      <w:pPr>
-        <w:pStyle w:val="Prrafodelista"/>
-        <w:numPr>
-          <w:ilvl w:val="0"/>
-          <w:numId w:val="23"/>
-        </w:numPr>
-        <w:jc w:val="left"/>
-        <w:rPr>
-          <w:rFonts w:ascii="Times New Roman" w:hAnsi="Times New Roman" w:cs="Times New Roman"/>
-          <w:lang w:val="en-US"/>
-        </w:rPr>
-      </w:pPr>
-      <w:r>
-        <w:rPr>
-          <w:rFonts w:ascii="Times New Roman" w:hAnsi="Times New Roman" w:cs="Times New Roman"/>
-          <w:lang w:val="en-US"/>
-        </w:rPr>
-        <w:t>Newman, S. (2021). Bu</w:t>
-      </w:r>
-      <w:r>
-        <w:rPr>
-          <w:rFonts w:ascii="Times New Roman" w:hAnsi="Times New Roman" w:cs="Times New Roman"/>
-          <w:lang w:val="en-US"/>
-        </w:rPr>
-        <w:t xml:space="preserve">ilding </w:t>
-      </w:r>
-      <w:proofErr w:type="spellStart"/>
-      <w:r>
-        <w:rPr>
-          <w:rFonts w:ascii="Times New Roman" w:hAnsi="Times New Roman" w:cs="Times New Roman"/>
-          <w:lang w:val="en-US"/>
-        </w:rPr>
-        <w:t>Microservices</w:t>
-      </w:r>
-      <w:proofErr w:type="spellEnd"/>
-      <w:r>
-        <w:rPr>
-          <w:rFonts w:ascii="Times New Roman" w:hAnsi="Times New Roman" w:cs="Times New Roman"/>
-          <w:lang w:val="en-US"/>
-        </w:rPr>
-        <w:t>. O'Reilly.</w:t>
-      </w:r>
-    </w:p>
-    <w:p>
-      <w:pPr>
-        <w:pStyle w:val="Prrafodelista"/>
-        <w:numPr>
-          <w:ilvl w:val="0"/>
-          <w:numId w:val="23"/>
-        </w:numPr>
-        <w:jc w:val="left"/>
-        <w:rPr>
-          <w:rFonts w:ascii="Times New Roman" w:hAnsi="Times New Roman" w:cs="Times New Roman"/>
-        </w:rPr>
-      </w:pPr>
-      <w:r>
-        <w:rPr>
-          <w:rFonts w:ascii="Times New Roman" w:hAnsi="Times New Roman" w:cs="Times New Roman"/>
-          <w:lang w:val="en-US"/>
-        </w:rPr>
-        <w:t xml:space="preserve">Richardson, C. (2019). </w:t>
-      </w:r>
-      <w:proofErr w:type="spellStart"/>
-      <w:r>
-        <w:rPr>
-          <w:rFonts w:ascii="Times New Roman" w:hAnsi="Times New Roman" w:cs="Times New Roman"/>
-          <w:lang w:val="en-US"/>
-        </w:rPr>
-        <w:t>Microservices</w:t>
-      </w:r>
-      <w:proofErr w:type="spellEnd"/>
-      <w:r>
-        <w:rPr>
-          <w:rFonts w:ascii="Times New Roman" w:hAnsi="Times New Roman" w:cs="Times New Roman"/>
-          <w:lang w:val="en-US"/>
-        </w:rPr>
-        <w:t xml:space="preserve"> Patterns. </w:t>
-      </w:r>
-      <w:proofErr w:type="spellStart"/>
-      <w:r>
-        <w:rPr>
-          <w:rFonts w:ascii="Times New Roman" w:hAnsi="Times New Roman" w:cs="Times New Roman"/>
-        </w:rPr>
-        <w:t>Manning</w:t>
-      </w:r>
-      <w:proofErr w:type="spellEnd"/>
-      <w:r>
-        <w:rPr>
-          <w:rFonts w:ascii="Times New Roman" w:hAnsi="Times New Roman" w:cs="Times New Roman"/>
-        </w:rPr>
         <w:t>.</w:t>
       </w:r>
-    </w:p>
-    <w:p>
-      <w:pPr>
-        <w:pStyle w:val="Prrafodelista"/>
-        <w:numPr>
-          <w:ilvl w:val="0"/>
-          <w:numId w:val="23"/>
-        </w:numPr>
-        <w:jc w:val="left"/>
-        <w:rPr>
-          <w:rFonts w:ascii="Times New Roman" w:hAnsi="Times New Roman" w:cs="Times New Roman"/>
-        </w:rPr>
-      </w:pPr>
-      <w:r>
-        <w:rPr>
-          <w:rFonts w:ascii="Times New Roman" w:hAnsi="Times New Roman" w:cs="Times New Roman"/>
-        </w:rPr>
-        <w:t>Ley 1581 de 2012 · Res</w:t>
-      </w:r>
-      <w:r>
-        <w:rPr>
-          <w:rFonts w:ascii="Times New Roman" w:hAnsi="Times New Roman" w:cs="Times New Roman"/>
-        </w:rPr>
-        <w:t>olución 866 de 2017 (Colombia).</w:t>
-      </w:r>
-    </w:p>
-    <w:p>
-      <w:pPr>
-        <w:pStyle w:val="Prrafodelista"/>
-        <w:numPr>
-          <w:ilvl w:val="0"/>
-          <w:numId w:val="23"/>
-        </w:numPr>
-        <w:jc w:val="left"/>
-        <w:rPr>
-          <w:rFonts w:ascii="Times New Roman" w:hAnsi="Times New Roman" w:cs="Times New Roman"/>
-        </w:rPr>
-      </w:pPr>
-      <w:proofErr w:type="spellStart"/>
-      <w:r>
-        <w:rPr>
-          <w:rFonts w:ascii="Times New Roman" w:hAnsi="Times New Roman" w:cs="Times New Roman"/>
-        </w:rPr>
-        <w:t>PlantUML</w:t>
-      </w:r>
-      <w:proofErr w:type="spellEnd"/>
-      <w:r>
-        <w:rPr>
-          <w:rFonts w:ascii="Times New Roman" w:hAnsi="Times New Roman" w:cs="Times New Roman"/>
-        </w:rPr>
-        <w:t>: https://plantuml.com</w:t>
-      </w:r>
-    </w:p>
-    <w:p>
-      <w:pPr>
-        <w:jc w:val="left"/>
-        <w:rPr>
-          <w:rFonts w:ascii="Times New Roman" w:hAnsi="Times New Roman" w:cs="Times New Roman"/>
-          <w:b/>
-        </w:rPr>
-      </w:pPr>
-    </w:p>
-    <w:p>
-      <w:pPr>
-        <w:jc w:val="left"/>
-        <w:rPr>
-          <w:rFonts w:ascii="Times New Roman" w:hAnsi="Times New Roman" w:cs="Times New Roman"/>
-          <w:b/>
-        </w:rPr>
-      </w:pPr>
     </w:p>
     <w:p>
       <w:pPr>
@@ -4005,6 +2848,95 @@
     </w:lvl>
   </w:abstractNum>
   <w:abstractNum w:abstractNumId="11" w15:restartNumberingAfterBreak="0">
+    <w:nsid w:val="2A08428A"/>
+    <w:multiLevelType w:val="hybridMultilevel"/>
+    <w:tmpl w:val="66DC6FD0"/>
+    <w:lvl w:ilvl="0" w:tplc="240A000F">
+      <w:start w:val="3"/>
+      <w:numFmt w:val="decimal"/>
+      <w:lvlText w:val="%1."/>
+      <w:lvlJc w:val="left"/>
+      <w:pPr>
+        <w:ind w:left="720" w:hanging="360"/>
+      </w:pPr>
+      <w:rPr>
+        <w:rFonts w:hint="default"/>
+      </w:rPr>
+    </w:lvl>
+    <w:lvl w:ilvl="1" w:tplc="240A0019" w:tentative="1">
+      <w:start w:val="1"/>
+      <w:numFmt w:val="lowerLetter"/>
+      <w:lvlText w:val="%2."/>
+      <w:lvlJc w:val="left"/>
+      <w:pPr>
+        <w:ind w:left="1440" w:hanging="360"/>
+      </w:pPr>
+    </w:lvl>
+    <w:lvl w:ilvl="2" w:tplc="240A001B" w:tentative="1">
+      <w:start w:val="1"/>
+      <w:numFmt w:val="lowerRoman"/>
+      <w:lvlText w:val="%3."/>
+      <w:lvlJc w:val="right"/>
+      <w:pPr>
+        <w:ind w:left="2160" w:hanging="180"/>
+      </w:pPr>
+    </w:lvl>
+    <w:lvl w:ilvl="3" w:tplc="240A000F" w:tentative="1">
+      <w:start w:val="1"/>
+      <w:numFmt w:val="decimal"/>
+      <w:lvlText w:val="%4."/>
+      <w:lvlJc w:val="left"/>
+      <w:pPr>
+        <w:ind w:left="2880" w:hanging="360"/>
+      </w:pPr>
+    </w:lvl>
+    <w:lvl w:ilvl="4" w:tplc="240A0019" w:tentative="1">
+      <w:start w:val="1"/>
+      <w:numFmt w:val="lowerLetter"/>
+      <w:lvlText w:val="%5."/>
+      <w:lvlJc w:val="left"/>
+      <w:pPr>
+        <w:ind w:left="3600" w:hanging="360"/>
+      </w:pPr>
+    </w:lvl>
+    <w:lvl w:ilvl="5" w:tplc="240A001B" w:tentative="1">
+      <w:start w:val="1"/>
+      <w:numFmt w:val="lowerRoman"/>
+      <w:lvlText w:val="%6."/>
+      <w:lvlJc w:val="right"/>
+      <w:pPr>
+        <w:ind w:left="4320" w:hanging="180"/>
+      </w:pPr>
+    </w:lvl>
+    <w:lvl w:ilvl="6" w:tplc="240A000F" w:tentative="1">
+      <w:start w:val="1"/>
+      <w:numFmt w:val="decimal"/>
+      <w:lvlText w:val="%7."/>
+      <w:lvlJc w:val="left"/>
+      <w:pPr>
+        <w:ind w:left="5040" w:hanging="360"/>
+      </w:pPr>
+    </w:lvl>
+    <w:lvl w:ilvl="7" w:tplc="240A0019" w:tentative="1">
+      <w:start w:val="1"/>
+      <w:numFmt w:val="lowerLetter"/>
+      <w:lvlText w:val="%8."/>
+      <w:lvlJc w:val="left"/>
+      <w:pPr>
+        <w:ind w:left="5760" w:hanging="360"/>
+      </w:pPr>
+    </w:lvl>
+    <w:lvl w:ilvl="8" w:tplc="240A001B" w:tentative="1">
+      <w:start w:val="1"/>
+      <w:numFmt w:val="lowerRoman"/>
+      <w:lvlText w:val="%9."/>
+      <w:lvlJc w:val="right"/>
+      <w:pPr>
+        <w:ind w:left="6480" w:hanging="180"/>
+      </w:pPr>
+    </w:lvl>
+  </w:abstractNum>
+  <w:abstractNum w:abstractNumId="12" w15:restartNumberingAfterBreak="0">
     <w:nsid w:val="379B692B"/>
     <w:multiLevelType w:val="hybridMultilevel"/>
     <w:tmpl w:val="C3BEC16C"/>
@@ -4117,7 +3049,7 @@
       </w:rPr>
     </w:lvl>
   </w:abstractNum>
-  <w:abstractNum w:abstractNumId="12" w15:restartNumberingAfterBreak="0">
+  <w:abstractNum w:abstractNumId="13" w15:restartNumberingAfterBreak="0">
     <w:nsid w:val="3D7730A2"/>
     <w:multiLevelType w:val="hybridMultilevel"/>
     <w:tmpl w:val="FA7E7304"/>
@@ -4230,7 +3162,7 @@
       </w:rPr>
     </w:lvl>
   </w:abstractNum>
-  <w:abstractNum w:abstractNumId="13" w15:restartNumberingAfterBreak="0">
+  <w:abstractNum w:abstractNumId="14" w15:restartNumberingAfterBreak="0">
     <w:nsid w:val="431E0ED3"/>
     <w:multiLevelType w:val="hybridMultilevel"/>
     <w:tmpl w:val="BE30E13C"/>
@@ -4343,7 +3275,7 @@
       </w:rPr>
     </w:lvl>
   </w:abstractNum>
-  <w:abstractNum w:abstractNumId="14" w15:restartNumberingAfterBreak="0">
+  <w:abstractNum w:abstractNumId="15" w15:restartNumberingAfterBreak="0">
     <w:nsid w:val="462C5680"/>
     <w:multiLevelType w:val="hybridMultilevel"/>
     <w:tmpl w:val="90104FC6"/>
@@ -4432,7 +3364,7 @@
       </w:pPr>
     </w:lvl>
   </w:abstractNum>
-  <w:abstractNum w:abstractNumId="15" w15:restartNumberingAfterBreak="0">
+  <w:abstractNum w:abstractNumId="16" w15:restartNumberingAfterBreak="0">
     <w:nsid w:val="4A05589F"/>
     <w:multiLevelType w:val="hybridMultilevel"/>
     <w:tmpl w:val="1840AABC"/>
@@ -4545,7 +3477,7 @@
       </w:rPr>
     </w:lvl>
   </w:abstractNum>
-  <w:abstractNum w:abstractNumId="16" w15:restartNumberingAfterBreak="0">
+  <w:abstractNum w:abstractNumId="17" w15:restartNumberingAfterBreak="0">
     <w:nsid w:val="4D0866A6"/>
     <w:multiLevelType w:val="hybridMultilevel"/>
     <w:tmpl w:val="8D96510E"/>
@@ -4658,7 +3590,7 @@
       </w:rPr>
     </w:lvl>
   </w:abstractNum>
-  <w:abstractNum w:abstractNumId="17" w15:restartNumberingAfterBreak="0">
+  <w:abstractNum w:abstractNumId="18" w15:restartNumberingAfterBreak="0">
     <w:nsid w:val="4D822FC0"/>
     <w:multiLevelType w:val="hybridMultilevel"/>
     <w:tmpl w:val="4D2ADA8E"/>
@@ -4771,7 +3703,7 @@
       </w:rPr>
     </w:lvl>
   </w:abstractNum>
-  <w:abstractNum w:abstractNumId="18" w15:restartNumberingAfterBreak="0">
+  <w:abstractNum w:abstractNumId="19" w15:restartNumberingAfterBreak="0">
     <w:nsid w:val="5344190C"/>
     <w:multiLevelType w:val="hybridMultilevel"/>
     <w:tmpl w:val="76389C8E"/>
@@ -4884,7 +3816,7 @@
       </w:rPr>
     </w:lvl>
   </w:abstractNum>
-  <w:abstractNum w:abstractNumId="19" w15:restartNumberingAfterBreak="0">
+  <w:abstractNum w:abstractNumId="20" w15:restartNumberingAfterBreak="0">
     <w:nsid w:val="603E6B77"/>
     <w:multiLevelType w:val="hybridMultilevel"/>
     <w:tmpl w:val="ECC6205C"/>
@@ -4997,7 +3929,7 @@
       </w:rPr>
     </w:lvl>
   </w:abstractNum>
-  <w:abstractNum w:abstractNumId="20" w15:restartNumberingAfterBreak="0">
+  <w:abstractNum w:abstractNumId="21" w15:restartNumberingAfterBreak="0">
     <w:nsid w:val="65831DE8"/>
     <w:multiLevelType w:val="hybridMultilevel"/>
     <w:tmpl w:val="0A0CB3E2"/>
@@ -5110,7 +4042,7 @@
       </w:rPr>
     </w:lvl>
   </w:abstractNum>
-  <w:abstractNum w:abstractNumId="21" w15:restartNumberingAfterBreak="0">
+  <w:abstractNum w:abstractNumId="22" w15:restartNumberingAfterBreak="0">
     <w:nsid w:val="6A910436"/>
     <w:multiLevelType w:val="hybridMultilevel"/>
     <w:tmpl w:val="D85016E2"/>
@@ -5223,7 +4155,7 @@
       </w:rPr>
     </w:lvl>
   </w:abstractNum>
-  <w:abstractNum w:abstractNumId="22" w15:restartNumberingAfterBreak="0">
+  <w:abstractNum w:abstractNumId="23" w15:restartNumberingAfterBreak="0">
     <w:nsid w:val="6B527196"/>
     <w:multiLevelType w:val="hybridMultilevel"/>
     <w:tmpl w:val="CA4A20F2"/>
@@ -5309,7 +4241,7 @@
       </w:pPr>
     </w:lvl>
   </w:abstractNum>
-  <w:abstractNum w:abstractNumId="23" w15:restartNumberingAfterBreak="0">
+  <w:abstractNum w:abstractNumId="24" w15:restartNumberingAfterBreak="0">
     <w:nsid w:val="7F954D94"/>
     <w:multiLevelType w:val="hybridMultilevel"/>
     <w:tmpl w:val="D1903DAA"/>
@@ -5429,7 +4361,7 @@
     <w:abstractNumId w:val="9"/>
   </w:num>
   <w:num w:numId="3">
-    <w:abstractNumId w:val="22"/>
+    <w:abstractNumId w:val="23"/>
   </w:num>
   <w:num w:numId="4">
     <w:abstractNumId w:val="5"/>
@@ -5438,7 +4370,7 @@
     <w:abstractNumId w:val="10"/>
   </w:num>
   <w:num w:numId="6">
-    <w:abstractNumId w:val="11"/>
+    <w:abstractNumId w:val="12"/>
   </w:num>
   <w:num w:numId="7">
     <w:abstractNumId w:val="6"/>
@@ -5447,19 +4379,19 @@
     <w:abstractNumId w:val="7"/>
   </w:num>
   <w:num w:numId="9">
-    <w:abstractNumId w:val="18"/>
+    <w:abstractNumId w:val="19"/>
   </w:num>
   <w:num w:numId="10">
-    <w:abstractNumId w:val="21"/>
+    <w:abstractNumId w:val="22"/>
   </w:num>
   <w:num w:numId="11">
-    <w:abstractNumId w:val="19"/>
+    <w:abstractNumId w:val="20"/>
   </w:num>
   <w:num w:numId="12">
     <w:abstractNumId w:val="8"/>
   </w:num>
   <w:num w:numId="13">
-    <w:abstractNumId w:val="20"/>
+    <w:abstractNumId w:val="21"/>
   </w:num>
   <w:num w:numId="14">
     <w:abstractNumId w:val="1"/>
@@ -5468,16 +4400,16 @@
     <w:abstractNumId w:val="2"/>
   </w:num>
   <w:num w:numId="16">
-    <w:abstractNumId w:val="23"/>
+    <w:abstractNumId w:val="24"/>
   </w:num>
   <w:num w:numId="17">
-    <w:abstractNumId w:val="12"/>
+    <w:abstractNumId w:val="13"/>
   </w:num>
   <w:num w:numId="18">
-    <w:abstractNumId w:val="16"/>
+    <w:abstractNumId w:val="17"/>
   </w:num>
   <w:num w:numId="19">
-    <w:abstractNumId w:val="15"/>
+    <w:abstractNumId w:val="16"/>
   </w:num>
   <w:num w:numId="20">
     <w:abstractNumId w:val="4"/>
@@ -5486,13 +4418,16 @@
     <w:abstractNumId w:val="3"/>
   </w:num>
   <w:num w:numId="22">
-    <w:abstractNumId w:val="13"/>
+    <w:abstractNumId w:val="14"/>
   </w:num>
   <w:num w:numId="23">
-    <w:abstractNumId w:val="17"/>
+    <w:abstractNumId w:val="18"/>
   </w:num>
   <w:num w:numId="24">
-    <w:abstractNumId w:val="14"/>
+    <w:abstractNumId w:val="15"/>
+  </w:num>
+  <w:num w:numId="25">
+    <w:abstractNumId w:val="11"/>
   </w:num>
 </w:numbering>
 </file>
@@ -6210,7 +5145,7 @@
 </file>
 
 <file path=customXml/itemProps1.xml><?xml version="1.0" encoding="utf-8"?>
-<ds:datastoreItem xmlns:ds="http://schemas.openxmlformats.org/officeDocument/2006/customXml" ds:itemID="{2E0C93BA-C16F-46A9-BF64-2FFE21E23540}">
+<ds:datastoreItem xmlns:ds="http://schemas.openxmlformats.org/officeDocument/2006/customXml" ds:itemID="{7BBD543B-3655-424A-950C-8BB9CBB82814}">
   <ds:schemaRefs>
     <ds:schemaRef ds:uri="http://schemas.openxmlformats.org/officeDocument/2006/bibliography"/>
   </ds:schemaRefs>

</xml_diff>